<commit_message>
Manual de recepción con capturas del panel (datos de ejemplo)
Co-Authored-By: Claude Opus 5.5 <noreply@anthropic.com>
Claude-Session: https://claude.ai/code/session_01M9J19rHEn3Sf8xzUA5SjEa
</commit_message>
<xml_diff>
--- a/mediconnect/docs/Manual_Recepcion_MediConnect.docx
+++ b/mediconnect/docs/Manual_Recepcion_MediConnect.docx
@@ -46,6 +46,78 @@
         </w:rPr>
         <w:t xml:space="preserve">Cómo atender conversaciones, agendar citas y bloquear horarios</w:t>
       </w:r>
+    </w:p>
+    <w:tbl>
+      <w:tblPr>
+        <w:tblW w:type="dxa" w:w="9026"/>
+        <w:tblBorders>
+          <w:top w:val="single" w:color="auto" w:sz="4"/>
+          <w:left w:val="single" w:color="auto" w:sz="4"/>
+          <w:bottom w:val="single" w:color="auto" w:sz="4"/>
+          <w:right w:val="single" w:color="auto" w:sz="4"/>
+          <w:insideH w:val="single" w:color="auto" w:sz="4"/>
+          <w:insideV w:val="single" w:color="auto" w:sz="4"/>
+        </w:tblBorders>
+      </w:tblPr>
+      <w:tblGrid>
+        <w:gridCol w:w="9026"/>
+      </w:tblGrid>
+      <w:tr>
+        <w:tc>
+          <w:tcPr>
+            <w:tcW w:type="dxa" w:w="9026"/>
+            <w:tcBorders>
+              <w:top w:val="none" w:color="FFFFFF" w:sz="0"/>
+              <w:left w:val="single" w:color="0B5E7E" w:sz="24"/>
+              <w:bottom w:val="none" w:color="FFFFFF" w:sz="0"/>
+              <w:right w:val="none" w:color="FFFFFF" w:sz="0"/>
+            </w:tcBorders>
+            <w:shd w:fill="EEF6F9" w:color="auto" w:val="clear"/>
+            <w:tcMar>
+              <w:top w:type="dxa" w:w="120"/>
+              <w:left w:type="dxa" w:w="200"/>
+              <w:bottom w:type="dxa" w:w="120"/>
+              <w:right w:type="dxa" w:w="200"/>
+            </w:tcMar>
+          </w:tcPr>
+          <w:p>
+            <w:pPr>
+              <w:spacing w:after="80"/>
+            </w:pPr>
+            <w:r>
+              <w:rPr>
+                <w:b/>
+                <w:bCs/>
+                <w:color w:val="0B5E7E"/>
+              </w:rPr>
+              <w:t xml:space="preserve">Sobre las imágenes</w:t>
+            </w:r>
+          </w:p>
+          <w:p>
+            <w:pPr>
+              <w:spacing w:after="60"/>
+            </w:pPr>
+            <w:r>
+              <w:t xml:space="preserve">Las capturas usan </w:t>
+            </w:r>
+            <w:r>
+              <w:rPr>
+                <w:b/>
+                <w:bCs/>
+              </w:rPr>
+              <w:t xml:space="preserve">pacientes y números de ejemplo</w:t>
+            </w:r>
+            <w:r>
+              <w:t xml:space="preserve">. En su panel verá los datos reales del centro.</w:t>
+            </w:r>
+          </w:p>
+        </w:tc>
+      </w:tr>
+    </w:tbl>
+    <w:p>
+      <w:pPr>
+        <w:spacing w:after="120"/>
+      </w:pPr>
     </w:p>
     <w:tbl>
       <w:tblPr>
@@ -539,17 +611,84 @@
         <w:t xml:space="preserve">contraseña temporal</w:t>
       </w:r>
       <w:r>
-        <w:t xml:space="preserve"> que le entregó la administradora.</w:t>
-      </w:r>
-    </w:p>
-    <w:p>
-      <w:pPr>
-        <w:pStyle w:val="ListParagraph"/>
-        <w:numPr>
-          <w:ilvl w:val="0"/>
-          <w:numId w:val="3"/>
-        </w:numPr>
-        <w:spacing w:after="80"/>
+        <w:t xml:space="preserve"> que le entregó la administradora, y pulse </w:t>
+      </w:r>
+      <w:r>
+        <w:rPr>
+          <w:b/>
+          <w:bCs/>
+        </w:rPr>
+        <w:t xml:space="preserve">Ingresar</w:t>
+      </w:r>
+      <w:r>
+        <w:t xml:space="preserve">.</w:t>
+      </w:r>
+    </w:p>
+    <w:p>
+      <w:pPr>
+        <w:spacing w:after="60" w:before="120"/>
+        <w:jc w:val="center"/>
+      </w:pPr>
+      <w:r>
+        <w:drawing>
+          <wp:inline distT="0" distB="0" distL="0" distR="0">
+            <wp:extent cx="5334000" cy="3333750"/>
+            <wp:effectExtent t="0" r="0" b="0" l="0"/>
+            <wp:docPr id="1" name="01-login" descr="Pantalla de ingreso al panel." title="Pantalla de ingreso al panel."/>
+            <wp:cNvGraphicFramePr>
+              <a:graphicFrameLocks xmlns:a="http://schemas.openxmlformats.org/drawingml/2006/main" noChangeAspect="1"/>
+            </wp:cNvGraphicFramePr>
+            <a:graphic xmlns:a="http://schemas.openxmlformats.org/drawingml/2006/main">
+              <a:graphicData uri="http://schemas.openxmlformats.org/drawingml/2006/picture">
+                <pic:pic xmlns:pic="http://schemas.openxmlformats.org/drawingml/2006/picture">
+                  <pic:nvPicPr>
+                    <pic:cNvPr id="0" name="" descr=""/>
+                    <pic:cNvPicPr>
+                      <a:picLocks noChangeAspect="1" noChangeArrowheads="1"/>
+                    </pic:cNvPicPr>
+                  </pic:nvPicPr>
+                  <pic:blipFill>
+                    <a:blip r:embed="rId8" cstate="none"/>
+                    <a:srcRect/>
+                    <a:stretch>
+                      <a:fillRect/>
+                    </a:stretch>
+                  </pic:blipFill>
+                  <pic:spPr bwMode="auto">
+                    <a:xfrm>
+                      <a:off x="0" y="0"/>
+                      <a:ext cx="5334000" cy="3333750"/>
+                    </a:xfrm>
+                    <a:prstGeom prst="rect">
+                      <a:avLst/>
+                    </a:prstGeom>
+                  </pic:spPr>
+                </pic:pic>
+              </a:graphicData>
+            </a:graphic>
+          </wp:inline>
+        </w:drawing>
+      </w:r>
+    </w:p>
+    <w:p>
+      <w:pPr>
+        <w:spacing w:after="200"/>
+        <w:jc w:val="center"/>
+      </w:pPr>
+      <w:r>
+        <w:rPr>
+          <w:i/>
+          <w:iCs/>
+          <w:color w:val="666666"/>
+          <w:sz w:val="18"/>
+          <w:szCs w:val="18"/>
+        </w:rPr>
+        <w:t xml:space="preserve">Figura 1. Pantalla de ingreso al panel.</w:t>
+      </w:r>
+    </w:p>
+    <w:p>
+      <w:pPr>
+        <w:spacing w:after="120"/>
       </w:pPr>
       <w:r>
         <w:t xml:space="preserve">El sistema le pedirá </w:t>
@@ -562,20 +701,79 @@
         <w:t xml:space="preserve">crear su propia contraseña</w:t>
       </w:r>
       <w:r>
-        <w:t xml:space="preserve"> (mínimo 10 caracteres). Escríbala dos veces y guarde.</w:t>
-      </w:r>
-    </w:p>
-    <w:p>
-      <w:pPr>
-        <w:pStyle w:val="ListParagraph"/>
-        <w:numPr>
-          <w:ilvl w:val="0"/>
-          <w:numId w:val="3"/>
-        </w:numPr>
-        <w:spacing w:after="80"/>
-      </w:pPr>
-      <w:r>
-        <w:t xml:space="preserve">Desde ese momento entre siempre con su correo y su contraseña nueva.</w:t>
+        <w:t xml:space="preserve"> (mínimo 10 caracteres): escriba la temporal, luego la nueva dos veces y pulse </w:t>
+      </w:r>
+      <w:r>
+        <w:rPr>
+          <w:b/>
+          <w:bCs/>
+        </w:rPr>
+        <w:t xml:space="preserve">Guardar contraseña</w:t>
+      </w:r>
+      <w:r>
+        <w:t xml:space="preserve">. Desde ese momento entre siempre con su correo y su contraseña nueva.</w:t>
+      </w:r>
+    </w:p>
+    <w:p>
+      <w:pPr>
+        <w:spacing w:after="60" w:before="120"/>
+        <w:jc w:val="center"/>
+      </w:pPr>
+      <w:r>
+        <w:drawing>
+          <wp:inline distT="0" distB="0" distL="0" distR="0">
+            <wp:extent cx="3619500" cy="2790825"/>
+            <wp:effectExtent t="0" r="0" b="0" l="0"/>
+            <wp:docPr id="1" name="02-crear-clave" descr="La primera vez, el panel pide crear una contraseña propia." title="La primera vez, el panel pide crear una contraseña propia."/>
+            <wp:cNvGraphicFramePr>
+              <a:graphicFrameLocks xmlns:a="http://schemas.openxmlformats.org/drawingml/2006/main" noChangeAspect="1"/>
+            </wp:cNvGraphicFramePr>
+            <a:graphic xmlns:a="http://schemas.openxmlformats.org/drawingml/2006/main">
+              <a:graphicData uri="http://schemas.openxmlformats.org/drawingml/2006/picture">
+                <pic:pic xmlns:pic="http://schemas.openxmlformats.org/drawingml/2006/picture">
+                  <pic:nvPicPr>
+                    <pic:cNvPr id="0" name="" descr=""/>
+                    <pic:cNvPicPr>
+                      <a:picLocks noChangeAspect="1" noChangeArrowheads="1"/>
+                    </pic:cNvPicPr>
+                  </pic:nvPicPr>
+                  <pic:blipFill>
+                    <a:blip r:embed="rId9" cstate="none"/>
+                    <a:srcRect/>
+                    <a:stretch>
+                      <a:fillRect/>
+                    </a:stretch>
+                  </pic:blipFill>
+                  <pic:spPr bwMode="auto">
+                    <a:xfrm>
+                      <a:off x="0" y="0"/>
+                      <a:ext cx="3619500" cy="2790825"/>
+                    </a:xfrm>
+                    <a:prstGeom prst="rect">
+                      <a:avLst/>
+                    </a:prstGeom>
+                  </pic:spPr>
+                </pic:pic>
+              </a:graphicData>
+            </a:graphic>
+          </wp:inline>
+        </w:drawing>
+      </w:r>
+    </w:p>
+    <w:p>
+      <w:pPr>
+        <w:spacing w:after="200"/>
+        <w:jc w:val="center"/>
+      </w:pPr>
+      <w:r>
+        <w:rPr>
+          <w:i/>
+          <w:iCs/>
+          <w:color w:val="666666"/>
+          <w:sz w:val="18"/>
+          <w:szCs w:val="18"/>
+        </w:rPr>
+        <w:t xml:space="preserve">Figura 2. La primera vez, el panel pide crear una contraseña propia.</w:t>
       </w:r>
     </w:p>
     <w:p>
@@ -1087,6 +1285,68 @@
     </w:p>
     <w:p>
       <w:pPr>
+        <w:spacing w:after="60" w:before="120"/>
+        <w:jc w:val="center"/>
+      </w:pPr>
+      <w:r>
+        <w:drawing>
+          <wp:inline distT="0" distB="0" distL="0" distR="0">
+            <wp:extent cx="5715000" cy="3571875"/>
+            <wp:effectExtent t="0" r="0" b="0" l="0"/>
+            <wp:docPr id="1" name="03-resumen" descr="Resumen: citas de hoy, pendientes y conversaciones que esperan a recepción." title="Resumen: citas de hoy, pendientes y conversaciones que esperan a recepción."/>
+            <wp:cNvGraphicFramePr>
+              <a:graphicFrameLocks xmlns:a="http://schemas.openxmlformats.org/drawingml/2006/main" noChangeAspect="1"/>
+            </wp:cNvGraphicFramePr>
+            <a:graphic xmlns:a="http://schemas.openxmlformats.org/drawingml/2006/main">
+              <a:graphicData uri="http://schemas.openxmlformats.org/drawingml/2006/picture">
+                <pic:pic xmlns:pic="http://schemas.openxmlformats.org/drawingml/2006/picture">
+                  <pic:nvPicPr>
+                    <pic:cNvPr id="0" name="" descr=""/>
+                    <pic:cNvPicPr>
+                      <a:picLocks noChangeAspect="1" noChangeArrowheads="1"/>
+                    </pic:cNvPicPr>
+                  </pic:nvPicPr>
+                  <pic:blipFill>
+                    <a:blip r:embed="rId10" cstate="none"/>
+                    <a:srcRect/>
+                    <a:stretch>
+                      <a:fillRect/>
+                    </a:stretch>
+                  </pic:blipFill>
+                  <pic:spPr bwMode="auto">
+                    <a:xfrm>
+                      <a:off x="0" y="0"/>
+                      <a:ext cx="5715000" cy="3571875"/>
+                    </a:xfrm>
+                    <a:prstGeom prst="rect">
+                      <a:avLst/>
+                    </a:prstGeom>
+                  </pic:spPr>
+                </pic:pic>
+              </a:graphicData>
+            </a:graphic>
+          </wp:inline>
+        </w:drawing>
+      </w:r>
+    </w:p>
+    <w:p>
+      <w:pPr>
+        <w:spacing w:after="200"/>
+        <w:jc w:val="center"/>
+      </w:pPr>
+      <w:r>
+        <w:rPr>
+          <w:i/>
+          <w:iCs/>
+          <w:color w:val="666666"/>
+          <w:sz w:val="18"/>
+          <w:szCs w:val="18"/>
+        </w:rPr>
+        <w:t xml:space="preserve">Figura 3. Resumen: citas de hoy, pendientes y conversaciones que esperan a recepción.</w:t>
+      </w:r>
+    </w:p>
+    <w:p>
+      <w:pPr>
         <w:pStyle w:val="Heading1"/>
         <w:spacing w:after="160" w:before="360"/>
       </w:pPr>
@@ -1274,6 +1534,68 @@
       </w:r>
       <w:r>
         <w:t xml:space="preserve"> para que Gia vuelva a atender a ese paciente.</w:t>
+      </w:r>
+    </w:p>
+    <w:p>
+      <w:pPr>
+        <w:spacing w:after="60" w:before="120"/>
+        <w:jc w:val="center"/>
+      </w:pPr>
+      <w:r>
+        <w:drawing>
+          <wp:inline distT="0" distB="0" distL="0" distR="0">
+            <wp:extent cx="5715000" cy="3571875"/>
+            <wp:effectExtent t="0" r="0" b="0" l="0"/>
+            <wp:docPr id="1" name="09-conversacion" descr="Conversación en espera de recepción: arriba el motivo, abajo el cuadro para responder y, a la derecha, «Devolver al agente»." title="Conversación en espera de recepción: arriba el motivo, abajo el cuadro para responder y, a la derecha, «Devolver al agente»."/>
+            <wp:cNvGraphicFramePr>
+              <a:graphicFrameLocks xmlns:a="http://schemas.openxmlformats.org/drawingml/2006/main" noChangeAspect="1"/>
+            </wp:cNvGraphicFramePr>
+            <a:graphic xmlns:a="http://schemas.openxmlformats.org/drawingml/2006/main">
+              <a:graphicData uri="http://schemas.openxmlformats.org/drawingml/2006/picture">
+                <pic:pic xmlns:pic="http://schemas.openxmlformats.org/drawingml/2006/picture">
+                  <pic:nvPicPr>
+                    <pic:cNvPr id="0" name="" descr=""/>
+                    <pic:cNvPicPr>
+                      <a:picLocks noChangeAspect="1" noChangeArrowheads="1"/>
+                    </pic:cNvPicPr>
+                  </pic:nvPicPr>
+                  <pic:blipFill>
+                    <a:blip r:embed="rId11" cstate="none"/>
+                    <a:srcRect/>
+                    <a:stretch>
+                      <a:fillRect/>
+                    </a:stretch>
+                  </pic:blipFill>
+                  <pic:spPr bwMode="auto">
+                    <a:xfrm>
+                      <a:off x="0" y="0"/>
+                      <a:ext cx="5715000" cy="3571875"/>
+                    </a:xfrm>
+                    <a:prstGeom prst="rect">
+                      <a:avLst/>
+                    </a:prstGeom>
+                  </pic:spPr>
+                </pic:pic>
+              </a:graphicData>
+            </a:graphic>
+          </wp:inline>
+        </w:drawing>
+      </w:r>
+    </w:p>
+    <w:p>
+      <w:pPr>
+        <w:spacing w:after="200"/>
+        <w:jc w:val="center"/>
+      </w:pPr>
+      <w:r>
+        <w:rPr>
+          <w:i/>
+          <w:iCs/>
+          <w:color w:val="666666"/>
+          <w:sz w:val="18"/>
+          <w:szCs w:val="18"/>
+        </w:rPr>
+        <w:t xml:space="preserve">Figura 4. Conversación en espera de recepción: arriba el motivo, abajo el cuadro para responder y, a la derecha, «Devolver al agente».</w:t>
       </w:r>
     </w:p>
     <w:p>
@@ -1774,6 +2096,68 @@
     </w:tbl>
     <w:p>
       <w:pPr>
+        <w:spacing w:after="60" w:before="120"/>
+        <w:jc w:val="center"/>
+      </w:pPr>
+      <w:r>
+        <w:drawing>
+          <wp:inline distT="0" distB="0" distL="0" distR="0">
+            <wp:extent cx="5715000" cy="3571875"/>
+            <wp:effectExtent t="0" r="0" b="0" l="0"/>
+            <wp:docPr id="1" name="04-calendario" descr="Calendario semanal con citas y un horario bloqueado (jueves)." title="Calendario semanal con citas y un horario bloqueado (jueves)."/>
+            <wp:cNvGraphicFramePr>
+              <a:graphicFrameLocks xmlns:a="http://schemas.openxmlformats.org/drawingml/2006/main" noChangeAspect="1"/>
+            </wp:cNvGraphicFramePr>
+            <a:graphic xmlns:a="http://schemas.openxmlformats.org/drawingml/2006/main">
+              <a:graphicData uri="http://schemas.openxmlformats.org/drawingml/2006/picture">
+                <pic:pic xmlns:pic="http://schemas.openxmlformats.org/drawingml/2006/picture">
+                  <pic:nvPicPr>
+                    <pic:cNvPr id="0" name="" descr=""/>
+                    <pic:cNvPicPr>
+                      <a:picLocks noChangeAspect="1" noChangeArrowheads="1"/>
+                    </pic:cNvPicPr>
+                  </pic:nvPicPr>
+                  <pic:blipFill>
+                    <a:blip r:embed="rId12" cstate="none"/>
+                    <a:srcRect/>
+                    <a:stretch>
+                      <a:fillRect/>
+                    </a:stretch>
+                  </pic:blipFill>
+                  <pic:spPr bwMode="auto">
+                    <a:xfrm>
+                      <a:off x="0" y="0"/>
+                      <a:ext cx="5715000" cy="3571875"/>
+                    </a:xfrm>
+                    <a:prstGeom prst="rect">
+                      <a:avLst/>
+                    </a:prstGeom>
+                  </pic:spPr>
+                </pic:pic>
+              </a:graphicData>
+            </a:graphic>
+          </wp:inline>
+        </w:drawing>
+      </w:r>
+    </w:p>
+    <w:p>
+      <w:pPr>
+        <w:spacing w:after="200"/>
+        <w:jc w:val="center"/>
+      </w:pPr>
+      <w:r>
+        <w:rPr>
+          <w:i/>
+          <w:iCs/>
+          <w:color w:val="666666"/>
+          <w:sz w:val="18"/>
+          <w:szCs w:val="18"/>
+        </w:rPr>
+        <w:t xml:space="preserve">Figura 5. Calendario semanal con citas y un horario bloqueado (jueves).</w:t>
+      </w:r>
+    </w:p>
+    <w:p>
+      <w:pPr>
         <w:pStyle w:val="Heading2"/>
         <w:spacing w:after="120" w:before="240"/>
       </w:pPr>
@@ -1928,6 +2312,68 @@
     </w:p>
     <w:p>
       <w:pPr>
+        <w:spacing w:after="60" w:before="120"/>
+        <w:jc w:val="center"/>
+      </w:pPr>
+      <w:r>
+        <w:drawing>
+          <wp:inline distT="0" distB="0" distL="0" distR="0">
+            <wp:extent cx="4000500" cy="3133725"/>
+            <wp:effectExtent t="0" r="0" b="0" l="0"/>
+            <wp:docPr id="1" name="05-nueva-cita" descr="Ventana «Nueva cita»: solo se ofrecen horas disponibles." title="Ventana «Nueva cita»: solo se ofrecen horas disponibles."/>
+            <wp:cNvGraphicFramePr>
+              <a:graphicFrameLocks xmlns:a="http://schemas.openxmlformats.org/drawingml/2006/main" noChangeAspect="1"/>
+            </wp:cNvGraphicFramePr>
+            <a:graphic xmlns:a="http://schemas.openxmlformats.org/drawingml/2006/main">
+              <a:graphicData uri="http://schemas.openxmlformats.org/drawingml/2006/picture">
+                <pic:pic xmlns:pic="http://schemas.openxmlformats.org/drawingml/2006/picture">
+                  <pic:nvPicPr>
+                    <pic:cNvPr id="0" name="" descr=""/>
+                    <pic:cNvPicPr>
+                      <a:picLocks noChangeAspect="1" noChangeArrowheads="1"/>
+                    </pic:cNvPicPr>
+                  </pic:nvPicPr>
+                  <pic:blipFill>
+                    <a:blip r:embed="rId13" cstate="none"/>
+                    <a:srcRect/>
+                    <a:stretch>
+                      <a:fillRect/>
+                    </a:stretch>
+                  </pic:blipFill>
+                  <pic:spPr bwMode="auto">
+                    <a:xfrm>
+                      <a:off x="0" y="0"/>
+                      <a:ext cx="4000500" cy="3133725"/>
+                    </a:xfrm>
+                    <a:prstGeom prst="rect">
+                      <a:avLst/>
+                    </a:prstGeom>
+                  </pic:spPr>
+                </pic:pic>
+              </a:graphicData>
+            </a:graphic>
+          </wp:inline>
+        </w:drawing>
+      </w:r>
+    </w:p>
+    <w:p>
+      <w:pPr>
+        <w:spacing w:after="200"/>
+        <w:jc w:val="center"/>
+      </w:pPr>
+      <w:r>
+        <w:rPr>
+          <w:i/>
+          <w:iCs/>
+          <w:color w:val="666666"/>
+          <w:sz w:val="18"/>
+          <w:szCs w:val="18"/>
+        </w:rPr>
+        <w:t xml:space="preserve">Figura 6. Ventana «Nueva cita»: solo se ofrecen horas disponibles.</w:t>
+      </w:r>
+    </w:p>
+    <w:p>
+      <w:pPr>
         <w:pStyle w:val="ListParagraph"/>
         <w:numPr>
           <w:ilvl w:val="0"/>
@@ -2020,6 +2466,68 @@
       </w:pPr>
       <w:r>
         <w:t xml:space="preserve">Haga clic sobre la cita en el calendario. Se abre una ventana con estas opciones:</w:t>
+      </w:r>
+    </w:p>
+    <w:p>
+      <w:pPr>
+        <w:spacing w:after="60" w:before="120"/>
+        <w:jc w:val="center"/>
+      </w:pPr>
+      <w:r>
+        <w:drawing>
+          <wp:inline distT="0" distB="0" distL="0" distR="0">
+            <wp:extent cx="4000500" cy="3200400"/>
+            <wp:effectExtent t="0" r="0" b="0" l="0"/>
+            <wp:docPr id="1" name="06-cita" descr="Ventana de una cita: reagendar, confirmar, marcar atendida, no asistió o cancelar." title="Ventana de una cita: reagendar, confirmar, marcar atendida, no asistió o cancelar."/>
+            <wp:cNvGraphicFramePr>
+              <a:graphicFrameLocks xmlns:a="http://schemas.openxmlformats.org/drawingml/2006/main" noChangeAspect="1"/>
+            </wp:cNvGraphicFramePr>
+            <a:graphic xmlns:a="http://schemas.openxmlformats.org/drawingml/2006/main">
+              <a:graphicData uri="http://schemas.openxmlformats.org/drawingml/2006/picture">
+                <pic:pic xmlns:pic="http://schemas.openxmlformats.org/drawingml/2006/picture">
+                  <pic:nvPicPr>
+                    <pic:cNvPr id="0" name="" descr=""/>
+                    <pic:cNvPicPr>
+                      <a:picLocks noChangeAspect="1" noChangeArrowheads="1"/>
+                    </pic:cNvPicPr>
+                  </pic:nvPicPr>
+                  <pic:blipFill>
+                    <a:blip r:embed="rId14" cstate="none"/>
+                    <a:srcRect/>
+                    <a:stretch>
+                      <a:fillRect/>
+                    </a:stretch>
+                  </pic:blipFill>
+                  <pic:spPr bwMode="auto">
+                    <a:xfrm>
+                      <a:off x="0" y="0"/>
+                      <a:ext cx="4000500" cy="3200400"/>
+                    </a:xfrm>
+                    <a:prstGeom prst="rect">
+                      <a:avLst/>
+                    </a:prstGeom>
+                  </pic:spPr>
+                </pic:pic>
+              </a:graphicData>
+            </a:graphic>
+          </wp:inline>
+        </w:drawing>
+      </w:r>
+    </w:p>
+    <w:p>
+      <w:pPr>
+        <w:spacing w:after="200"/>
+        <w:jc w:val="center"/>
+      </w:pPr>
+      <w:r>
+        <w:rPr>
+          <w:i/>
+          <w:iCs/>
+          <w:color w:val="666666"/>
+          <w:sz w:val="18"/>
+          <w:szCs w:val="18"/>
+        </w:rPr>
+        <w:t xml:space="preserve">Figura 7. Ventana de una cita: reagendar, confirmar, marcar atendida, no asistió o cancelar.</w:t>
       </w:r>
     </w:p>
     <w:tbl>
@@ -2602,6 +3110,130 @@
         <w:t xml:space="preserve">.</w:t>
       </w:r>
     </w:p>
+    <w:p>
+      <w:pPr>
+        <w:spacing w:after="60" w:before="120"/>
+        <w:jc w:val="center"/>
+      </w:pPr>
+      <w:r>
+        <w:drawing>
+          <wp:inline distT="0" distB="0" distL="0" distR="0">
+            <wp:extent cx="3619500" cy="2924175"/>
+            <wp:effectExtent t="0" r="0" b="0" l="0"/>
+            <wp:docPr id="1" name="07-bloquear" descr="Bloquear todo el día." title="Bloquear todo el día."/>
+            <wp:cNvGraphicFramePr>
+              <a:graphicFrameLocks xmlns:a="http://schemas.openxmlformats.org/drawingml/2006/main" noChangeAspect="1"/>
+            </wp:cNvGraphicFramePr>
+            <a:graphic xmlns:a="http://schemas.openxmlformats.org/drawingml/2006/main">
+              <a:graphicData uri="http://schemas.openxmlformats.org/drawingml/2006/picture">
+                <pic:pic xmlns:pic="http://schemas.openxmlformats.org/drawingml/2006/picture">
+                  <pic:nvPicPr>
+                    <pic:cNvPr id="0" name="" descr=""/>
+                    <pic:cNvPicPr>
+                      <a:picLocks noChangeAspect="1" noChangeArrowheads="1"/>
+                    </pic:cNvPicPr>
+                  </pic:nvPicPr>
+                  <pic:blipFill>
+                    <a:blip r:embed="rId15" cstate="none"/>
+                    <a:srcRect/>
+                    <a:stretch>
+                      <a:fillRect/>
+                    </a:stretch>
+                  </pic:blipFill>
+                  <pic:spPr bwMode="auto">
+                    <a:xfrm>
+                      <a:off x="0" y="0"/>
+                      <a:ext cx="3619500" cy="2924175"/>
+                    </a:xfrm>
+                    <a:prstGeom prst="rect">
+                      <a:avLst/>
+                    </a:prstGeom>
+                  </pic:spPr>
+                </pic:pic>
+              </a:graphicData>
+            </a:graphic>
+          </wp:inline>
+        </w:drawing>
+      </w:r>
+    </w:p>
+    <w:p>
+      <w:pPr>
+        <w:spacing w:after="200"/>
+        <w:jc w:val="center"/>
+      </w:pPr>
+      <w:r>
+        <w:rPr>
+          <w:i/>
+          <w:iCs/>
+          <w:color w:val="666666"/>
+          <w:sz w:val="18"/>
+          <w:szCs w:val="18"/>
+        </w:rPr>
+        <w:t xml:space="preserve">Figura 8. Bloquear todo el día.</w:t>
+      </w:r>
+    </w:p>
+    <w:p>
+      <w:pPr>
+        <w:spacing w:after="60" w:before="120"/>
+        <w:jc w:val="center"/>
+      </w:pPr>
+      <w:r>
+        <w:drawing>
+          <wp:inline distT="0" distB="0" distL="0" distR="0">
+            <wp:extent cx="3619500" cy="3429000"/>
+            <wp:effectExtent t="0" r="0" b="0" l="0"/>
+            <wp:docPr id="1" name="07b-bloquear-horas" descr="Bloquear solo unas horas (desmarcando «Todo el día»)." title="Bloquear solo unas horas (desmarcando «Todo el día»)."/>
+            <wp:cNvGraphicFramePr>
+              <a:graphicFrameLocks xmlns:a="http://schemas.openxmlformats.org/drawingml/2006/main" noChangeAspect="1"/>
+            </wp:cNvGraphicFramePr>
+            <a:graphic xmlns:a="http://schemas.openxmlformats.org/drawingml/2006/main">
+              <a:graphicData uri="http://schemas.openxmlformats.org/drawingml/2006/picture">
+                <pic:pic xmlns:pic="http://schemas.openxmlformats.org/drawingml/2006/picture">
+                  <pic:nvPicPr>
+                    <pic:cNvPr id="0" name="" descr=""/>
+                    <pic:cNvPicPr>
+                      <a:picLocks noChangeAspect="1" noChangeArrowheads="1"/>
+                    </pic:cNvPicPr>
+                  </pic:nvPicPr>
+                  <pic:blipFill>
+                    <a:blip r:embed="rId16" cstate="none"/>
+                    <a:srcRect/>
+                    <a:stretch>
+                      <a:fillRect/>
+                    </a:stretch>
+                  </pic:blipFill>
+                  <pic:spPr bwMode="auto">
+                    <a:xfrm>
+                      <a:off x="0" y="0"/>
+                      <a:ext cx="3619500" cy="3429000"/>
+                    </a:xfrm>
+                    <a:prstGeom prst="rect">
+                      <a:avLst/>
+                    </a:prstGeom>
+                  </pic:spPr>
+                </pic:pic>
+              </a:graphicData>
+            </a:graphic>
+          </wp:inline>
+        </w:drawing>
+      </w:r>
+    </w:p>
+    <w:p>
+      <w:pPr>
+        <w:spacing w:after="200"/>
+        <w:jc w:val="center"/>
+      </w:pPr>
+      <w:r>
+        <w:rPr>
+          <w:i/>
+          <w:iCs/>
+          <w:color w:val="666666"/>
+          <w:sz w:val="18"/>
+          <w:szCs w:val="18"/>
+        </w:rPr>
+        <w:t xml:space="preserve">Figura 9. Bloquear solo unas horas (desmarcando «Todo el día»).</w:t>
+      </w:r>
+    </w:p>
     <w:tbl>
       <w:tblPr>
         <w:tblW w:type="dxa" w:w="9026"/>
@@ -2733,6 +3365,68 @@
     </w:p>
     <w:p>
       <w:pPr>
+        <w:spacing w:after="60" w:before="120"/>
+        <w:jc w:val="center"/>
+      </w:pPr>
+      <w:r>
+        <w:drawing>
+          <wp:inline distT="0" distB="0" distL="0" distR="0">
+            <wp:extent cx="3619500" cy="1905000"/>
+            <wp:effectExtent t="0" r="0" b="0" l="0"/>
+            <wp:docPr id="1" name="08-bloqueo" descr="Detalle de un bloqueo con el botón «Quitar bloqueo»." title="Detalle de un bloqueo con el botón «Quitar bloqueo»."/>
+            <wp:cNvGraphicFramePr>
+              <a:graphicFrameLocks xmlns:a="http://schemas.openxmlformats.org/drawingml/2006/main" noChangeAspect="1"/>
+            </wp:cNvGraphicFramePr>
+            <a:graphic xmlns:a="http://schemas.openxmlformats.org/drawingml/2006/main">
+              <a:graphicData uri="http://schemas.openxmlformats.org/drawingml/2006/picture">
+                <pic:pic xmlns:pic="http://schemas.openxmlformats.org/drawingml/2006/picture">
+                  <pic:nvPicPr>
+                    <pic:cNvPr id="0" name="" descr=""/>
+                    <pic:cNvPicPr>
+                      <a:picLocks noChangeAspect="1" noChangeArrowheads="1"/>
+                    </pic:cNvPicPr>
+                  </pic:nvPicPr>
+                  <pic:blipFill>
+                    <a:blip r:embed="rId17" cstate="none"/>
+                    <a:srcRect/>
+                    <a:stretch>
+                      <a:fillRect/>
+                    </a:stretch>
+                  </pic:blipFill>
+                  <pic:spPr bwMode="auto">
+                    <a:xfrm>
+                      <a:off x="0" y="0"/>
+                      <a:ext cx="3619500" cy="1905000"/>
+                    </a:xfrm>
+                    <a:prstGeom prst="rect">
+                      <a:avLst/>
+                    </a:prstGeom>
+                  </pic:spPr>
+                </pic:pic>
+              </a:graphicData>
+            </a:graphic>
+          </wp:inline>
+        </w:drawing>
+      </w:r>
+    </w:p>
+    <w:p>
+      <w:pPr>
+        <w:spacing w:after="200"/>
+        <w:jc w:val="center"/>
+      </w:pPr>
+      <w:r>
+        <w:rPr>
+          <w:i/>
+          <w:iCs/>
+          <w:color w:val="666666"/>
+          <w:sz w:val="18"/>
+          <w:szCs w:val="18"/>
+        </w:rPr>
+        <w:t xml:space="preserve">Figura 10. Detalle de un bloqueo con el botón «Quitar bloqueo».</w:t>
+      </w:r>
+    </w:p>
+    <w:p>
+      <w:pPr>
         <w:spacing w:after="120"/>
       </w:pPr>
       <w:r>
@@ -2845,6 +3539,68 @@
       </w:r>
       <w:r>
         <w:t xml:space="preserve">. No se registran diagnósticos ni datos clínicos.</w:t>
+      </w:r>
+    </w:p>
+    <w:p>
+      <w:pPr>
+        <w:spacing w:after="60" w:before="120"/>
+        <w:jc w:val="center"/>
+      </w:pPr>
+      <w:r>
+        <w:drawing>
+          <wp:inline distT="0" distB="0" distL="0" distR="0">
+            <wp:extent cx="5715000" cy="3571875"/>
+            <wp:effectExtent t="0" r="0" b="0" l="0"/>
+            <wp:docPr id="1" name="10-pacientes" descr="Lista de pacientes con su autorización de datos." title="Lista de pacientes con su autorización de datos."/>
+            <wp:cNvGraphicFramePr>
+              <a:graphicFrameLocks xmlns:a="http://schemas.openxmlformats.org/drawingml/2006/main" noChangeAspect="1"/>
+            </wp:cNvGraphicFramePr>
+            <a:graphic xmlns:a="http://schemas.openxmlformats.org/drawingml/2006/main">
+              <a:graphicData uri="http://schemas.openxmlformats.org/drawingml/2006/picture">
+                <pic:pic xmlns:pic="http://schemas.openxmlformats.org/drawingml/2006/picture">
+                  <pic:nvPicPr>
+                    <pic:cNvPr id="0" name="" descr=""/>
+                    <pic:cNvPicPr>
+                      <a:picLocks noChangeAspect="1" noChangeArrowheads="1"/>
+                    </pic:cNvPicPr>
+                  </pic:nvPicPr>
+                  <pic:blipFill>
+                    <a:blip r:embed="rId18" cstate="none"/>
+                    <a:srcRect/>
+                    <a:stretch>
+                      <a:fillRect/>
+                    </a:stretch>
+                  </pic:blipFill>
+                  <pic:spPr bwMode="auto">
+                    <a:xfrm>
+                      <a:off x="0" y="0"/>
+                      <a:ext cx="5715000" cy="3571875"/>
+                    </a:xfrm>
+                    <a:prstGeom prst="rect">
+                      <a:avLst/>
+                    </a:prstGeom>
+                  </pic:spPr>
+                </pic:pic>
+              </a:graphicData>
+            </a:graphic>
+          </wp:inline>
+        </w:drawing>
+      </w:r>
+    </w:p>
+    <w:p>
+      <w:pPr>
+        <w:spacing w:after="200"/>
+        <w:jc w:val="center"/>
+      </w:pPr>
+      <w:r>
+        <w:rPr>
+          <w:i/>
+          <w:iCs/>
+          <w:color w:val="666666"/>
+          <w:sz w:val="18"/>
+          <w:szCs w:val="18"/>
+        </w:rPr>
+        <w:t xml:space="preserve">Figura 11. Lista de pacientes con su autorización de datos.</w:t>
       </w:r>
     </w:p>
     <w:tbl>
@@ -3171,6 +3927,68 @@
     </w:p>
     <w:p>
       <w:pPr>
+        <w:spacing w:after="60" w:before="120"/>
+        <w:jc w:val="center"/>
+      </w:pPr>
+      <w:r>
+        <w:drawing>
+          <wp:inline distT="0" distB="0" distL="0" distR="0">
+            <wp:extent cx="5715000" cy="3571875"/>
+            <wp:effectExtent t="0" r="0" b="0" l="0"/>
+            <wp:docPr id="1" name="11-alertas" descr="Alertas: una emergencia (rojo) y un paciente que espera a recepción (azul)." title="Alertas: una emergencia (rojo) y un paciente que espera a recepción (azul)."/>
+            <wp:cNvGraphicFramePr>
+              <a:graphicFrameLocks xmlns:a="http://schemas.openxmlformats.org/drawingml/2006/main" noChangeAspect="1"/>
+            </wp:cNvGraphicFramePr>
+            <a:graphic xmlns:a="http://schemas.openxmlformats.org/drawingml/2006/main">
+              <a:graphicData uri="http://schemas.openxmlformats.org/drawingml/2006/picture">
+                <pic:pic xmlns:pic="http://schemas.openxmlformats.org/drawingml/2006/picture">
+                  <pic:nvPicPr>
+                    <pic:cNvPr id="0" name="" descr=""/>
+                    <pic:cNvPicPr>
+                      <a:picLocks noChangeAspect="1" noChangeArrowheads="1"/>
+                    </pic:cNvPicPr>
+                  </pic:nvPicPr>
+                  <pic:blipFill>
+                    <a:blip r:embed="rId19" cstate="none"/>
+                    <a:srcRect/>
+                    <a:stretch>
+                      <a:fillRect/>
+                    </a:stretch>
+                  </pic:blipFill>
+                  <pic:spPr bwMode="auto">
+                    <a:xfrm>
+                      <a:off x="0" y="0"/>
+                      <a:ext cx="5715000" cy="3571875"/>
+                    </a:xfrm>
+                    <a:prstGeom prst="rect">
+                      <a:avLst/>
+                    </a:prstGeom>
+                  </pic:spPr>
+                </pic:pic>
+              </a:graphicData>
+            </a:graphic>
+          </wp:inline>
+        </w:drawing>
+      </w:r>
+    </w:p>
+    <w:p>
+      <w:pPr>
+        <w:spacing w:after="200"/>
+        <w:jc w:val="center"/>
+      </w:pPr>
+      <w:r>
+        <w:rPr>
+          <w:i/>
+          <w:iCs/>
+          <w:color w:val="666666"/>
+          <w:sz w:val="18"/>
+          <w:szCs w:val="18"/>
+        </w:rPr>
+        <w:t xml:space="preserve">Figura 12. Alertas: una emergencia (rojo) y un paciente que espera a recepción (azul).</w:t>
+      </w:r>
+    </w:p>
+    <w:p>
+      <w:pPr>
         <w:spacing w:after="120"/>
       </w:pPr>
       <w:r>
@@ -3181,10 +3999,20 @@
           <w:b/>
           <w:bCs/>
         </w:rPr>
+        <w:t xml:space="preserve">«Marcar leída»</w:t>
+      </w:r>
+      <w:r>
+        <w:t xml:space="preserve"> en cada alerta o </w:t>
+      </w:r>
+      <w:r>
+        <w:rPr>
+          <w:b/>
+          <w:bCs/>
+        </w:rPr>
         <w:t xml:space="preserve">«Marcar todas como leídas»</w:t>
       </w:r>
       <w:r>
-        <w:t xml:space="preserve"> cuando haya revisado las alertas.</w:t>
+        <w:t xml:space="preserve"> cuando las haya revisado.</w:t>
       </w:r>
     </w:p>
     <w:p>

</xml_diff>

<commit_message>
Manual de recepción: avisos con sonido y notificaciones; atención desde el panel
Co-Authored-By: Claude Opus 5.5 <noreply@anthropic.com>
Claude-Session: https://claude.ai/code/session_01M9J19rHEn3Sf8xzUA5SjEa
</commit_message>
<xml_diff>
--- a/mediconnect/docs/Manual_Recepcion_MediConnect.docx
+++ b/mediconnect/docs/Manual_Recepcion_MediConnect.docx
@@ -460,17 +460,27 @@
         <w:t xml:space="preserve">Lunes a viernes de 08:00 a 18:00 y sábados de 08:00 a 12:00:</w:t>
       </w:r>
       <w:r>
-        <w:t xml:space="preserve"> si un paciente pide hablar con una persona, Gia le da el </w:t>
-      </w:r>
-      <w:r>
-        <w:rPr>
-          <w:b/>
-          <w:bCs/>
-        </w:rPr>
-        <w:t xml:space="preserve">WhatsApp de recepción</w:t>
-      </w:r>
-      <w:r>
-        <w:t xml:space="preserve"> y además deja la conversación esperando en el panel.</w:t>
+        <w:t xml:space="preserve"> si un paciente pide hablar con una persona, Gia le avisa que recepción le escribirá </w:t>
+      </w:r>
+      <w:r>
+        <w:rPr>
+          <w:b/>
+          <w:bCs/>
+        </w:rPr>
+        <w:t xml:space="preserve">en ese mismo chat</w:t>
+      </w:r>
+      <w:r>
+        <w:t xml:space="preserve">, y la conversación queda esperando en el panel. Usted recibe un </w:t>
+      </w:r>
+      <w:r>
+        <w:rPr>
+          <w:b/>
+          <w:bCs/>
+        </w:rPr>
+        <w:t xml:space="preserve">aviso con sonido</w:t>
+      </w:r>
+      <w:r>
+        <w:t xml:space="preserve"> (sección 4).</w:t>
       </w:r>
     </w:p>
     <w:p>
@@ -952,7 +962,17 @@
               <w:spacing w:after="60"/>
             </w:pPr>
             <w:r>
-              <w:t xml:space="preserve">Cierre sesión si usa una computadora compartida.</w:t>
+              <w:t xml:space="preserve">Cierre sesión si usa una computadora compartida. Recuerde que </w:t>
+            </w:r>
+            <w:r>
+              <w:rPr>
+                <w:b/>
+                <w:bCs/>
+              </w:rPr>
+              <w:t xml:space="preserve">al cerrar sesión ese equipo deja de recibir avisos</w:t>
+            </w:r>
+            <w:r>
+              <w:t xml:space="preserve">; en su celular y en la computadora de recepción lo normal es dejar la sesión abierta.</w:t>
             </w:r>
           </w:p>
         </w:tc>
@@ -1375,59 +1395,49 @@
     </w:p>
     <w:p>
       <w:pPr>
-        <w:spacing w:after="120"/>
-      </w:pPr>
-      <w:r>
-        <w:t xml:space="preserve">Una conversación llega a recepción cuando el paciente </w:t>
-      </w:r>
-      <w:r>
-        <w:rPr>
-          <w:b/>
-          <w:bCs/>
-        </w:rPr>
-        <w:t xml:space="preserve">pide hablar con una persona</w:t>
-      </w:r>
-      <w:r>
-        <w:t xml:space="preserve">, cuando elige un servicio que atiende directamente el personal, o cuando Gia no logra entenderle. Aparece en </w:t>
-      </w:r>
-      <w:r>
-        <w:rPr>
-          <w:b/>
-          <w:bCs/>
-        </w:rPr>
-        <w:t xml:space="preserve">Resumen → Conversaciones esperando a recepción</w:t>
-      </w:r>
-      <w:r>
-        <w:t xml:space="preserve"> y en </w:t>
-      </w:r>
-      <w:r>
-        <w:rPr>
-          <w:b/>
-          <w:bCs/>
-        </w:rPr>
-        <w:t xml:space="preserve">Conversaciones</w:t>
-      </w:r>
-      <w:r>
-        <w:t xml:space="preserve"> con la etiqueta </w:t>
-      </w:r>
-      <w:r>
-        <w:rPr>
-          <w:b/>
-          <w:bCs/>
-        </w:rPr>
-        <w:t xml:space="preserve">«Espera recepción»</w:t>
-      </w:r>
-      <w:r>
-        <w:t xml:space="preserve">.</w:t>
-      </w:r>
-    </w:p>
-    <w:p>
-      <w:pPr>
         <w:pStyle w:val="Heading2"/>
         <w:spacing w:after="120" w:before="240"/>
       </w:pPr>
       <w:r>
-        <w:t xml:space="preserve">Responder a un paciente</w:t>
+        <w:t xml:space="preserve">Activar los avisos (sonido y notificaciones)</w:t>
+      </w:r>
+    </w:p>
+    <w:p>
+      <w:pPr>
+        <w:spacing w:after="120"/>
+      </w:pPr>
+      <w:r>
+        <w:t xml:space="preserve">Para que no se le pase ningún paciente, el panel </w:t>
+      </w:r>
+      <w:r>
+        <w:rPr>
+          <w:b/>
+          <w:bCs/>
+        </w:rPr>
+        <w:t xml:space="preserve">avisa con sonido</w:t>
+      </w:r>
+      <w:r>
+        <w:t xml:space="preserve"> cuando alguien pide hablar con recepción y </w:t>
+      </w:r>
+      <w:r>
+        <w:rPr>
+          <w:b/>
+          <w:bCs/>
+        </w:rPr>
+        <w:t xml:space="preserve">cada vez que un paciente escribe</w:t>
+      </w:r>
+      <w:r>
+        <w:t xml:space="preserve"> en un chat que usted atiende. Actívelo </w:t>
+      </w:r>
+      <w:r>
+        <w:rPr>
+          <w:b/>
+          <w:bCs/>
+        </w:rPr>
+        <w:t xml:space="preserve">una vez en cada dispositivo</w:t>
+      </w:r>
+      <w:r>
+        <w:t xml:space="preserve"> que use: su celular y la computadora de recepción.</w:t>
       </w:r>
     </w:p>
     <w:p>
@@ -1440,17 +1450,17 @@
         <w:spacing w:after="80"/>
       </w:pPr>
       <w:r>
-        <w:t xml:space="preserve">Entre a </w:t>
-      </w:r>
-      <w:r>
-        <w:rPr>
-          <w:b/>
-          <w:bCs/>
-        </w:rPr>
-        <w:t xml:space="preserve">💬 Conversaciones</w:t>
-      </w:r>
-      <w:r>
-        <w:t xml:space="preserve"> y haga clic en el chat del paciente.</w:t>
+        <w:t xml:space="preserve">Abra el panel en </w:t>
+      </w:r>
+      <w:r>
+        <w:rPr>
+          <w:b/>
+          <w:bCs/>
+        </w:rPr>
+        <w:t xml:space="preserve">Chrome</w:t>
+      </w:r>
+      <w:r>
+        <w:t xml:space="preserve"> (no en modo incógnito).</w:t>
       </w:r>
     </w:p>
     <w:p>
@@ -1463,17 +1473,37 @@
         <w:spacing w:after="80"/>
       </w:pPr>
       <w:r>
-        <w:t xml:space="preserve">Lea el historial: arriba aparece el </w:t>
-      </w:r>
-      <w:r>
-        <w:rPr>
-          <w:b/>
-          <w:bCs/>
-        </w:rPr>
-        <w:t xml:space="preserve">motivo de derivación</w:t>
-      </w:r>
-      <w:r>
-        <w:t xml:space="preserve">.</w:t>
+        <w:t xml:space="preserve">Arriba aparece la franja amarilla </w:t>
+      </w:r>
+      <w:r>
+        <w:rPr>
+          <w:b/>
+          <w:bCs/>
+        </w:rPr>
+        <w:t xml:space="preserve">«Active los avisos en este dispositivo»</w:t>
+      </w:r>
+      <w:r>
+        <w:t xml:space="preserve">. Pulse </w:t>
+      </w:r>
+      <w:r>
+        <w:rPr>
+          <w:b/>
+          <w:bCs/>
+        </w:rPr>
+        <w:t xml:space="preserve">Activar</w:t>
+      </w:r>
+      <w:r>
+        <w:t xml:space="preserve">. También puede usar el botón </w:t>
+      </w:r>
+      <w:r>
+        <w:rPr>
+          <w:b/>
+          <w:bCs/>
+        </w:rPr>
+        <w:t xml:space="preserve">«🔔 Activar avisos»</w:t>
+      </w:r>
+      <w:r>
+        <w:t xml:space="preserve"> del menú, debajo de su nombre.</w:t>
       </w:r>
     </w:p>
     <w:p>
@@ -1486,27 +1516,17 @@
         <w:spacing w:after="80"/>
       </w:pPr>
       <w:r>
-        <w:t xml:space="preserve">Escriba su respuesta en </w:t>
-      </w:r>
-      <w:r>
-        <w:rPr>
-          <w:b/>
-          <w:bCs/>
-        </w:rPr>
-        <w:t xml:space="preserve">«Responder como recepción…»</w:t>
-      </w:r>
-      <w:r>
-        <w:t xml:space="preserve"> y pulse </w:t>
-      </w:r>
-      <w:r>
-        <w:rPr>
-          <w:b/>
-          <w:bCs/>
-        </w:rPr>
-        <w:t xml:space="preserve">Enviar</w:t>
-      </w:r>
-      <w:r>
-        <w:t xml:space="preserve">. El mensaje le llega al paciente por WhatsApp desde el número del centro.</w:t>
+        <w:t xml:space="preserve">Cuando el navegador pregunte, elija </w:t>
+      </w:r>
+      <w:r>
+        <w:rPr>
+          <w:b/>
+          <w:bCs/>
+        </w:rPr>
+        <w:t xml:space="preserve">«Permitir»</w:t>
+      </w:r>
+      <w:r>
+        <w:t xml:space="preserve"> notificaciones.</w:t>
       </w:r>
     </w:p>
     <w:p>
@@ -1519,40 +1539,27 @@
         <w:spacing w:after="80"/>
       </w:pPr>
       <w:r>
-        <w:t xml:space="preserve">Mientras usted atiende, </w:t>
-      </w:r>
-      <w:r>
-        <w:rPr>
-          <w:b/>
-          <w:bCs/>
-        </w:rPr>
-        <w:t xml:space="preserve">Gia no interviene</w:t>
-      </w:r>
-      <w:r>
-        <w:t xml:space="preserve"> en ese chat.</w:t>
-      </w:r>
-    </w:p>
-    <w:p>
-      <w:pPr>
-        <w:pStyle w:val="ListParagraph"/>
-        <w:numPr>
-          <w:ilvl w:val="0"/>
-          <w:numId w:val="4"/>
-        </w:numPr>
-        <w:spacing w:after="80"/>
-      </w:pPr>
-      <w:r>
-        <w:t xml:space="preserve">Cuando termine, pulse </w:t>
-      </w:r>
-      <w:r>
-        <w:rPr>
-          <w:b/>
-          <w:bCs/>
-        </w:rPr>
-        <w:t xml:space="preserve">«Devolver al agente»</w:t>
-      </w:r>
-      <w:r>
-        <w:t xml:space="preserve"> para que Gia vuelva a atender a ese paciente.</w:t>
+        <w:t xml:space="preserve">Le llegará una </w:t>
+      </w:r>
+      <w:r>
+        <w:rPr>
+          <w:b/>
+          <w:bCs/>
+        </w:rPr>
+        <w:t xml:space="preserve">notificación de prueba</w:t>
+      </w:r>
+      <w:r>
+        <w:t xml:space="preserve"> y el botón cambiará a </w:t>
+      </w:r>
+      <w:r>
+        <w:rPr>
+          <w:b/>
+          <w:bCs/>
+        </w:rPr>
+        <w:t xml:space="preserve">«🔔 Avisos activados · probar»</w:t>
+      </w:r>
+      <w:r>
+        <w:t xml:space="preserve">. Púlselo cuando quiera comprobar que siguen funcionando.</w:t>
       </w:r>
     </w:p>
     <w:p>
@@ -1563,9 +1570,9 @@
       <w:r>
         <w:drawing>
           <wp:inline distT="0" distB="0" distL="0" distR="0">
-            <wp:extent cx="5715000" cy="3571875"/>
+            <wp:extent cx="5715000" cy="2324100"/>
             <wp:effectExtent t="0" r="0" b="0" l="0"/>
-            <wp:docPr id="1" name="09-conversacion" descr="Conversación en espera de recepción: arriba el motivo, abajo el cuadro para responder y, a la derecha, «Devolver al agente»." title="Conversación en espera de recepción: arriba el motivo, abajo el cuadro para responder y, a la derecha, «Devolver al agente»."/>
+            <wp:docPr id="1" name="12-avisos" descr="Franja para activar los avisos y botón «Activar avisos» en el menú. El número junto a Conversaciones indica cuántos chats esperan." title="Franja para activar los avisos y botón «Activar avisos» en el menú. El número junto a Conversaciones indica cuántos chats esperan."/>
             <wp:cNvGraphicFramePr>
               <a:graphicFrameLocks xmlns:a="http://schemas.openxmlformats.org/drawingml/2006/main" noChangeAspect="1"/>
             </wp:cNvGraphicFramePr>
@@ -1588,7 +1595,7 @@
                   <pic:spPr bwMode="auto">
                     <a:xfrm>
                       <a:off x="0" y="0"/>
-                      <a:ext cx="5715000" cy="3571875"/>
+                      <a:ext cx="5715000" cy="2324100"/>
                     </a:xfrm>
                     <a:prstGeom prst="rect">
                       <a:avLst/>
@@ -1614,35 +1621,211 @@
           <w:sz w:val="18"/>
           <w:szCs w:val="18"/>
         </w:rPr>
-        <w:t xml:space="preserve">Figura 4. Conversación en espera de recepción: arriba el motivo, abajo el cuadro para responder y, a la derecha, «Devolver al agente».</w:t>
-      </w:r>
-    </w:p>
-    <w:p>
-      <w:pPr>
-        <w:pStyle w:val="Heading2"/>
-        <w:spacing w:after="120" w:before="240"/>
-      </w:pPr>
-      <w:r>
-        <w:t xml:space="preserve">Tomar una conversación que atiende Gia</w:t>
-      </w:r>
-    </w:p>
+        <w:t xml:space="preserve">Figura 4. Franja para activar los avisos y botón «Activar avisos» en el menú. El número junto a Conversaciones indica cuántos chats esperan.</w:t>
+      </w:r>
+    </w:p>
+    <w:tbl>
+      <w:tblPr>
+        <w:tblW w:type="dxa" w:w="9026"/>
+        <w:tblBorders>
+          <w:top w:val="single" w:color="auto" w:sz="4"/>
+          <w:left w:val="single" w:color="auto" w:sz="4"/>
+          <w:bottom w:val="single" w:color="auto" w:sz="4"/>
+          <w:right w:val="single" w:color="auto" w:sz="4"/>
+          <w:insideH w:val="single" w:color="auto" w:sz="4"/>
+          <w:insideV w:val="single" w:color="auto" w:sz="4"/>
+        </w:tblBorders>
+      </w:tblPr>
+      <w:tblGrid>
+        <w:gridCol w:w="3000"/>
+        <w:gridCol w:w="6026"/>
+      </w:tblGrid>
+      <w:tr>
+        <w:trPr>
+          <w:tblHeader/>
+        </w:trPr>
+        <w:tc>
+          <w:tcPr>
+            <w:tcW w:type="dxa" w:w="3000"/>
+            <w:shd w:fill="0B5E7E" w:color="auto" w:val="clear"/>
+            <w:tcMar>
+              <w:top w:type="dxa" w:w="80"/>
+              <w:left w:type="dxa" w:w="120"/>
+              <w:bottom w:type="dxa" w:w="80"/>
+              <w:right w:type="dxa" w:w="120"/>
+            </w:tcMar>
+          </w:tcPr>
+          <w:p>
+            <w:r>
+              <w:rPr>
+                <w:b/>
+                <w:bCs/>
+                <w:color w:val="FFFFFF"/>
+              </w:rPr>
+              <w:t xml:space="preserve">Situación</w:t>
+            </w:r>
+          </w:p>
+        </w:tc>
+        <w:tc>
+          <w:tcPr>
+            <w:tcW w:type="dxa" w:w="6026"/>
+            <w:shd w:fill="0B5E7E" w:color="auto" w:val="clear"/>
+            <w:tcMar>
+              <w:top w:type="dxa" w:w="80"/>
+              <w:left w:type="dxa" w:w="120"/>
+              <w:bottom w:type="dxa" w:w="80"/>
+              <w:right w:type="dxa" w:w="120"/>
+            </w:tcMar>
+          </w:tcPr>
+          <w:p>
+            <w:r>
+              <w:rPr>
+                <w:b/>
+                <w:bCs/>
+                <w:color w:val="FFFFFF"/>
+              </w:rPr>
+              <w:t xml:space="preserve">Cómo le avisa el panel</w:t>
+            </w:r>
+          </w:p>
+        </w:tc>
+      </w:tr>
+      <w:tr>
+        <w:tc>
+          <w:tcPr>
+            <w:tcW w:type="dxa" w:w="3000"/>
+            <w:tcMar>
+              <w:top w:type="dxa" w:w="80"/>
+              <w:left w:type="dxa" w:w="120"/>
+              <w:bottom w:type="dxa" w:w="80"/>
+              <w:right w:type="dxa" w:w="120"/>
+            </w:tcMar>
+          </w:tcPr>
+          <w:p>
+            <w:r>
+              <w:t xml:space="preserve">Panel </w:t>
+            </w:r>
+            <w:r>
+              <w:rPr>
+                <w:b/>
+                <w:bCs/>
+              </w:rPr>
+              <w:t xml:space="preserve">abierto en pantalla</w:t>
+            </w:r>
+          </w:p>
+        </w:tc>
+        <w:tc>
+          <w:tcPr>
+            <w:tcW w:type="dxa" w:w="6026"/>
+            <w:tcMar>
+              <w:top w:type="dxa" w:w="80"/>
+              <w:left w:type="dxa" w:w="120"/>
+              <w:bottom w:type="dxa" w:w="80"/>
+              <w:right w:type="dxa" w:w="120"/>
+            </w:tcMar>
+          </w:tcPr>
+          <w:p>
+            <w:r>
+              <w:t xml:space="preserve">Suena un </w:t>
+            </w:r>
+            <w:r>
+              <w:rPr>
+                <w:b/>
+                <w:bCs/>
+              </w:rPr>
+              <w:t xml:space="preserve">«ding‑ding»</w:t>
+            </w:r>
+            <w:r>
+              <w:t xml:space="preserve"> y la pestaña del navegador muestra cuántos chats esperan, por ejemplo </w:t>
+            </w:r>
+            <w:r>
+              <w:rPr>
+                <w:b/>
+                <w:bCs/>
+              </w:rPr>
+              <w:t xml:space="preserve">(2) MediConnect AI</w:t>
+            </w:r>
+            <w:r>
+              <w:t xml:space="preserve">.</w:t>
+            </w:r>
+          </w:p>
+        </w:tc>
+      </w:tr>
+      <w:tr>
+        <w:tc>
+          <w:tcPr>
+            <w:tcW w:type="dxa" w:w="3000"/>
+            <w:tcMar>
+              <w:top w:type="dxa" w:w="80"/>
+              <w:left w:type="dxa" w:w="120"/>
+              <w:bottom w:type="dxa" w:w="80"/>
+              <w:right w:type="dxa" w:w="120"/>
+            </w:tcMar>
+          </w:tcPr>
+          <w:p>
+            <w:r>
+              <w:t xml:space="preserve">Celular </w:t>
+            </w:r>
+            <w:r>
+              <w:rPr>
+                <w:b/>
+                <w:bCs/>
+              </w:rPr>
+              <w:t xml:space="preserve">bloqueado</w:t>
+            </w:r>
+            <w:r>
+              <w:t xml:space="preserve"> o navegador </w:t>
+            </w:r>
+            <w:r>
+              <w:rPr>
+                <w:b/>
+                <w:bCs/>
+              </w:rPr>
+              <w:t xml:space="preserve">cerrado</w:t>
+            </w:r>
+          </w:p>
+        </w:tc>
+        <w:tc>
+          <w:tcPr>
+            <w:tcW w:type="dxa" w:w="6026"/>
+            <w:tcMar>
+              <w:top w:type="dxa" w:w="80"/>
+              <w:left w:type="dxa" w:w="120"/>
+              <w:bottom w:type="dxa" w:w="80"/>
+              <w:right w:type="dxa" w:w="120"/>
+            </w:tcMar>
+          </w:tcPr>
+          <w:p>
+            <w:r>
+              <w:t xml:space="preserve">Llega una </w:t>
+            </w:r>
+            <w:r>
+              <w:rPr>
+                <w:b/>
+                <w:bCs/>
+              </w:rPr>
+              <w:t xml:space="preserve">notificación</w:t>
+            </w:r>
+            <w:r>
+              <w:t xml:space="preserve"> como la de WhatsApp: «Un paciente espera respuesta de recepción». Al tocarla se abre </w:t>
+            </w:r>
+            <w:r>
+              <w:rPr>
+                <w:b/>
+                <w:bCs/>
+              </w:rPr>
+              <w:t xml:space="preserve">Conversaciones</w:t>
+            </w:r>
+            <w:r>
+              <w:t xml:space="preserve">.</w:t>
+            </w:r>
+          </w:p>
+        </w:tc>
+      </w:tr>
+    </w:tbl>
     <w:p>
       <w:pPr>
         <w:spacing w:after="120"/>
       </w:pPr>
-      <w:r>
-        <w:t xml:space="preserve">Si ve un chat donde conviene intervenir, ábralo y pulse </w:t>
-      </w:r>
-      <w:r>
-        <w:rPr>
-          <w:b/>
-          <w:bCs/>
-        </w:rPr>
-        <w:t xml:space="preserve">«Tomar conversación»</w:t>
-      </w:r>
-      <w:r>
-        <w:t xml:space="preserve">. Gia se calla en ese chat hasta que usted lo devuelva.</w:t>
-      </w:r>
     </w:p>
     <w:tbl>
       <w:tblPr>
@@ -1665,11 +1848,11 @@
             <w:tcW w:type="dxa" w:w="9026"/>
             <w:tcBorders>
               <w:top w:val="none" w:color="FFFFFF" w:sz="0"/>
-              <w:left w:val="single" w:color="0B5E7E" w:sz="24"/>
+              <w:left w:val="single" w:color="B26A00" w:sz="24"/>
               <w:bottom w:val="none" w:color="FFFFFF" w:sz="0"/>
               <w:right w:val="none" w:color="FFFFFF" w:sz="0"/>
             </w:tcBorders>
-            <w:shd w:fill="EEF6F9" w:color="auto" w:val="clear"/>
+            <w:shd w:fill="FFF4E5" w:color="auto" w:val="clear"/>
             <w:tcMar>
               <w:top w:type="dxa" w:w="120"/>
               <w:left w:type="dxa" w:w="200"/>
@@ -1685,7 +1868,7 @@
               <w:rPr>
                 <w:b/>
                 <w:bCs/>
-                <w:color w:val="0B5E7E"/>
+                <w:color w:val="B26A00"/>
               </w:rPr>
               <w:t xml:space="preserve">Tenga en cuenta</w:t>
             </w:r>
@@ -1695,24 +1878,17 @@
               <w:spacing w:after="60"/>
             </w:pPr>
             <w:r>
-              <w:rPr>
-                <w:b/>
-                <w:bCs/>
-              </w:rPr>
-              <w:t xml:space="preserve">Regla de WhatsApp:</w:t>
-            </w:r>
-            <w:r>
-              <w:t xml:space="preserve"> solo se puede responder a un paciente </w:t>
-            </w:r>
-            <w:r>
-              <w:rPr>
-                <w:b/>
-                <w:bCs/>
-              </w:rPr>
-              <w:t xml:space="preserve">dentro de las 24 horas</w:t>
-            </w:r>
-            <w:r>
-              <w:t xml:space="preserve"> desde su último mensaje. Pasado ese tiempo, el paciente debe volver a escribir.</w:t>
+              <w:t xml:space="preserve">Por privacidad, la notificación </w:t>
+            </w:r>
+            <w:r>
+              <w:rPr>
+                <w:b/>
+                <w:bCs/>
+              </w:rPr>
+              <w:t xml:space="preserve">no muestra el nombre ni el mensaje</w:t>
+            </w:r>
+            <w:r>
+              <w:t xml:space="preserve"> del paciente: para leerlo, abra el panel.</w:t>
             </w:r>
           </w:p>
           <w:p>
@@ -1720,17 +1896,27 @@
               <w:spacing w:after="60"/>
             </w:pPr>
             <w:r>
-              <w:t xml:space="preserve">Si nadie responde en el chat, Gia </w:t>
-            </w:r>
-            <w:r>
-              <w:rPr>
-                <w:b/>
-                <w:bCs/>
-              </w:rPr>
-              <w:t xml:space="preserve">vuelve a atender sola</w:t>
-            </w:r>
-            <w:r>
-              <w:t xml:space="preserve"> después de unas horas.</w:t>
+              <w:t xml:space="preserve">En </w:t>
+            </w:r>
+            <w:r>
+              <w:rPr>
+                <w:b/>
+                <w:bCs/>
+              </w:rPr>
+              <w:t xml:space="preserve">iPhone</w:t>
+            </w:r>
+            <w:r>
+              <w:t xml:space="preserve">, primero agregue el panel a la pantalla de inicio (Compartir → </w:t>
+            </w:r>
+            <w:r>
+              <w:rPr>
+                <w:b/>
+                <w:bCs/>
+              </w:rPr>
+              <w:t xml:space="preserve">«Agregar a inicio»</w:t>
+            </w:r>
+            <w:r>
+              <w:t xml:space="preserve">) y ábralo desde ese ícono; luego active los avisos.</w:t>
             </w:r>
           </w:p>
           <w:p>
@@ -1738,35 +1924,17 @@
               <w:spacing w:after="60"/>
             </w:pPr>
             <w:r>
-              <w:t xml:space="preserve">El paciente puede escribir </w:t>
-            </w:r>
-            <w:r>
-              <w:rPr>
-                <w:b/>
-                <w:bCs/>
-              </w:rPr>
-              <w:t xml:space="preserve">«menú»</w:t>
-            </w:r>
-            <w:r>
-              <w:t xml:space="preserve"> en cualquier momento para volver a hablar con Gia.</w:t>
-            </w:r>
-          </w:p>
-          <w:p>
-            <w:pPr>
-              <w:spacing w:after="60"/>
-            </w:pPr>
-            <w:r>
-              <w:t xml:space="preserve">Algunos pacientes le escribirán directamente al </w:t>
-            </w:r>
-            <w:r>
-              <w:rPr>
-                <w:b/>
-                <w:bCs/>
-              </w:rPr>
-              <w:t xml:space="preserve">WhatsApp de recepción</w:t>
-            </w:r>
-            <w:r>
-              <w:t xml:space="preserve"> (Gia les da ese número). Esas conversaciones se atienden en ese celular, no en el panel.</w:t>
+              <w:t xml:space="preserve">Revise que el celular </w:t>
+            </w:r>
+            <w:r>
+              <w:rPr>
+                <w:b/>
+                <w:bCs/>
+              </w:rPr>
+              <w:t xml:space="preserve">no tenga silenciadas</w:t>
+            </w:r>
+            <w:r>
+              <w:t xml:space="preserve"> las notificaciones de Chrome (Ajustes → Apps → Chrome → Notificaciones) y que no esté en modo «No molestar».</w:t>
             </w:r>
           </w:p>
         </w:tc>
@@ -1774,345 +1942,200 @@
     </w:tbl>
     <w:p>
       <w:pPr>
-        <w:pStyle w:val="Heading1"/>
-        <w:spacing w:after="160" w:before="360"/>
-      </w:pPr>
-      <w:r>
-        <w:t xml:space="preserve">5. Calendario y citas</w:t>
-      </w:r>
-    </w:p>
-    <w:p>
-      <w:pPr>
         <w:spacing w:after="120"/>
       </w:pPr>
-      <w:r>
-        <w:t xml:space="preserve">En </w:t>
-      </w:r>
-      <w:r>
-        <w:rPr>
-          <w:b/>
-          <w:bCs/>
-        </w:rPr>
-        <w:t xml:space="preserve">📅 Calendario</w:t>
-      </w:r>
-      <w:r>
-        <w:t xml:space="preserve"> ve la semana completa. Use </w:t>
-      </w:r>
-      <w:r>
-        <w:rPr>
-          <w:b/>
-          <w:bCs/>
-        </w:rPr>
-        <w:t xml:space="preserve">◀ ▶</w:t>
-      </w:r>
-      <w:r>
-        <w:t xml:space="preserve"> para cambiar de semana, </w:t>
-      </w:r>
-      <w:r>
-        <w:rPr>
-          <w:b/>
-          <w:bCs/>
-        </w:rPr>
-        <w:t xml:space="preserve">Hoy</w:t>
-      </w:r>
-      <w:r>
-        <w:t xml:space="preserve"> para volver a la semana actual y el selector </w:t>
-      </w:r>
-      <w:r>
-        <w:rPr>
-          <w:b/>
-          <w:bCs/>
-        </w:rPr>
-        <w:t xml:space="preserve">«Todos los médicos»</w:t>
-      </w:r>
-      <w:r>
-        <w:t xml:space="preserve"> para ver la agenda de uno solo.</w:t>
-      </w:r>
-    </w:p>
-    <w:tbl>
-      <w:tblPr>
-        <w:tblW w:type="dxa" w:w="9026"/>
-        <w:tblBorders>
-          <w:top w:val="single" w:color="auto" w:sz="4"/>
-          <w:left w:val="single" w:color="auto" w:sz="4"/>
-          <w:bottom w:val="single" w:color="auto" w:sz="4"/>
-          <w:right w:val="single" w:color="auto" w:sz="4"/>
-          <w:insideH w:val="single" w:color="auto" w:sz="4"/>
-          <w:insideV w:val="single" w:color="auto" w:sz="4"/>
-        </w:tblBorders>
-      </w:tblPr>
-      <w:tblGrid>
-        <w:gridCol w:w="3200"/>
-        <w:gridCol w:w="5826"/>
-      </w:tblGrid>
-      <w:tr>
-        <w:trPr>
-          <w:tblHeader/>
-        </w:trPr>
-        <w:tc>
-          <w:tcPr>
-            <w:tcW w:type="dxa" w:w="3200"/>
-            <w:shd w:fill="0B5E7E" w:color="auto" w:val="clear"/>
-            <w:tcMar>
-              <w:top w:type="dxa" w:w="80"/>
-              <w:left w:type="dxa" w:w="120"/>
-              <w:bottom w:type="dxa" w:w="80"/>
-              <w:right w:type="dxa" w:w="120"/>
-            </w:tcMar>
-          </w:tcPr>
-          <w:p>
-            <w:r>
-              <w:rPr>
-                <w:b/>
-                <w:bCs/>
-                <w:color w:val="FFFFFF"/>
-              </w:rPr>
-              <w:t xml:space="preserve">En el calendario</w:t>
-            </w:r>
-          </w:p>
-        </w:tc>
-        <w:tc>
-          <w:tcPr>
-            <w:tcW w:type="dxa" w:w="5826"/>
-            <w:shd w:fill="0B5E7E" w:color="auto" w:val="clear"/>
-            <w:tcMar>
-              <w:top w:type="dxa" w:w="80"/>
-              <w:left w:type="dxa" w:w="120"/>
-              <w:bottom w:type="dxa" w:w="80"/>
-              <w:right w:type="dxa" w:w="120"/>
-            </w:tcMar>
-          </w:tcPr>
-          <w:p>
-            <w:r>
-              <w:rPr>
-                <w:b/>
-                <w:bCs/>
-                <w:color w:val="FFFFFF"/>
-              </w:rPr>
-              <w:t xml:space="preserve">Significa</w:t>
-            </w:r>
-          </w:p>
-        </w:tc>
-      </w:tr>
-      <w:tr>
-        <w:tc>
-          <w:tcPr>
-            <w:tcW w:type="dxa" w:w="3200"/>
-            <w:tcMar>
-              <w:top w:type="dxa" w:w="80"/>
-              <w:left w:type="dxa" w:w="120"/>
-              <w:bottom w:type="dxa" w:w="80"/>
-              <w:right w:type="dxa" w:w="120"/>
-            </w:tcMar>
-          </w:tcPr>
-          <w:p>
-            <w:r>
-              <w:t xml:space="preserve">Cuadro azul</w:t>
-            </w:r>
-          </w:p>
-        </w:tc>
-        <w:tc>
-          <w:tcPr>
-            <w:tcW w:type="dxa" w:w="5826"/>
-            <w:tcMar>
-              <w:top w:type="dxa" w:w="80"/>
-              <w:left w:type="dxa" w:w="120"/>
-              <w:bottom w:type="dxa" w:w="80"/>
-              <w:right w:type="dxa" w:w="120"/>
-            </w:tcMar>
-          </w:tcPr>
-          <w:p>
-            <w:r>
-              <w:t xml:space="preserve">Cita programada.</w:t>
-            </w:r>
-          </w:p>
-        </w:tc>
-      </w:tr>
-      <w:tr>
-        <w:tc>
-          <w:tcPr>
-            <w:tcW w:type="dxa" w:w="3200"/>
-            <w:tcMar>
-              <w:top w:type="dxa" w:w="80"/>
-              <w:left w:type="dxa" w:w="120"/>
-              <w:bottom w:type="dxa" w:w="80"/>
-              <w:right w:type="dxa" w:w="120"/>
-            </w:tcMar>
-          </w:tcPr>
-          <w:p>
-            <w:r>
-              <w:rPr>
-                <w:b/>
-                <w:bCs/>
-              </w:rPr>
-              <w:t xml:space="preserve">✔</w:t>
-            </w:r>
-            <w:r>
-              <w:t xml:space="preserve"> junto a la hora</w:t>
-            </w:r>
-          </w:p>
-        </w:tc>
-        <w:tc>
-          <w:tcPr>
-            <w:tcW w:type="dxa" w:w="5826"/>
-            <w:tcMar>
-              <w:top w:type="dxa" w:w="80"/>
-              <w:left w:type="dxa" w:w="120"/>
-              <w:bottom w:type="dxa" w:w="80"/>
-              <w:right w:type="dxa" w:w="120"/>
-            </w:tcMar>
-          </w:tcPr>
-          <w:p>
-            <w:r>
-              <w:t xml:space="preserve">El paciente confirmó su asistencia.</w:t>
-            </w:r>
-          </w:p>
-        </w:tc>
-      </w:tr>
-      <w:tr>
-        <w:tc>
-          <w:tcPr>
-            <w:tcW w:type="dxa" w:w="3200"/>
-            <w:tcMar>
-              <w:top w:type="dxa" w:w="80"/>
-              <w:left w:type="dxa" w:w="120"/>
-              <w:bottom w:type="dxa" w:w="80"/>
-              <w:right w:type="dxa" w:w="120"/>
-            </w:tcMar>
-          </w:tcPr>
-          <w:p>
-            <w:r>
-              <w:t xml:space="preserve">Cuadro verde</w:t>
-            </w:r>
-          </w:p>
-        </w:tc>
-        <w:tc>
-          <w:tcPr>
-            <w:tcW w:type="dxa" w:w="5826"/>
-            <w:tcMar>
-              <w:top w:type="dxa" w:w="80"/>
-              <w:left w:type="dxa" w:w="120"/>
-              <w:bottom w:type="dxa" w:w="80"/>
-              <w:right w:type="dxa" w:w="120"/>
-            </w:tcMar>
-          </w:tcPr>
-          <w:p>
-            <w:r>
-              <w:t xml:space="preserve">Cita atendida.</w:t>
-            </w:r>
-          </w:p>
-        </w:tc>
-      </w:tr>
-      <w:tr>
-        <w:tc>
-          <w:tcPr>
-            <w:tcW w:type="dxa" w:w="3200"/>
-            <w:tcMar>
-              <w:top w:type="dxa" w:w="80"/>
-              <w:left w:type="dxa" w:w="120"/>
-              <w:bottom w:type="dxa" w:w="80"/>
-              <w:right w:type="dxa" w:w="120"/>
-            </w:tcMar>
-          </w:tcPr>
-          <w:p>
-            <w:r>
-              <w:t xml:space="preserve">Cuadro amarillo</w:t>
-            </w:r>
-          </w:p>
-        </w:tc>
-        <w:tc>
-          <w:tcPr>
-            <w:tcW w:type="dxa" w:w="5826"/>
-            <w:tcMar>
-              <w:top w:type="dxa" w:w="80"/>
-              <w:left w:type="dxa" w:w="120"/>
-              <w:bottom w:type="dxa" w:w="80"/>
-              <w:right w:type="dxa" w:w="120"/>
-            </w:tcMar>
-          </w:tcPr>
-          <w:p>
-            <w:r>
-              <w:t xml:space="preserve">El paciente no asistió.</w:t>
-            </w:r>
-          </w:p>
-        </w:tc>
-      </w:tr>
-      <w:tr>
-        <w:tc>
-          <w:tcPr>
-            <w:tcW w:type="dxa" w:w="3200"/>
-            <w:tcMar>
-              <w:top w:type="dxa" w:w="80"/>
-              <w:left w:type="dxa" w:w="120"/>
-              <w:bottom w:type="dxa" w:w="80"/>
-              <w:right w:type="dxa" w:w="120"/>
-            </w:tcMar>
-          </w:tcPr>
-          <w:p>
-            <w:r>
-              <w:t xml:space="preserve">Texto tachado</w:t>
-            </w:r>
-          </w:p>
-        </w:tc>
-        <w:tc>
-          <w:tcPr>
-            <w:tcW w:type="dxa" w:w="5826"/>
-            <w:tcMar>
-              <w:top w:type="dxa" w:w="80"/>
-              <w:left w:type="dxa" w:w="120"/>
-              <w:bottom w:type="dxa" w:w="80"/>
-              <w:right w:type="dxa" w:w="120"/>
-            </w:tcMar>
-          </w:tcPr>
-          <w:p>
-            <w:r>
-              <w:t xml:space="preserve">Cita cancelada.</w:t>
-            </w:r>
-          </w:p>
-        </w:tc>
-      </w:tr>
-      <w:tr>
-        <w:tc>
-          <w:tcPr>
-            <w:tcW w:type="dxa" w:w="3200"/>
-            <w:tcMar>
-              <w:top w:type="dxa" w:w="80"/>
-              <w:left w:type="dxa" w:w="120"/>
-              <w:bottom w:type="dxa" w:w="80"/>
-              <w:right w:type="dxa" w:w="120"/>
-            </w:tcMar>
-          </w:tcPr>
-          <w:p>
-            <w:r>
-              <w:t xml:space="preserve">Cuadro rayado gris con </w:t>
-            </w:r>
-            <w:r>
-              <w:rPr>
-                <w:b/>
-                <w:bCs/>
-              </w:rPr>
-              <w:t xml:space="preserve">⛔</w:t>
-            </w:r>
-          </w:p>
-        </w:tc>
-        <w:tc>
-          <w:tcPr>
-            <w:tcW w:type="dxa" w:w="5826"/>
-            <w:tcMar>
-              <w:top w:type="dxa" w:w="80"/>
-              <w:left w:type="dxa" w:w="120"/>
-              <w:bottom w:type="dxa" w:w="80"/>
-              <w:right w:type="dxa" w:w="120"/>
-            </w:tcMar>
-          </w:tcPr>
-          <w:p>
-            <w:r>
-              <w:t xml:space="preserve">Horario bloqueado (no se ofrece a pacientes).</w:t>
-            </w:r>
-          </w:p>
-        </w:tc>
-      </w:tr>
-    </w:tbl>
+    </w:p>
+    <w:p>
+      <w:pPr>
+        <w:pStyle w:val="Heading2"/>
+        <w:spacing w:after="120" w:before="240"/>
+      </w:pPr>
+      <w:r>
+        <w:t xml:space="preserve">Cuándo llega un chat a recepción</w:t>
+      </w:r>
+    </w:p>
+    <w:p>
+      <w:pPr>
+        <w:spacing w:after="120"/>
+      </w:pPr>
+      <w:r>
+        <w:t xml:space="preserve">Una conversación llega a recepción cuando el paciente </w:t>
+      </w:r>
+      <w:r>
+        <w:rPr>
+          <w:b/>
+          <w:bCs/>
+        </w:rPr>
+        <w:t xml:space="preserve">pide hablar con una persona</w:t>
+      </w:r>
+      <w:r>
+        <w:t xml:space="preserve">, cuando elige un servicio que atiende directamente el personal, o cuando Gia no logra entenderle. Aparece en </w:t>
+      </w:r>
+      <w:r>
+        <w:rPr>
+          <w:b/>
+          <w:bCs/>
+        </w:rPr>
+        <w:t xml:space="preserve">Resumen → Conversaciones esperando a recepción</w:t>
+      </w:r>
+      <w:r>
+        <w:t xml:space="preserve"> y en </w:t>
+      </w:r>
+      <w:r>
+        <w:rPr>
+          <w:b/>
+          <w:bCs/>
+        </w:rPr>
+        <w:t xml:space="preserve">Conversaciones</w:t>
+      </w:r>
+      <w:r>
+        <w:t xml:space="preserve"> con la etiqueta </w:t>
+      </w:r>
+      <w:r>
+        <w:rPr>
+          <w:b/>
+          <w:bCs/>
+        </w:rPr>
+        <w:t xml:space="preserve">«Espera recepción»</w:t>
+      </w:r>
+      <w:r>
+        <w:t xml:space="preserve">.</w:t>
+      </w:r>
+    </w:p>
+    <w:p>
+      <w:pPr>
+        <w:pStyle w:val="Heading2"/>
+        <w:spacing w:after="120" w:before="240"/>
+      </w:pPr>
+      <w:r>
+        <w:t xml:space="preserve">Responder a un paciente</w:t>
+      </w:r>
+    </w:p>
+    <w:p>
+      <w:pPr>
+        <w:pStyle w:val="ListParagraph"/>
+        <w:numPr>
+          <w:ilvl w:val="0"/>
+          <w:numId w:val="5"/>
+        </w:numPr>
+        <w:spacing w:after="80"/>
+      </w:pPr>
+      <w:r>
+        <w:t xml:space="preserve">Entre a </w:t>
+      </w:r>
+      <w:r>
+        <w:rPr>
+          <w:b/>
+          <w:bCs/>
+        </w:rPr>
+        <w:t xml:space="preserve">💬 Conversaciones</w:t>
+      </w:r>
+      <w:r>
+        <w:t xml:space="preserve"> y haga clic en el chat del paciente.</w:t>
+      </w:r>
+    </w:p>
+    <w:p>
+      <w:pPr>
+        <w:pStyle w:val="ListParagraph"/>
+        <w:numPr>
+          <w:ilvl w:val="0"/>
+          <w:numId w:val="5"/>
+        </w:numPr>
+        <w:spacing w:after="80"/>
+      </w:pPr>
+      <w:r>
+        <w:t xml:space="preserve">Lea el historial: arriba aparece el </w:t>
+      </w:r>
+      <w:r>
+        <w:rPr>
+          <w:b/>
+          <w:bCs/>
+        </w:rPr>
+        <w:t xml:space="preserve">motivo de derivación</w:t>
+      </w:r>
+      <w:r>
+        <w:t xml:space="preserve">.</w:t>
+      </w:r>
+    </w:p>
+    <w:p>
+      <w:pPr>
+        <w:pStyle w:val="ListParagraph"/>
+        <w:numPr>
+          <w:ilvl w:val="0"/>
+          <w:numId w:val="5"/>
+        </w:numPr>
+        <w:spacing w:after="80"/>
+      </w:pPr>
+      <w:r>
+        <w:t xml:space="preserve">Escriba su respuesta en </w:t>
+      </w:r>
+      <w:r>
+        <w:rPr>
+          <w:b/>
+          <w:bCs/>
+        </w:rPr>
+        <w:t xml:space="preserve">«Responder como recepción…»</w:t>
+      </w:r>
+      <w:r>
+        <w:t xml:space="preserve"> y pulse </w:t>
+      </w:r>
+      <w:r>
+        <w:rPr>
+          <w:b/>
+          <w:bCs/>
+        </w:rPr>
+        <w:t xml:space="preserve">Enviar</w:t>
+      </w:r>
+      <w:r>
+        <w:t xml:space="preserve">. El mensaje le llega al paciente por WhatsApp desde el número del centro.</w:t>
+      </w:r>
+    </w:p>
+    <w:p>
+      <w:pPr>
+        <w:pStyle w:val="ListParagraph"/>
+        <w:numPr>
+          <w:ilvl w:val="0"/>
+          <w:numId w:val="5"/>
+        </w:numPr>
+        <w:spacing w:after="80"/>
+      </w:pPr>
+      <w:r>
+        <w:t xml:space="preserve">Mientras usted atiende, </w:t>
+      </w:r>
+      <w:r>
+        <w:rPr>
+          <w:b/>
+          <w:bCs/>
+        </w:rPr>
+        <w:t xml:space="preserve">Gia no interviene</w:t>
+      </w:r>
+      <w:r>
+        <w:t xml:space="preserve"> en ese chat.</w:t>
+      </w:r>
+    </w:p>
+    <w:p>
+      <w:pPr>
+        <w:pStyle w:val="ListParagraph"/>
+        <w:numPr>
+          <w:ilvl w:val="0"/>
+          <w:numId w:val="5"/>
+        </w:numPr>
+        <w:spacing w:after="80"/>
+      </w:pPr>
+      <w:r>
+        <w:t xml:space="preserve">Cuando termine, pulse </w:t>
+      </w:r>
+      <w:r>
+        <w:rPr>
+          <w:b/>
+          <w:bCs/>
+        </w:rPr>
+        <w:t xml:space="preserve">«Devolver al agente»</w:t>
+      </w:r>
+      <w:r>
+        <w:t xml:space="preserve"> para que Gia vuelva a atender a ese paciente.</w:t>
+      </w:r>
+    </w:p>
     <w:p>
       <w:pPr>
         <w:spacing w:after="60" w:before="120"/>
@@ -2123,7 +2146,7 @@
           <wp:inline distT="0" distB="0" distL="0" distR="0">
             <wp:extent cx="5715000" cy="3571875"/>
             <wp:effectExtent t="0" r="0" b="0" l="0"/>
-            <wp:docPr id="1" name="04-calendario" descr="Calendario semanal con citas y un horario bloqueado (jueves)." title="Calendario semanal con citas y un horario bloqueado (jueves)."/>
+            <wp:docPr id="1" name="09-conversacion" descr="Conversación en espera de recepción: arriba el motivo, abajo el cuadro para responder y, a la derecha, «Devolver al agente»." title="Conversación en espera de recepción: arriba el motivo, abajo el cuadro para responder y, a la derecha, «Devolver al agente»."/>
             <wp:cNvGraphicFramePr>
               <a:graphicFrameLocks xmlns:a="http://schemas.openxmlformats.org/drawingml/2006/main" noChangeAspect="1"/>
             </wp:cNvGraphicFramePr>
@@ -2172,7 +2195,7 @@
           <w:sz w:val="18"/>
           <w:szCs w:val="18"/>
         </w:rPr>
-        <w:t xml:space="preserve">Figura 5. Calendario semanal con citas y un horario bloqueado (jueves).</w:t>
+        <w:t xml:space="preserve">Figura 5. Conversación en espera de recepción: arriba el motivo, abajo el cuadro para responder y, a la derecha, «Devolver al agente».</w:t>
       </w:r>
     </w:p>
     <w:p>
@@ -2181,17 +2204,177 @@
         <w:spacing w:after="120" w:before="240"/>
       </w:pPr>
       <w:r>
-        <w:t xml:space="preserve">Crear una cita (paciente que llama o llega en persona)</w:t>
-      </w:r>
-    </w:p>
-    <w:p>
-      <w:pPr>
-        <w:pStyle w:val="ListParagraph"/>
-        <w:numPr>
-          <w:ilvl w:val="0"/>
-          <w:numId w:val="5"/>
-        </w:numPr>
-        <w:spacing w:after="80"/>
+        <w:t xml:space="preserve">Tomar una conversación que atiende Gia</w:t>
+      </w:r>
+    </w:p>
+    <w:p>
+      <w:pPr>
+        <w:spacing w:after="120"/>
+      </w:pPr>
+      <w:r>
+        <w:t xml:space="preserve">Si ve un chat donde conviene intervenir, ábralo y pulse </w:t>
+      </w:r>
+      <w:r>
+        <w:rPr>
+          <w:b/>
+          <w:bCs/>
+        </w:rPr>
+        <w:t xml:space="preserve">«Tomar conversación»</w:t>
+      </w:r>
+      <w:r>
+        <w:t xml:space="preserve">. Gia se calla en ese chat hasta que usted lo devuelva.</w:t>
+      </w:r>
+    </w:p>
+    <w:tbl>
+      <w:tblPr>
+        <w:tblW w:type="dxa" w:w="9026"/>
+        <w:tblBorders>
+          <w:top w:val="single" w:color="auto" w:sz="4"/>
+          <w:left w:val="single" w:color="auto" w:sz="4"/>
+          <w:bottom w:val="single" w:color="auto" w:sz="4"/>
+          <w:right w:val="single" w:color="auto" w:sz="4"/>
+          <w:insideH w:val="single" w:color="auto" w:sz="4"/>
+          <w:insideV w:val="single" w:color="auto" w:sz="4"/>
+        </w:tblBorders>
+      </w:tblPr>
+      <w:tblGrid>
+        <w:gridCol w:w="9026"/>
+      </w:tblGrid>
+      <w:tr>
+        <w:tc>
+          <w:tcPr>
+            <w:tcW w:type="dxa" w:w="9026"/>
+            <w:tcBorders>
+              <w:top w:val="none" w:color="FFFFFF" w:sz="0"/>
+              <w:left w:val="single" w:color="0B5E7E" w:sz="24"/>
+              <w:bottom w:val="none" w:color="FFFFFF" w:sz="0"/>
+              <w:right w:val="none" w:color="FFFFFF" w:sz="0"/>
+            </w:tcBorders>
+            <w:shd w:fill="EEF6F9" w:color="auto" w:val="clear"/>
+            <w:tcMar>
+              <w:top w:type="dxa" w:w="120"/>
+              <w:left w:type="dxa" w:w="200"/>
+              <w:bottom w:type="dxa" w:w="120"/>
+              <w:right w:type="dxa" w:w="200"/>
+            </w:tcMar>
+          </w:tcPr>
+          <w:p>
+            <w:pPr>
+              <w:spacing w:after="80"/>
+            </w:pPr>
+            <w:r>
+              <w:rPr>
+                <w:b/>
+                <w:bCs/>
+                <w:color w:val="0B5E7E"/>
+              </w:rPr>
+              <w:t xml:space="preserve">Tenga en cuenta</w:t>
+            </w:r>
+          </w:p>
+          <w:p>
+            <w:pPr>
+              <w:spacing w:after="60"/>
+            </w:pPr>
+            <w:r>
+              <w:rPr>
+                <w:b/>
+                <w:bCs/>
+              </w:rPr>
+              <w:t xml:space="preserve">Regla de WhatsApp:</w:t>
+            </w:r>
+            <w:r>
+              <w:t xml:space="preserve"> solo se puede responder a un paciente </w:t>
+            </w:r>
+            <w:r>
+              <w:rPr>
+                <w:b/>
+                <w:bCs/>
+              </w:rPr>
+              <w:t xml:space="preserve">dentro de las 24 horas</w:t>
+            </w:r>
+            <w:r>
+              <w:t xml:space="preserve"> desde su último mensaje. Pasado ese tiempo, el paciente debe volver a escribir.</w:t>
+            </w:r>
+          </w:p>
+          <w:p>
+            <w:pPr>
+              <w:spacing w:after="60"/>
+            </w:pPr>
+            <w:r>
+              <w:t xml:space="preserve">Si nadie responde en el chat, Gia </w:t>
+            </w:r>
+            <w:r>
+              <w:rPr>
+                <w:b/>
+                <w:bCs/>
+              </w:rPr>
+              <w:t xml:space="preserve">vuelve a atender sola</w:t>
+            </w:r>
+            <w:r>
+              <w:t xml:space="preserve"> después de unas horas.</w:t>
+            </w:r>
+          </w:p>
+          <w:p>
+            <w:pPr>
+              <w:spacing w:after="60"/>
+            </w:pPr>
+            <w:r>
+              <w:t xml:space="preserve">El paciente puede escribir </w:t>
+            </w:r>
+            <w:r>
+              <w:rPr>
+                <w:b/>
+                <w:bCs/>
+              </w:rPr>
+              <w:t xml:space="preserve">«menú»</w:t>
+            </w:r>
+            <w:r>
+              <w:t xml:space="preserve"> en cualquier momento para volver a hablar con Gia.</w:t>
+            </w:r>
+          </w:p>
+          <w:p>
+            <w:pPr>
+              <w:spacing w:after="60"/>
+            </w:pPr>
+            <w:r>
+              <w:t xml:space="preserve">Todas las conversaciones se atienden </w:t>
+            </w:r>
+            <w:r>
+              <w:rPr>
+                <w:b/>
+                <w:bCs/>
+              </w:rPr>
+              <w:t xml:space="preserve">desde el panel</w:t>
+            </w:r>
+            <w:r>
+              <w:t xml:space="preserve">: así queda </w:t>
+            </w:r>
+            <w:r>
+              <w:rPr>
+                <w:b/>
+                <w:bCs/>
+              </w:rPr>
+              <w:t xml:space="preserve">registro</w:t>
+            </w:r>
+            <w:r>
+              <w:t xml:space="preserve"> de lo que se habló con cada paciente.</w:t>
+            </w:r>
+          </w:p>
+        </w:tc>
+      </w:tr>
+    </w:tbl>
+    <w:p>
+      <w:pPr>
+        <w:pStyle w:val="Heading1"/>
+        <w:spacing w:after="160" w:before="360"/>
+      </w:pPr>
+      <w:r>
+        <w:t xml:space="preserve">5. Calendario y citas</w:t>
+      </w:r>
+    </w:p>
+    <w:p>
+      <w:pPr>
+        <w:spacing w:after="120"/>
       </w:pPr>
       <w:r>
         <w:t xml:space="preserve">En </w:t>
@@ -2204,131 +2387,323 @@
         <w:t xml:space="preserve">📅 Calendario</w:t>
       </w:r>
       <w:r>
-        <w:t xml:space="preserve"> pulse </w:t>
-      </w:r>
-      <w:r>
-        <w:rPr>
-          <w:b/>
-          <w:bCs/>
-        </w:rPr>
-        <w:t xml:space="preserve">＋ Nueva cita</w:t>
-      </w:r>
-      <w:r>
-        <w:t xml:space="preserve">.</w:t>
-      </w:r>
-    </w:p>
-    <w:p>
-      <w:pPr>
-        <w:pStyle w:val="ListParagraph"/>
-        <w:numPr>
-          <w:ilvl w:val="0"/>
-          <w:numId w:val="5"/>
-        </w:numPr>
-        <w:spacing w:after="80"/>
-      </w:pPr>
-      <w:r>
-        <w:t xml:space="preserve">Elija el </w:t>
-      </w:r>
-      <w:r>
-        <w:rPr>
-          <w:b/>
-          <w:bCs/>
-        </w:rPr>
-        <w:t xml:space="preserve">médico y especialidad</w:t>
-      </w:r>
-      <w:r>
-        <w:t xml:space="preserve">.</w:t>
-      </w:r>
-    </w:p>
-    <w:p>
-      <w:pPr>
-        <w:pStyle w:val="ListParagraph"/>
-        <w:numPr>
-          <w:ilvl w:val="0"/>
-          <w:numId w:val="5"/>
-        </w:numPr>
-        <w:spacing w:after="80"/>
-      </w:pPr>
-      <w:r>
-        <w:t xml:space="preserve">Elija la </w:t>
-      </w:r>
-      <w:r>
-        <w:rPr>
-          <w:b/>
-          <w:bCs/>
-        </w:rPr>
-        <w:t xml:space="preserve">fecha</w:t>
-      </w:r>
-      <w:r>
-        <w:t xml:space="preserve">. En </w:t>
-      </w:r>
-      <w:r>
-        <w:rPr>
-          <w:b/>
-          <w:bCs/>
-        </w:rPr>
-        <w:t xml:space="preserve">«Hora disponible»</w:t>
-      </w:r>
-      <w:r>
-        <w:t xml:space="preserve"> solo aparecen horas libres, así nunca choca con lo que agenda Gia.</w:t>
-      </w:r>
-    </w:p>
-    <w:p>
-      <w:pPr>
-        <w:pStyle w:val="ListParagraph"/>
-        <w:numPr>
-          <w:ilvl w:val="0"/>
-          <w:numId w:val="5"/>
-        </w:numPr>
-        <w:spacing w:after="80"/>
-      </w:pPr>
-      <w:r>
-        <w:t xml:space="preserve">Escriba el </w:t>
-      </w:r>
-      <w:r>
-        <w:rPr>
-          <w:b/>
-          <w:bCs/>
-        </w:rPr>
-        <w:t xml:space="preserve">WhatsApp del paciente</w:t>
-      </w:r>
-      <w:r>
-        <w:t xml:space="preserve"> (por ejemplo 099 123 4567) y su </w:t>
-      </w:r>
-      <w:r>
-        <w:rPr>
-          <w:b/>
-          <w:bCs/>
-        </w:rPr>
-        <w:t xml:space="preserve">nombre completo</w:t>
-      </w:r>
-      <w:r>
-        <w:t xml:space="preserve">.</w:t>
-      </w:r>
-    </w:p>
-    <w:p>
-      <w:pPr>
-        <w:pStyle w:val="ListParagraph"/>
-        <w:numPr>
-          <w:ilvl w:val="0"/>
-          <w:numId w:val="5"/>
-        </w:numPr>
-        <w:spacing w:after="80"/>
-      </w:pPr>
-      <w:r>
-        <w:t xml:space="preserve">Pulse </w:t>
-      </w:r>
-      <w:r>
-        <w:rPr>
-          <w:b/>
-          <w:bCs/>
-        </w:rPr>
-        <w:t xml:space="preserve">Crear cita</w:t>
-      </w:r>
-      <w:r>
-        <w:t xml:space="preserve">.</w:t>
-      </w:r>
-    </w:p>
+        <w:t xml:space="preserve"> ve la semana completa. Use </w:t>
+      </w:r>
+      <w:r>
+        <w:rPr>
+          <w:b/>
+          <w:bCs/>
+        </w:rPr>
+        <w:t xml:space="preserve">◀ ▶</w:t>
+      </w:r>
+      <w:r>
+        <w:t xml:space="preserve"> para cambiar de semana, </w:t>
+      </w:r>
+      <w:r>
+        <w:rPr>
+          <w:b/>
+          <w:bCs/>
+        </w:rPr>
+        <w:t xml:space="preserve">Hoy</w:t>
+      </w:r>
+      <w:r>
+        <w:t xml:space="preserve"> para volver a la semana actual y el selector </w:t>
+      </w:r>
+      <w:r>
+        <w:rPr>
+          <w:b/>
+          <w:bCs/>
+        </w:rPr>
+        <w:t xml:space="preserve">«Todos los médicos»</w:t>
+      </w:r>
+      <w:r>
+        <w:t xml:space="preserve"> para ver la agenda de uno solo.</w:t>
+      </w:r>
+    </w:p>
+    <w:tbl>
+      <w:tblPr>
+        <w:tblW w:type="dxa" w:w="9026"/>
+        <w:tblBorders>
+          <w:top w:val="single" w:color="auto" w:sz="4"/>
+          <w:left w:val="single" w:color="auto" w:sz="4"/>
+          <w:bottom w:val="single" w:color="auto" w:sz="4"/>
+          <w:right w:val="single" w:color="auto" w:sz="4"/>
+          <w:insideH w:val="single" w:color="auto" w:sz="4"/>
+          <w:insideV w:val="single" w:color="auto" w:sz="4"/>
+        </w:tblBorders>
+      </w:tblPr>
+      <w:tblGrid>
+        <w:gridCol w:w="3200"/>
+        <w:gridCol w:w="5826"/>
+      </w:tblGrid>
+      <w:tr>
+        <w:trPr>
+          <w:tblHeader/>
+        </w:trPr>
+        <w:tc>
+          <w:tcPr>
+            <w:tcW w:type="dxa" w:w="3200"/>
+            <w:shd w:fill="0B5E7E" w:color="auto" w:val="clear"/>
+            <w:tcMar>
+              <w:top w:type="dxa" w:w="80"/>
+              <w:left w:type="dxa" w:w="120"/>
+              <w:bottom w:type="dxa" w:w="80"/>
+              <w:right w:type="dxa" w:w="120"/>
+            </w:tcMar>
+          </w:tcPr>
+          <w:p>
+            <w:r>
+              <w:rPr>
+                <w:b/>
+                <w:bCs/>
+                <w:color w:val="FFFFFF"/>
+              </w:rPr>
+              <w:t xml:space="preserve">En el calendario</w:t>
+            </w:r>
+          </w:p>
+        </w:tc>
+        <w:tc>
+          <w:tcPr>
+            <w:tcW w:type="dxa" w:w="5826"/>
+            <w:shd w:fill="0B5E7E" w:color="auto" w:val="clear"/>
+            <w:tcMar>
+              <w:top w:type="dxa" w:w="80"/>
+              <w:left w:type="dxa" w:w="120"/>
+              <w:bottom w:type="dxa" w:w="80"/>
+              <w:right w:type="dxa" w:w="120"/>
+            </w:tcMar>
+          </w:tcPr>
+          <w:p>
+            <w:r>
+              <w:rPr>
+                <w:b/>
+                <w:bCs/>
+                <w:color w:val="FFFFFF"/>
+              </w:rPr>
+              <w:t xml:space="preserve">Significa</w:t>
+            </w:r>
+          </w:p>
+        </w:tc>
+      </w:tr>
+      <w:tr>
+        <w:tc>
+          <w:tcPr>
+            <w:tcW w:type="dxa" w:w="3200"/>
+            <w:tcMar>
+              <w:top w:type="dxa" w:w="80"/>
+              <w:left w:type="dxa" w:w="120"/>
+              <w:bottom w:type="dxa" w:w="80"/>
+              <w:right w:type="dxa" w:w="120"/>
+            </w:tcMar>
+          </w:tcPr>
+          <w:p>
+            <w:r>
+              <w:t xml:space="preserve">Cuadro azul</w:t>
+            </w:r>
+          </w:p>
+        </w:tc>
+        <w:tc>
+          <w:tcPr>
+            <w:tcW w:type="dxa" w:w="5826"/>
+            <w:tcMar>
+              <w:top w:type="dxa" w:w="80"/>
+              <w:left w:type="dxa" w:w="120"/>
+              <w:bottom w:type="dxa" w:w="80"/>
+              <w:right w:type="dxa" w:w="120"/>
+            </w:tcMar>
+          </w:tcPr>
+          <w:p>
+            <w:r>
+              <w:t xml:space="preserve">Cita programada.</w:t>
+            </w:r>
+          </w:p>
+        </w:tc>
+      </w:tr>
+      <w:tr>
+        <w:tc>
+          <w:tcPr>
+            <w:tcW w:type="dxa" w:w="3200"/>
+            <w:tcMar>
+              <w:top w:type="dxa" w:w="80"/>
+              <w:left w:type="dxa" w:w="120"/>
+              <w:bottom w:type="dxa" w:w="80"/>
+              <w:right w:type="dxa" w:w="120"/>
+            </w:tcMar>
+          </w:tcPr>
+          <w:p>
+            <w:r>
+              <w:rPr>
+                <w:b/>
+                <w:bCs/>
+              </w:rPr>
+              <w:t xml:space="preserve">✔</w:t>
+            </w:r>
+            <w:r>
+              <w:t xml:space="preserve"> junto a la hora</w:t>
+            </w:r>
+          </w:p>
+        </w:tc>
+        <w:tc>
+          <w:tcPr>
+            <w:tcW w:type="dxa" w:w="5826"/>
+            <w:tcMar>
+              <w:top w:type="dxa" w:w="80"/>
+              <w:left w:type="dxa" w:w="120"/>
+              <w:bottom w:type="dxa" w:w="80"/>
+              <w:right w:type="dxa" w:w="120"/>
+            </w:tcMar>
+          </w:tcPr>
+          <w:p>
+            <w:r>
+              <w:t xml:space="preserve">El paciente confirmó su asistencia.</w:t>
+            </w:r>
+          </w:p>
+        </w:tc>
+      </w:tr>
+      <w:tr>
+        <w:tc>
+          <w:tcPr>
+            <w:tcW w:type="dxa" w:w="3200"/>
+            <w:tcMar>
+              <w:top w:type="dxa" w:w="80"/>
+              <w:left w:type="dxa" w:w="120"/>
+              <w:bottom w:type="dxa" w:w="80"/>
+              <w:right w:type="dxa" w:w="120"/>
+            </w:tcMar>
+          </w:tcPr>
+          <w:p>
+            <w:r>
+              <w:t xml:space="preserve">Cuadro verde</w:t>
+            </w:r>
+          </w:p>
+        </w:tc>
+        <w:tc>
+          <w:tcPr>
+            <w:tcW w:type="dxa" w:w="5826"/>
+            <w:tcMar>
+              <w:top w:type="dxa" w:w="80"/>
+              <w:left w:type="dxa" w:w="120"/>
+              <w:bottom w:type="dxa" w:w="80"/>
+              <w:right w:type="dxa" w:w="120"/>
+            </w:tcMar>
+          </w:tcPr>
+          <w:p>
+            <w:r>
+              <w:t xml:space="preserve">Cita atendida.</w:t>
+            </w:r>
+          </w:p>
+        </w:tc>
+      </w:tr>
+      <w:tr>
+        <w:tc>
+          <w:tcPr>
+            <w:tcW w:type="dxa" w:w="3200"/>
+            <w:tcMar>
+              <w:top w:type="dxa" w:w="80"/>
+              <w:left w:type="dxa" w:w="120"/>
+              <w:bottom w:type="dxa" w:w="80"/>
+              <w:right w:type="dxa" w:w="120"/>
+            </w:tcMar>
+          </w:tcPr>
+          <w:p>
+            <w:r>
+              <w:t xml:space="preserve">Cuadro amarillo</w:t>
+            </w:r>
+          </w:p>
+        </w:tc>
+        <w:tc>
+          <w:tcPr>
+            <w:tcW w:type="dxa" w:w="5826"/>
+            <w:tcMar>
+              <w:top w:type="dxa" w:w="80"/>
+              <w:left w:type="dxa" w:w="120"/>
+              <w:bottom w:type="dxa" w:w="80"/>
+              <w:right w:type="dxa" w:w="120"/>
+            </w:tcMar>
+          </w:tcPr>
+          <w:p>
+            <w:r>
+              <w:t xml:space="preserve">El paciente no asistió.</w:t>
+            </w:r>
+          </w:p>
+        </w:tc>
+      </w:tr>
+      <w:tr>
+        <w:tc>
+          <w:tcPr>
+            <w:tcW w:type="dxa" w:w="3200"/>
+            <w:tcMar>
+              <w:top w:type="dxa" w:w="80"/>
+              <w:left w:type="dxa" w:w="120"/>
+              <w:bottom w:type="dxa" w:w="80"/>
+              <w:right w:type="dxa" w:w="120"/>
+            </w:tcMar>
+          </w:tcPr>
+          <w:p>
+            <w:r>
+              <w:t xml:space="preserve">Texto tachado</w:t>
+            </w:r>
+          </w:p>
+        </w:tc>
+        <w:tc>
+          <w:tcPr>
+            <w:tcW w:type="dxa" w:w="5826"/>
+            <w:tcMar>
+              <w:top w:type="dxa" w:w="80"/>
+              <w:left w:type="dxa" w:w="120"/>
+              <w:bottom w:type="dxa" w:w="80"/>
+              <w:right w:type="dxa" w:w="120"/>
+            </w:tcMar>
+          </w:tcPr>
+          <w:p>
+            <w:r>
+              <w:t xml:space="preserve">Cita cancelada.</w:t>
+            </w:r>
+          </w:p>
+        </w:tc>
+      </w:tr>
+      <w:tr>
+        <w:tc>
+          <w:tcPr>
+            <w:tcW w:type="dxa" w:w="3200"/>
+            <w:tcMar>
+              <w:top w:type="dxa" w:w="80"/>
+              <w:left w:type="dxa" w:w="120"/>
+              <w:bottom w:type="dxa" w:w="80"/>
+              <w:right w:type="dxa" w:w="120"/>
+            </w:tcMar>
+          </w:tcPr>
+          <w:p>
+            <w:r>
+              <w:t xml:space="preserve">Cuadro rayado gris con </w:t>
+            </w:r>
+            <w:r>
+              <w:rPr>
+                <w:b/>
+                <w:bCs/>
+              </w:rPr>
+              <w:t xml:space="preserve">⛔</w:t>
+            </w:r>
+          </w:p>
+        </w:tc>
+        <w:tc>
+          <w:tcPr>
+            <w:tcW w:type="dxa" w:w="5826"/>
+            <w:tcMar>
+              <w:top w:type="dxa" w:w="80"/>
+              <w:left w:type="dxa" w:w="120"/>
+              <w:bottom w:type="dxa" w:w="80"/>
+              <w:right w:type="dxa" w:w="120"/>
+            </w:tcMar>
+          </w:tcPr>
+          <w:p>
+            <w:r>
+              <w:t xml:space="preserve">Horario bloqueado (no se ofrece a pacientes).</w:t>
+            </w:r>
+          </w:p>
+        </w:tc>
+      </w:tr>
+    </w:tbl>
     <w:p>
       <w:pPr>
         <w:spacing w:after="60" w:before="120"/>
@@ -2337,9 +2712,9 @@
       <w:r>
         <w:drawing>
           <wp:inline distT="0" distB="0" distL="0" distR="0">
-            <wp:extent cx="4000500" cy="3133725"/>
+            <wp:extent cx="5715000" cy="3571875"/>
             <wp:effectExtent t="0" r="0" b="0" l="0"/>
-            <wp:docPr id="1" name="05-nueva-cita" descr="Ventana «Nueva cita»: solo se ofrecen horas disponibles." title="Ventana «Nueva cita»: solo se ofrecen horas disponibles."/>
+            <wp:docPr id="1" name="04-calendario" descr="Calendario semanal con citas y un horario bloqueado (jueves)." title="Calendario semanal con citas y un horario bloqueado (jueves)."/>
             <wp:cNvGraphicFramePr>
               <a:graphicFrameLocks xmlns:a="http://schemas.openxmlformats.org/drawingml/2006/main" noChangeAspect="1"/>
             </wp:cNvGraphicFramePr>
@@ -2362,7 +2737,7 @@
                   <pic:spPr bwMode="auto">
                     <a:xfrm>
                       <a:off x="0" y="0"/>
-                      <a:ext cx="4000500" cy="3133725"/>
+                      <a:ext cx="5715000" cy="3571875"/>
                     </a:xfrm>
                     <a:prstGeom prst="rect">
                       <a:avLst/>
@@ -2388,7 +2763,16 @@
           <w:sz w:val="18"/>
           <w:szCs w:val="18"/>
         </w:rPr>
-        <w:t xml:space="preserve">Figura 6. Ventana «Nueva cita»: solo se ofrecen horas disponibles.</w:t>
+        <w:t xml:space="preserve">Figura 6. Calendario semanal con citas y un horario bloqueado (jueves).</w:t>
+      </w:r>
+    </w:p>
+    <w:p>
+      <w:pPr>
+        <w:pStyle w:val="Heading2"/>
+        <w:spacing w:after="120" w:before="240"/>
+      </w:pPr>
+      <w:r>
+        <w:t xml:space="preserve">Crear una cita (paciente que llama o llega en persona)</w:t>
       </w:r>
     </w:p>
     <w:p>
@@ -2396,32 +2780,32 @@
         <w:pStyle w:val="ListParagraph"/>
         <w:numPr>
           <w:ilvl w:val="0"/>
-          <w:numId w:val="2"/>
+          <w:numId w:val="6"/>
         </w:numPr>
         <w:spacing w:after="80"/>
       </w:pPr>
       <w:r>
-        <w:t xml:space="preserve">Si ese número ya tiene un paciente con </w:t>
-      </w:r>
-      <w:r>
-        <w:rPr>
-          <w:b/>
-          <w:bCs/>
-        </w:rPr>
-        <w:t xml:space="preserve">otro nombre</w:t>
-      </w:r>
-      <w:r>
-        <w:t xml:space="preserve">, la persona se registra como </w:t>
-      </w:r>
-      <w:r>
-        <w:rPr>
-          <w:b/>
-          <w:bCs/>
-        </w:rPr>
-        <w:t xml:space="preserve">familiar</w:t>
-      </w:r>
-      <w:r>
-        <w:t xml:space="preserve"> del titular (por ejemplo, un hijo).</w:t>
+        <w:t xml:space="preserve">En </w:t>
+      </w:r>
+      <w:r>
+        <w:rPr>
+          <w:b/>
+          <w:bCs/>
+        </w:rPr>
+        <w:t xml:space="preserve">📅 Calendario</w:t>
+      </w:r>
+      <w:r>
+        <w:t xml:space="preserve"> pulse </w:t>
+      </w:r>
+      <w:r>
+        <w:rPr>
+          <w:b/>
+          <w:bCs/>
+        </w:rPr>
+        <w:t xml:space="preserve">＋ Nueva cita</w:t>
+      </w:r>
+      <w:r>
+        <w:t xml:space="preserve">.</w:t>
       </w:r>
     </w:p>
     <w:p>
@@ -2429,22 +2813,22 @@
         <w:pStyle w:val="ListParagraph"/>
         <w:numPr>
           <w:ilvl w:val="0"/>
-          <w:numId w:val="2"/>
+          <w:numId w:val="6"/>
         </w:numPr>
         <w:spacing w:after="80"/>
       </w:pPr>
       <w:r>
-        <w:t xml:space="preserve">Si el paciente es nuevo, su </w:t>
-      </w:r>
-      <w:r>
-        <w:rPr>
-          <w:b/>
-          <w:bCs/>
-        </w:rPr>
-        <w:t xml:space="preserve">autorización de datos queda pendiente</w:t>
-      </w:r>
-      <w:r>
-        <w:t xml:space="preserve"> hasta que la acepte por WhatsApp.</w:t>
+        <w:t xml:space="preserve">Elija el </w:t>
+      </w:r>
+      <w:r>
+        <w:rPr>
+          <w:b/>
+          <w:bCs/>
+        </w:rPr>
+        <w:t xml:space="preserve">médico y especialidad</w:t>
+      </w:r>
+      <w:r>
+        <w:t xml:space="preserve">.</w:t>
       </w:r>
     </w:p>
     <w:p>
@@ -2452,39 +2836,88 @@
         <w:pStyle w:val="ListParagraph"/>
         <w:numPr>
           <w:ilvl w:val="0"/>
-          <w:numId w:val="2"/>
+          <w:numId w:val="6"/>
         </w:numPr>
         <w:spacing w:after="80"/>
       </w:pPr>
       <w:r>
-        <w:t xml:space="preserve">El paciente recibirá el </w:t>
-      </w:r>
-      <w:r>
-        <w:rPr>
-          <w:b/>
-          <w:bCs/>
-        </w:rPr>
-        <w:t xml:space="preserve">recordatorio</w:t>
-      </w:r>
-      <w:r>
-        <w:t xml:space="preserve"> por WhatsApp igual que las citas hechas por Gia.</w:t>
-      </w:r>
-    </w:p>
-    <w:p>
-      <w:pPr>
-        <w:pStyle w:val="Heading2"/>
-        <w:spacing w:after="120" w:before="240"/>
-      </w:pPr>
-      <w:r>
-        <w:t xml:space="preserve">Gestionar una cita existente</w:t>
-      </w:r>
-    </w:p>
-    <w:p>
-      <w:pPr>
-        <w:spacing w:after="120"/>
-      </w:pPr>
-      <w:r>
-        <w:t xml:space="preserve">Haga clic sobre la cita en el calendario. Se abre una ventana con estas opciones:</w:t>
+        <w:t xml:space="preserve">Elija la </w:t>
+      </w:r>
+      <w:r>
+        <w:rPr>
+          <w:b/>
+          <w:bCs/>
+        </w:rPr>
+        <w:t xml:space="preserve">fecha</w:t>
+      </w:r>
+      <w:r>
+        <w:t xml:space="preserve">. En </w:t>
+      </w:r>
+      <w:r>
+        <w:rPr>
+          <w:b/>
+          <w:bCs/>
+        </w:rPr>
+        <w:t xml:space="preserve">«Hora disponible»</w:t>
+      </w:r>
+      <w:r>
+        <w:t xml:space="preserve"> solo aparecen horas libres, así nunca choca con lo que agenda Gia.</w:t>
+      </w:r>
+    </w:p>
+    <w:p>
+      <w:pPr>
+        <w:pStyle w:val="ListParagraph"/>
+        <w:numPr>
+          <w:ilvl w:val="0"/>
+          <w:numId w:val="6"/>
+        </w:numPr>
+        <w:spacing w:after="80"/>
+      </w:pPr>
+      <w:r>
+        <w:t xml:space="preserve">Escriba el </w:t>
+      </w:r>
+      <w:r>
+        <w:rPr>
+          <w:b/>
+          <w:bCs/>
+        </w:rPr>
+        <w:t xml:space="preserve">WhatsApp del paciente</w:t>
+      </w:r>
+      <w:r>
+        <w:t xml:space="preserve"> (por ejemplo 099 123 4567) y su </w:t>
+      </w:r>
+      <w:r>
+        <w:rPr>
+          <w:b/>
+          <w:bCs/>
+        </w:rPr>
+        <w:t xml:space="preserve">nombre completo</w:t>
+      </w:r>
+      <w:r>
+        <w:t xml:space="preserve">.</w:t>
+      </w:r>
+    </w:p>
+    <w:p>
+      <w:pPr>
+        <w:pStyle w:val="ListParagraph"/>
+        <w:numPr>
+          <w:ilvl w:val="0"/>
+          <w:numId w:val="6"/>
+        </w:numPr>
+        <w:spacing w:after="80"/>
+      </w:pPr>
+      <w:r>
+        <w:t xml:space="preserve">Pulse </w:t>
+      </w:r>
+      <w:r>
+        <w:rPr>
+          <w:b/>
+          <w:bCs/>
+        </w:rPr>
+        <w:t xml:space="preserve">Crear cita</w:t>
+      </w:r>
+      <w:r>
+        <w:t xml:space="preserve">.</w:t>
       </w:r>
     </w:p>
     <w:p>
@@ -2495,9 +2928,9 @@
       <w:r>
         <w:drawing>
           <wp:inline distT="0" distB="0" distL="0" distR="0">
-            <wp:extent cx="4000500" cy="3200400"/>
+            <wp:extent cx="4000500" cy="3133725"/>
             <wp:effectExtent t="0" r="0" b="0" l="0"/>
-            <wp:docPr id="1" name="06-cita" descr="Ventana de una cita: reagendar, confirmar, marcar atendida, no asistió o cancelar." title="Ventana de una cita: reagendar, confirmar, marcar atendida, no asistió o cancelar."/>
+            <wp:docPr id="1" name="05-nueva-cita" descr="Ventana «Nueva cita»: solo se ofrecen horas disponibles." title="Ventana «Nueva cita»: solo se ofrecen horas disponibles."/>
             <wp:cNvGraphicFramePr>
               <a:graphicFrameLocks xmlns:a="http://schemas.openxmlformats.org/drawingml/2006/main" noChangeAspect="1"/>
             </wp:cNvGraphicFramePr>
@@ -2520,7 +2953,7 @@
                   <pic:spPr bwMode="auto">
                     <a:xfrm>
                       <a:off x="0" y="0"/>
-                      <a:ext cx="4000500" cy="3200400"/>
+                      <a:ext cx="4000500" cy="3133725"/>
                     </a:xfrm>
                     <a:prstGeom prst="rect">
                       <a:avLst/>
@@ -2546,409 +2979,7 @@
           <w:sz w:val="18"/>
           <w:szCs w:val="18"/>
         </w:rPr>
-        <w:t xml:space="preserve">Figura 7. Ventana de una cita: reagendar, confirmar, marcar atendida, no asistió o cancelar.</w:t>
-      </w:r>
-    </w:p>
-    <w:tbl>
-      <w:tblPr>
-        <w:tblW w:type="dxa" w:w="9026"/>
-        <w:tblBorders>
-          <w:top w:val="single" w:color="auto" w:sz="4"/>
-          <w:left w:val="single" w:color="auto" w:sz="4"/>
-          <w:bottom w:val="single" w:color="auto" w:sz="4"/>
-          <w:right w:val="single" w:color="auto" w:sz="4"/>
-          <w:insideH w:val="single" w:color="auto" w:sz="4"/>
-          <w:insideV w:val="single" w:color="auto" w:sz="4"/>
-        </w:tblBorders>
-      </w:tblPr>
-      <w:tblGrid>
-        <w:gridCol w:w="3000"/>
-        <w:gridCol w:w="6026"/>
-      </w:tblGrid>
-      <w:tr>
-        <w:trPr>
-          <w:tblHeader/>
-        </w:trPr>
-        <w:tc>
-          <w:tcPr>
-            <w:tcW w:type="dxa" w:w="3000"/>
-            <w:shd w:fill="0B5E7E" w:color="auto" w:val="clear"/>
-            <w:tcMar>
-              <w:top w:type="dxa" w:w="80"/>
-              <w:left w:type="dxa" w:w="120"/>
-              <w:bottom w:type="dxa" w:w="80"/>
-              <w:right w:type="dxa" w:w="120"/>
-            </w:tcMar>
-          </w:tcPr>
-          <w:p>
-            <w:r>
-              <w:rPr>
-                <w:b/>
-                <w:bCs/>
-                <w:color w:val="FFFFFF"/>
-              </w:rPr>
-              <w:t xml:space="preserve">Botón</w:t>
-            </w:r>
-          </w:p>
-        </w:tc>
-        <w:tc>
-          <w:tcPr>
-            <w:tcW w:type="dxa" w:w="6026"/>
-            <w:shd w:fill="0B5E7E" w:color="auto" w:val="clear"/>
-            <w:tcMar>
-              <w:top w:type="dxa" w:w="80"/>
-              <w:left w:type="dxa" w:w="120"/>
-              <w:bottom w:type="dxa" w:w="80"/>
-              <w:right w:type="dxa" w:w="120"/>
-            </w:tcMar>
-          </w:tcPr>
-          <w:p>
-            <w:r>
-              <w:rPr>
-                <w:b/>
-                <w:bCs/>
-                <w:color w:val="FFFFFF"/>
-              </w:rPr>
-              <w:t xml:space="preserve">Cuándo usarlo</w:t>
-            </w:r>
-          </w:p>
-        </w:tc>
-      </w:tr>
-      <w:tr>
-        <w:tc>
-          <w:tcPr>
-            <w:tcW w:type="dxa" w:w="3000"/>
-            <w:tcMar>
-              <w:top w:type="dxa" w:w="80"/>
-              <w:left w:type="dxa" w:w="120"/>
-              <w:bottom w:type="dxa" w:w="80"/>
-              <w:right w:type="dxa" w:w="120"/>
-            </w:tcMar>
-          </w:tcPr>
-          <w:p>
-            <w:r>
-              <w:rPr>
-                <w:b/>
-                <w:bCs/>
-              </w:rPr>
-              <w:t xml:space="preserve">Reagendar → Mover</w:t>
-            </w:r>
-          </w:p>
-        </w:tc>
-        <w:tc>
-          <w:tcPr>
-            <w:tcW w:type="dxa" w:w="6026"/>
-            <w:tcMar>
-              <w:top w:type="dxa" w:w="80"/>
-              <w:left w:type="dxa" w:w="120"/>
-              <w:bottom w:type="dxa" w:w="80"/>
-              <w:right w:type="dxa" w:w="120"/>
-            </w:tcMar>
-          </w:tcPr>
-          <w:p>
-            <w:r>
-              <w:t xml:space="preserve">Elija nueva fecha y una hora disponible, y pulse Mover.</w:t>
-            </w:r>
-          </w:p>
-        </w:tc>
-      </w:tr>
-      <w:tr>
-        <w:tc>
-          <w:tcPr>
-            <w:tcW w:type="dxa" w:w="3000"/>
-            <w:tcMar>
-              <w:top w:type="dxa" w:w="80"/>
-              <w:left w:type="dxa" w:w="120"/>
-              <w:bottom w:type="dxa" w:w="80"/>
-              <w:right w:type="dxa" w:w="120"/>
-            </w:tcMar>
-          </w:tcPr>
-          <w:p>
-            <w:r>
-              <w:rPr>
-                <w:b/>
-                <w:bCs/>
-              </w:rPr>
-              <w:t xml:space="preserve">Marcar confirmada</w:t>
-            </w:r>
-          </w:p>
-        </w:tc>
-        <w:tc>
-          <w:tcPr>
-            <w:tcW w:type="dxa" w:w="6026"/>
-            <w:tcMar>
-              <w:top w:type="dxa" w:w="80"/>
-              <w:left w:type="dxa" w:w="120"/>
-              <w:bottom w:type="dxa" w:w="80"/>
-              <w:right w:type="dxa" w:w="120"/>
-            </w:tcMar>
-          </w:tcPr>
-          <w:p>
-            <w:r>
-              <w:t xml:space="preserve">El paciente confirmó por teléfono o en persona.</w:t>
-            </w:r>
-          </w:p>
-        </w:tc>
-      </w:tr>
-      <w:tr>
-        <w:tc>
-          <w:tcPr>
-            <w:tcW w:type="dxa" w:w="3000"/>
-            <w:tcMar>
-              <w:top w:type="dxa" w:w="80"/>
-              <w:left w:type="dxa" w:w="120"/>
-              <w:bottom w:type="dxa" w:w="80"/>
-              <w:right w:type="dxa" w:w="120"/>
-            </w:tcMar>
-          </w:tcPr>
-          <w:p>
-            <w:r>
-              <w:rPr>
-                <w:b/>
-                <w:bCs/>
-              </w:rPr>
-              <w:t xml:space="preserve">Atendida</w:t>
-            </w:r>
-          </w:p>
-        </w:tc>
-        <w:tc>
-          <w:tcPr>
-            <w:tcW w:type="dxa" w:w="6026"/>
-            <w:tcMar>
-              <w:top w:type="dxa" w:w="80"/>
-              <w:left w:type="dxa" w:w="120"/>
-              <w:bottom w:type="dxa" w:w="80"/>
-              <w:right w:type="dxa" w:w="120"/>
-            </w:tcMar>
-          </w:tcPr>
-          <w:p>
-            <w:r>
-              <w:t xml:space="preserve">El paciente ya fue atendido.</w:t>
-            </w:r>
-          </w:p>
-        </w:tc>
-      </w:tr>
-      <w:tr>
-        <w:tc>
-          <w:tcPr>
-            <w:tcW w:type="dxa" w:w="3000"/>
-            <w:tcMar>
-              <w:top w:type="dxa" w:w="80"/>
-              <w:left w:type="dxa" w:w="120"/>
-              <w:bottom w:type="dxa" w:w="80"/>
-              <w:right w:type="dxa" w:w="120"/>
-            </w:tcMar>
-          </w:tcPr>
-          <w:p>
-            <w:r>
-              <w:rPr>
-                <w:b/>
-                <w:bCs/>
-              </w:rPr>
-              <w:t xml:space="preserve">No asistió</w:t>
-            </w:r>
-          </w:p>
-        </w:tc>
-        <w:tc>
-          <w:tcPr>
-            <w:tcW w:type="dxa" w:w="6026"/>
-            <w:tcMar>
-              <w:top w:type="dxa" w:w="80"/>
-              <w:left w:type="dxa" w:w="120"/>
-              <w:bottom w:type="dxa" w:w="80"/>
-              <w:right w:type="dxa" w:w="120"/>
-            </w:tcMar>
-          </w:tcPr>
-          <w:p>
-            <w:r>
-              <w:t xml:space="preserve">El paciente no llegó.</w:t>
-            </w:r>
-          </w:p>
-        </w:tc>
-      </w:tr>
-      <w:tr>
-        <w:tc>
-          <w:tcPr>
-            <w:tcW w:type="dxa" w:w="3000"/>
-            <w:tcMar>
-              <w:top w:type="dxa" w:w="80"/>
-              <w:left w:type="dxa" w:w="120"/>
-              <w:bottom w:type="dxa" w:w="80"/>
-              <w:right w:type="dxa" w:w="120"/>
-            </w:tcMar>
-          </w:tcPr>
-          <w:p>
-            <w:r>
-              <w:rPr>
-                <w:b/>
-                <w:bCs/>
-              </w:rPr>
-              <w:t xml:space="preserve">Cancelar cita</w:t>
-            </w:r>
-          </w:p>
-        </w:tc>
-        <w:tc>
-          <w:tcPr>
-            <w:tcW w:type="dxa" w:w="6026"/>
-            <w:tcMar>
-              <w:top w:type="dxa" w:w="80"/>
-              <w:left w:type="dxa" w:w="120"/>
-              <w:bottom w:type="dxa" w:w="80"/>
-              <w:right w:type="dxa" w:w="120"/>
-            </w:tcMar>
-          </w:tcPr>
-          <w:p>
-            <w:r>
-              <w:t xml:space="preserve">El paciente canceló. El horario queda libre para otros.</w:t>
-            </w:r>
-          </w:p>
-        </w:tc>
-      </w:tr>
-    </w:tbl>
-    <w:p>
-      <w:pPr>
-        <w:spacing w:after="120"/>
-      </w:pPr>
-    </w:p>
-    <w:tbl>
-      <w:tblPr>
-        <w:tblW w:type="dxa" w:w="9026"/>
-        <w:tblBorders>
-          <w:top w:val="single" w:color="auto" w:sz="4"/>
-          <w:left w:val="single" w:color="auto" w:sz="4"/>
-          <w:bottom w:val="single" w:color="auto" w:sz="4"/>
-          <w:right w:val="single" w:color="auto" w:sz="4"/>
-          <w:insideH w:val="single" w:color="auto" w:sz="4"/>
-          <w:insideV w:val="single" w:color="auto" w:sz="4"/>
-        </w:tblBorders>
-      </w:tblPr>
-      <w:tblGrid>
-        <w:gridCol w:w="9026"/>
-      </w:tblGrid>
-      <w:tr>
-        <w:tc>
-          <w:tcPr>
-            <w:tcW w:type="dxa" w:w="9026"/>
-            <w:tcBorders>
-              <w:top w:val="none" w:color="FFFFFF" w:sz="0"/>
-              <w:left w:val="single" w:color="B26A00" w:sz="24"/>
-              <w:bottom w:val="none" w:color="FFFFFF" w:sz="0"/>
-              <w:right w:val="none" w:color="FFFFFF" w:sz="0"/>
-            </w:tcBorders>
-            <w:shd w:fill="FFF4E5" w:color="auto" w:val="clear"/>
-            <w:tcMar>
-              <w:top w:type="dxa" w:w="120"/>
-              <w:left w:type="dxa" w:w="200"/>
-              <w:bottom w:type="dxa" w:w="120"/>
-              <w:right w:type="dxa" w:w="200"/>
-            </w:tcMar>
-          </w:tcPr>
-          <w:p>
-            <w:pPr>
-              <w:spacing w:after="80"/>
-            </w:pPr>
-            <w:r>
-              <w:rPr>
-                <w:b/>
-                <w:bCs/>
-                <w:color w:val="B26A00"/>
-              </w:rPr>
-              <w:t xml:space="preserve">Regla de oro: todo se hace en el panel</w:t>
-            </w:r>
-          </w:p>
-          <w:p>
-            <w:pPr>
-              <w:spacing w:after="60"/>
-            </w:pPr>
-            <w:r>
-              <w:t xml:space="preserve">Las citas se </w:t>
-            </w:r>
-            <w:r>
-              <w:rPr>
-                <w:b/>
-                <w:bCs/>
-              </w:rPr>
-              <w:t xml:space="preserve">crean, mueven y cancelan solo en el panel</w:t>
-            </w:r>
-            <w:r>
-              <w:t xml:space="preserve">. Los calendarios de Google de los médicos se actualizan solos y sirven </w:t>
-            </w:r>
-            <w:r>
-              <w:rPr>
-                <w:b/>
-                <w:bCs/>
-              </w:rPr>
-              <w:t xml:space="preserve">solo para consultar</w:t>
-            </w:r>
-            <w:r>
-              <w:t xml:space="preserve">.</w:t>
-            </w:r>
-          </w:p>
-          <w:p>
-            <w:pPr>
-              <w:spacing w:after="60"/>
-            </w:pPr>
-            <w:r>
-              <w:t xml:space="preserve">Si alguien crea o mueve una cita </w:t>
-            </w:r>
-            <w:r>
-              <w:rPr>
-                <w:b/>
-                <w:bCs/>
-              </w:rPr>
-              <w:t xml:space="preserve">directamente en Google Calendar</w:t>
-            </w:r>
-            <w:r>
-              <w:t xml:space="preserve">, el sistema no se entera y Gia podría ofrecer ese mismo horario a otro paciente.</w:t>
-            </w:r>
-          </w:p>
-        </w:tc>
-      </w:tr>
-    </w:tbl>
-    <w:p>
-      <w:pPr>
-        <w:pStyle w:val="Heading1"/>
-        <w:spacing w:after="160" w:before="360"/>
-      </w:pPr>
-      <w:r>
-        <w:t xml:space="preserve">6. Bloquear horarios</w:t>
-      </w:r>
-    </w:p>
-    <w:p>
-      <w:pPr>
-        <w:spacing w:after="120"/>
-      </w:pPr>
-      <w:r>
-        <w:t xml:space="preserve">Use esta opción cuando un médico </w:t>
-      </w:r>
-      <w:r>
-        <w:rPr>
-          <w:b/>
-          <w:bCs/>
-        </w:rPr>
-        <w:t xml:space="preserve">no va a atender</w:t>
-      </w:r>
-      <w:r>
-        <w:t xml:space="preserve"> en ciertas horas o días: vacaciones, cirugías, reuniones, permisos. Mientras esté bloqueado, Gia </w:t>
-      </w:r>
-      <w:r>
-        <w:rPr>
-          <w:b/>
-          <w:bCs/>
-        </w:rPr>
-        <w:t xml:space="preserve">no ofrece</w:t>
-      </w:r>
-      <w:r>
-        <w:t xml:space="preserve"> esas horas por WhatsApp y tampoco aparecen al crear citas en el panel.</w:t>
-      </w:r>
-    </w:p>
-    <w:p>
-      <w:pPr>
-        <w:pStyle w:val="Heading2"/>
-        <w:spacing w:after="120" w:before="240"/>
-      </w:pPr>
-      <w:r>
-        <w:t xml:space="preserve">Crear un bloqueo</w:t>
+        <w:t xml:space="preserve">Figura 7. Ventana «Nueva cita»: solo se ofrecen horas disponibles.</w:t>
       </w:r>
     </w:p>
     <w:p>
@@ -2956,32 +2987,32 @@
         <w:pStyle w:val="ListParagraph"/>
         <w:numPr>
           <w:ilvl w:val="0"/>
-          <w:numId w:val="6"/>
+          <w:numId w:val="2"/>
         </w:numPr>
         <w:spacing w:after="80"/>
       </w:pPr>
       <w:r>
-        <w:t xml:space="preserve">En </w:t>
-      </w:r>
-      <w:r>
-        <w:rPr>
-          <w:b/>
-          <w:bCs/>
-        </w:rPr>
-        <w:t xml:space="preserve">📅 Calendario</w:t>
-      </w:r>
-      <w:r>
-        <w:t xml:space="preserve"> pulse </w:t>
-      </w:r>
-      <w:r>
-        <w:rPr>
-          <w:b/>
-          <w:bCs/>
-        </w:rPr>
-        <w:t xml:space="preserve">⛔ Bloquear horario</w:t>
-      </w:r>
-      <w:r>
-        <w:t xml:space="preserve">.</w:t>
+        <w:t xml:space="preserve">Si ese número ya tiene un paciente con </w:t>
+      </w:r>
+      <w:r>
+        <w:rPr>
+          <w:b/>
+          <w:bCs/>
+        </w:rPr>
+        <w:t xml:space="preserve">otro nombre</w:t>
+      </w:r>
+      <w:r>
+        <w:t xml:space="preserve">, la persona se registra como </w:t>
+      </w:r>
+      <w:r>
+        <w:rPr>
+          <w:b/>
+          <w:bCs/>
+        </w:rPr>
+        <w:t xml:space="preserve">familiar</w:t>
+      </w:r>
+      <w:r>
+        <w:t xml:space="preserve"> del titular (por ejemplo, un hijo).</w:t>
       </w:r>
     </w:p>
     <w:p>
@@ -2989,22 +3020,22 @@
         <w:pStyle w:val="ListParagraph"/>
         <w:numPr>
           <w:ilvl w:val="0"/>
-          <w:numId w:val="6"/>
+          <w:numId w:val="2"/>
         </w:numPr>
         <w:spacing w:after="80"/>
       </w:pPr>
       <w:r>
-        <w:t xml:space="preserve">Elija el </w:t>
-      </w:r>
-      <w:r>
-        <w:rPr>
-          <w:b/>
-          <w:bCs/>
-        </w:rPr>
-        <w:t xml:space="preserve">profesional</w:t>
-      </w:r>
-      <w:r>
-        <w:t xml:space="preserve">. Si atiende varias especialidades, el bloqueo vale para todas.</w:t>
+        <w:t xml:space="preserve">Si el paciente es nuevo, su </w:t>
+      </w:r>
+      <w:r>
+        <w:rPr>
+          <w:b/>
+          <w:bCs/>
+        </w:rPr>
+        <w:t xml:space="preserve">autorización de datos queda pendiente</w:t>
+      </w:r>
+      <w:r>
+        <w:t xml:space="preserve"> hasta que la acepte por WhatsApp.</w:t>
       </w:r>
     </w:p>
     <w:p>
@@ -3012,121 +3043,39 @@
         <w:pStyle w:val="ListParagraph"/>
         <w:numPr>
           <w:ilvl w:val="0"/>
-          <w:numId w:val="6"/>
+          <w:numId w:val="2"/>
         </w:numPr>
         <w:spacing w:after="80"/>
       </w:pPr>
       <w:r>
-        <w:t xml:space="preserve">Elija </w:t>
-      </w:r>
-      <w:r>
-        <w:rPr>
-          <w:b/>
-          <w:bCs/>
-        </w:rPr>
-        <w:t xml:space="preserve">Desde (fecha)</w:t>
-      </w:r>
-      <w:r>
-        <w:t xml:space="preserve"> y </w:t>
-      </w:r>
-      <w:r>
-        <w:rPr>
-          <w:b/>
-          <w:bCs/>
-        </w:rPr>
-        <w:t xml:space="preserve">Hasta (fecha)</w:t>
-      </w:r>
-      <w:r>
-        <w:t xml:space="preserve">.</w:t>
-      </w:r>
-    </w:p>
-    <w:p>
-      <w:pPr>
-        <w:pStyle w:val="ListParagraph"/>
-        <w:numPr>
-          <w:ilvl w:val="0"/>
-          <w:numId w:val="6"/>
-        </w:numPr>
-        <w:spacing w:after="80"/>
-      </w:pPr>
-      <w:r>
-        <w:t xml:space="preserve">Deje marcado </w:t>
-      </w:r>
-      <w:r>
-        <w:rPr>
-          <w:b/>
-          <w:bCs/>
-        </w:rPr>
-        <w:t xml:space="preserve">«Todo el día»</w:t>
-      </w:r>
-      <w:r>
-        <w:t xml:space="preserve">, o desmárquelo y escriba </w:t>
-      </w:r>
-      <w:r>
-        <w:rPr>
-          <w:b/>
-          <w:bCs/>
-        </w:rPr>
-        <w:t xml:space="preserve">Hora desde</w:t>
-      </w:r>
-      <w:r>
-        <w:t xml:space="preserve"> y </w:t>
-      </w:r>
-      <w:r>
-        <w:rPr>
-          <w:b/>
-          <w:bCs/>
-        </w:rPr>
-        <w:t xml:space="preserve">Hora hasta</w:t>
-      </w:r>
-      <w:r>
-        <w:t xml:space="preserve">.</w:t>
-      </w:r>
-    </w:p>
-    <w:p>
-      <w:pPr>
-        <w:pStyle w:val="ListParagraph"/>
-        <w:numPr>
-          <w:ilvl w:val="0"/>
-          <w:numId w:val="6"/>
-        </w:numPr>
-        <w:spacing w:after="80"/>
-      </w:pPr>
-      <w:r>
-        <w:t xml:space="preserve">Escriba un </w:t>
-      </w:r>
-      <w:r>
-        <w:rPr>
-          <w:b/>
-          <w:bCs/>
-        </w:rPr>
-        <w:t xml:space="preserve">motivo</w:t>
-      </w:r>
-      <w:r>
-        <w:t xml:space="preserve"> si desea (por ejemplo «Vacaciones»). Solo lo ve el personal, nunca el paciente.</w:t>
-      </w:r>
-    </w:p>
-    <w:p>
-      <w:pPr>
-        <w:pStyle w:val="ListParagraph"/>
-        <w:numPr>
-          <w:ilvl w:val="0"/>
-          <w:numId w:val="6"/>
-        </w:numPr>
-        <w:spacing w:after="80"/>
-      </w:pPr>
-      <w:r>
-        <w:t xml:space="preserve">Pulse </w:t>
-      </w:r>
-      <w:r>
-        <w:rPr>
-          <w:b/>
-          <w:bCs/>
-        </w:rPr>
-        <w:t xml:space="preserve">Bloquear</w:t>
-      </w:r>
-      <w:r>
-        <w:t xml:space="preserve">.</w:t>
+        <w:t xml:space="preserve">El paciente recibirá el </w:t>
+      </w:r>
+      <w:r>
+        <w:rPr>
+          <w:b/>
+          <w:bCs/>
+        </w:rPr>
+        <w:t xml:space="preserve">recordatorio</w:t>
+      </w:r>
+      <w:r>
+        <w:t xml:space="preserve"> por WhatsApp igual que las citas hechas por Gia.</w:t>
+      </w:r>
+    </w:p>
+    <w:p>
+      <w:pPr>
+        <w:pStyle w:val="Heading2"/>
+        <w:spacing w:after="120" w:before="240"/>
+      </w:pPr>
+      <w:r>
+        <w:t xml:space="preserve">Gestionar una cita existente</w:t>
+      </w:r>
+    </w:p>
+    <w:p>
+      <w:pPr>
+        <w:spacing w:after="120"/>
+      </w:pPr>
+      <w:r>
+        <w:t xml:space="preserve">Haga clic sobre la cita en el calendario. Se abre una ventana con estas opciones:</w:t>
       </w:r>
     </w:p>
     <w:p>
@@ -3137,9 +3086,9 @@
       <w:r>
         <w:drawing>
           <wp:inline distT="0" distB="0" distL="0" distR="0">
-            <wp:extent cx="3619500" cy="2924175"/>
+            <wp:extent cx="4000500" cy="3200400"/>
             <wp:effectExtent t="0" r="0" b="0" l="0"/>
-            <wp:docPr id="1" name="07-bloquear" descr="Bloquear todo el día." title="Bloquear todo el día."/>
+            <wp:docPr id="1" name="06-cita" descr="Ventana de una cita: reagendar, confirmar, marcar atendida, no asistió o cancelar." title="Ventana de una cita: reagendar, confirmar, marcar atendida, no asistió o cancelar."/>
             <wp:cNvGraphicFramePr>
               <a:graphicFrameLocks xmlns:a="http://schemas.openxmlformats.org/drawingml/2006/main" noChangeAspect="1"/>
             </wp:cNvGraphicFramePr>
@@ -3162,7 +3111,7 @@
                   <pic:spPr bwMode="auto">
                     <a:xfrm>
                       <a:off x="0" y="0"/>
-                      <a:ext cx="3619500" cy="2924175"/>
+                      <a:ext cx="4000500" cy="3200400"/>
                     </a:xfrm>
                     <a:prstGeom prst="rect">
                       <a:avLst/>
@@ -3188,7 +3137,587 @@
           <w:sz w:val="18"/>
           <w:szCs w:val="18"/>
         </w:rPr>
-        <w:t xml:space="preserve">Figura 8. Bloquear todo el día.</w:t>
+        <w:t xml:space="preserve">Figura 8. Ventana de una cita: reagendar, confirmar, marcar atendida, no asistió o cancelar.</w:t>
+      </w:r>
+    </w:p>
+    <w:tbl>
+      <w:tblPr>
+        <w:tblW w:type="dxa" w:w="9026"/>
+        <w:tblBorders>
+          <w:top w:val="single" w:color="auto" w:sz="4"/>
+          <w:left w:val="single" w:color="auto" w:sz="4"/>
+          <w:bottom w:val="single" w:color="auto" w:sz="4"/>
+          <w:right w:val="single" w:color="auto" w:sz="4"/>
+          <w:insideH w:val="single" w:color="auto" w:sz="4"/>
+          <w:insideV w:val="single" w:color="auto" w:sz="4"/>
+        </w:tblBorders>
+      </w:tblPr>
+      <w:tblGrid>
+        <w:gridCol w:w="3000"/>
+        <w:gridCol w:w="6026"/>
+      </w:tblGrid>
+      <w:tr>
+        <w:trPr>
+          <w:tblHeader/>
+        </w:trPr>
+        <w:tc>
+          <w:tcPr>
+            <w:tcW w:type="dxa" w:w="3000"/>
+            <w:shd w:fill="0B5E7E" w:color="auto" w:val="clear"/>
+            <w:tcMar>
+              <w:top w:type="dxa" w:w="80"/>
+              <w:left w:type="dxa" w:w="120"/>
+              <w:bottom w:type="dxa" w:w="80"/>
+              <w:right w:type="dxa" w:w="120"/>
+            </w:tcMar>
+          </w:tcPr>
+          <w:p>
+            <w:r>
+              <w:rPr>
+                <w:b/>
+                <w:bCs/>
+                <w:color w:val="FFFFFF"/>
+              </w:rPr>
+              <w:t xml:space="preserve">Botón</w:t>
+            </w:r>
+          </w:p>
+        </w:tc>
+        <w:tc>
+          <w:tcPr>
+            <w:tcW w:type="dxa" w:w="6026"/>
+            <w:shd w:fill="0B5E7E" w:color="auto" w:val="clear"/>
+            <w:tcMar>
+              <w:top w:type="dxa" w:w="80"/>
+              <w:left w:type="dxa" w:w="120"/>
+              <w:bottom w:type="dxa" w:w="80"/>
+              <w:right w:type="dxa" w:w="120"/>
+            </w:tcMar>
+          </w:tcPr>
+          <w:p>
+            <w:r>
+              <w:rPr>
+                <w:b/>
+                <w:bCs/>
+                <w:color w:val="FFFFFF"/>
+              </w:rPr>
+              <w:t xml:space="preserve">Cuándo usarlo</w:t>
+            </w:r>
+          </w:p>
+        </w:tc>
+      </w:tr>
+      <w:tr>
+        <w:tc>
+          <w:tcPr>
+            <w:tcW w:type="dxa" w:w="3000"/>
+            <w:tcMar>
+              <w:top w:type="dxa" w:w="80"/>
+              <w:left w:type="dxa" w:w="120"/>
+              <w:bottom w:type="dxa" w:w="80"/>
+              <w:right w:type="dxa" w:w="120"/>
+            </w:tcMar>
+          </w:tcPr>
+          <w:p>
+            <w:r>
+              <w:rPr>
+                <w:b/>
+                <w:bCs/>
+              </w:rPr>
+              <w:t xml:space="preserve">Reagendar → Mover</w:t>
+            </w:r>
+          </w:p>
+        </w:tc>
+        <w:tc>
+          <w:tcPr>
+            <w:tcW w:type="dxa" w:w="6026"/>
+            <w:tcMar>
+              <w:top w:type="dxa" w:w="80"/>
+              <w:left w:type="dxa" w:w="120"/>
+              <w:bottom w:type="dxa" w:w="80"/>
+              <w:right w:type="dxa" w:w="120"/>
+            </w:tcMar>
+          </w:tcPr>
+          <w:p>
+            <w:r>
+              <w:t xml:space="preserve">Elija nueva fecha y una hora disponible, y pulse Mover.</w:t>
+            </w:r>
+          </w:p>
+        </w:tc>
+      </w:tr>
+      <w:tr>
+        <w:tc>
+          <w:tcPr>
+            <w:tcW w:type="dxa" w:w="3000"/>
+            <w:tcMar>
+              <w:top w:type="dxa" w:w="80"/>
+              <w:left w:type="dxa" w:w="120"/>
+              <w:bottom w:type="dxa" w:w="80"/>
+              <w:right w:type="dxa" w:w="120"/>
+            </w:tcMar>
+          </w:tcPr>
+          <w:p>
+            <w:r>
+              <w:rPr>
+                <w:b/>
+                <w:bCs/>
+              </w:rPr>
+              <w:t xml:space="preserve">Marcar confirmada</w:t>
+            </w:r>
+          </w:p>
+        </w:tc>
+        <w:tc>
+          <w:tcPr>
+            <w:tcW w:type="dxa" w:w="6026"/>
+            <w:tcMar>
+              <w:top w:type="dxa" w:w="80"/>
+              <w:left w:type="dxa" w:w="120"/>
+              <w:bottom w:type="dxa" w:w="80"/>
+              <w:right w:type="dxa" w:w="120"/>
+            </w:tcMar>
+          </w:tcPr>
+          <w:p>
+            <w:r>
+              <w:t xml:space="preserve">El paciente confirmó por teléfono o en persona.</w:t>
+            </w:r>
+          </w:p>
+        </w:tc>
+      </w:tr>
+      <w:tr>
+        <w:tc>
+          <w:tcPr>
+            <w:tcW w:type="dxa" w:w="3000"/>
+            <w:tcMar>
+              <w:top w:type="dxa" w:w="80"/>
+              <w:left w:type="dxa" w:w="120"/>
+              <w:bottom w:type="dxa" w:w="80"/>
+              <w:right w:type="dxa" w:w="120"/>
+            </w:tcMar>
+          </w:tcPr>
+          <w:p>
+            <w:r>
+              <w:rPr>
+                <w:b/>
+                <w:bCs/>
+              </w:rPr>
+              <w:t xml:space="preserve">Atendida</w:t>
+            </w:r>
+          </w:p>
+        </w:tc>
+        <w:tc>
+          <w:tcPr>
+            <w:tcW w:type="dxa" w:w="6026"/>
+            <w:tcMar>
+              <w:top w:type="dxa" w:w="80"/>
+              <w:left w:type="dxa" w:w="120"/>
+              <w:bottom w:type="dxa" w:w="80"/>
+              <w:right w:type="dxa" w:w="120"/>
+            </w:tcMar>
+          </w:tcPr>
+          <w:p>
+            <w:r>
+              <w:t xml:space="preserve">El paciente ya fue atendido.</w:t>
+            </w:r>
+          </w:p>
+        </w:tc>
+      </w:tr>
+      <w:tr>
+        <w:tc>
+          <w:tcPr>
+            <w:tcW w:type="dxa" w:w="3000"/>
+            <w:tcMar>
+              <w:top w:type="dxa" w:w="80"/>
+              <w:left w:type="dxa" w:w="120"/>
+              <w:bottom w:type="dxa" w:w="80"/>
+              <w:right w:type="dxa" w:w="120"/>
+            </w:tcMar>
+          </w:tcPr>
+          <w:p>
+            <w:r>
+              <w:rPr>
+                <w:b/>
+                <w:bCs/>
+              </w:rPr>
+              <w:t xml:space="preserve">No asistió</w:t>
+            </w:r>
+          </w:p>
+        </w:tc>
+        <w:tc>
+          <w:tcPr>
+            <w:tcW w:type="dxa" w:w="6026"/>
+            <w:tcMar>
+              <w:top w:type="dxa" w:w="80"/>
+              <w:left w:type="dxa" w:w="120"/>
+              <w:bottom w:type="dxa" w:w="80"/>
+              <w:right w:type="dxa" w:w="120"/>
+            </w:tcMar>
+          </w:tcPr>
+          <w:p>
+            <w:r>
+              <w:t xml:space="preserve">El paciente no llegó.</w:t>
+            </w:r>
+          </w:p>
+        </w:tc>
+      </w:tr>
+      <w:tr>
+        <w:tc>
+          <w:tcPr>
+            <w:tcW w:type="dxa" w:w="3000"/>
+            <w:tcMar>
+              <w:top w:type="dxa" w:w="80"/>
+              <w:left w:type="dxa" w:w="120"/>
+              <w:bottom w:type="dxa" w:w="80"/>
+              <w:right w:type="dxa" w:w="120"/>
+            </w:tcMar>
+          </w:tcPr>
+          <w:p>
+            <w:r>
+              <w:rPr>
+                <w:b/>
+                <w:bCs/>
+              </w:rPr>
+              <w:t xml:space="preserve">Cancelar cita</w:t>
+            </w:r>
+          </w:p>
+        </w:tc>
+        <w:tc>
+          <w:tcPr>
+            <w:tcW w:type="dxa" w:w="6026"/>
+            <w:tcMar>
+              <w:top w:type="dxa" w:w="80"/>
+              <w:left w:type="dxa" w:w="120"/>
+              <w:bottom w:type="dxa" w:w="80"/>
+              <w:right w:type="dxa" w:w="120"/>
+            </w:tcMar>
+          </w:tcPr>
+          <w:p>
+            <w:r>
+              <w:t xml:space="preserve">El paciente canceló. El horario queda libre para otros.</w:t>
+            </w:r>
+          </w:p>
+        </w:tc>
+      </w:tr>
+    </w:tbl>
+    <w:p>
+      <w:pPr>
+        <w:spacing w:after="120"/>
+      </w:pPr>
+    </w:p>
+    <w:tbl>
+      <w:tblPr>
+        <w:tblW w:type="dxa" w:w="9026"/>
+        <w:tblBorders>
+          <w:top w:val="single" w:color="auto" w:sz="4"/>
+          <w:left w:val="single" w:color="auto" w:sz="4"/>
+          <w:bottom w:val="single" w:color="auto" w:sz="4"/>
+          <w:right w:val="single" w:color="auto" w:sz="4"/>
+          <w:insideH w:val="single" w:color="auto" w:sz="4"/>
+          <w:insideV w:val="single" w:color="auto" w:sz="4"/>
+        </w:tblBorders>
+      </w:tblPr>
+      <w:tblGrid>
+        <w:gridCol w:w="9026"/>
+      </w:tblGrid>
+      <w:tr>
+        <w:tc>
+          <w:tcPr>
+            <w:tcW w:type="dxa" w:w="9026"/>
+            <w:tcBorders>
+              <w:top w:val="none" w:color="FFFFFF" w:sz="0"/>
+              <w:left w:val="single" w:color="B26A00" w:sz="24"/>
+              <w:bottom w:val="none" w:color="FFFFFF" w:sz="0"/>
+              <w:right w:val="none" w:color="FFFFFF" w:sz="0"/>
+            </w:tcBorders>
+            <w:shd w:fill="FFF4E5" w:color="auto" w:val="clear"/>
+            <w:tcMar>
+              <w:top w:type="dxa" w:w="120"/>
+              <w:left w:type="dxa" w:w="200"/>
+              <w:bottom w:type="dxa" w:w="120"/>
+              <w:right w:type="dxa" w:w="200"/>
+            </w:tcMar>
+          </w:tcPr>
+          <w:p>
+            <w:pPr>
+              <w:spacing w:after="80"/>
+            </w:pPr>
+            <w:r>
+              <w:rPr>
+                <w:b/>
+                <w:bCs/>
+                <w:color w:val="B26A00"/>
+              </w:rPr>
+              <w:t xml:space="preserve">Regla de oro: todo se hace en el panel</w:t>
+            </w:r>
+          </w:p>
+          <w:p>
+            <w:pPr>
+              <w:spacing w:after="60"/>
+            </w:pPr>
+            <w:r>
+              <w:t xml:space="preserve">Las citas se </w:t>
+            </w:r>
+            <w:r>
+              <w:rPr>
+                <w:b/>
+                <w:bCs/>
+              </w:rPr>
+              <w:t xml:space="preserve">crean, mueven y cancelan solo en el panel</w:t>
+            </w:r>
+            <w:r>
+              <w:t xml:space="preserve">. Los calendarios de Google de los médicos se actualizan solos y sirven </w:t>
+            </w:r>
+            <w:r>
+              <w:rPr>
+                <w:b/>
+                <w:bCs/>
+              </w:rPr>
+              <w:t xml:space="preserve">solo para consultar</w:t>
+            </w:r>
+            <w:r>
+              <w:t xml:space="preserve">.</w:t>
+            </w:r>
+          </w:p>
+          <w:p>
+            <w:pPr>
+              <w:spacing w:after="60"/>
+            </w:pPr>
+            <w:r>
+              <w:t xml:space="preserve">Si alguien crea o mueve una cita </w:t>
+            </w:r>
+            <w:r>
+              <w:rPr>
+                <w:b/>
+                <w:bCs/>
+              </w:rPr>
+              <w:t xml:space="preserve">directamente en Google Calendar</w:t>
+            </w:r>
+            <w:r>
+              <w:t xml:space="preserve">, el sistema no se entera y Gia podría ofrecer ese mismo horario a otro paciente.</w:t>
+            </w:r>
+          </w:p>
+        </w:tc>
+      </w:tr>
+    </w:tbl>
+    <w:p>
+      <w:pPr>
+        <w:pStyle w:val="Heading1"/>
+        <w:spacing w:after="160" w:before="360"/>
+      </w:pPr>
+      <w:r>
+        <w:t xml:space="preserve">6. Bloquear horarios</w:t>
+      </w:r>
+    </w:p>
+    <w:p>
+      <w:pPr>
+        <w:spacing w:after="120"/>
+      </w:pPr>
+      <w:r>
+        <w:t xml:space="preserve">Use esta opción cuando un médico </w:t>
+      </w:r>
+      <w:r>
+        <w:rPr>
+          <w:b/>
+          <w:bCs/>
+        </w:rPr>
+        <w:t xml:space="preserve">no va a atender</w:t>
+      </w:r>
+      <w:r>
+        <w:t xml:space="preserve"> en ciertas horas o días: vacaciones, cirugías, reuniones, permisos. Mientras esté bloqueado, Gia </w:t>
+      </w:r>
+      <w:r>
+        <w:rPr>
+          <w:b/>
+          <w:bCs/>
+        </w:rPr>
+        <w:t xml:space="preserve">no ofrece</w:t>
+      </w:r>
+      <w:r>
+        <w:t xml:space="preserve"> esas horas por WhatsApp y tampoco aparecen al crear citas en el panel.</w:t>
+      </w:r>
+    </w:p>
+    <w:p>
+      <w:pPr>
+        <w:pStyle w:val="Heading2"/>
+        <w:spacing w:after="120" w:before="240"/>
+      </w:pPr>
+      <w:r>
+        <w:t xml:space="preserve">Crear un bloqueo</w:t>
+      </w:r>
+    </w:p>
+    <w:p>
+      <w:pPr>
+        <w:pStyle w:val="ListParagraph"/>
+        <w:numPr>
+          <w:ilvl w:val="0"/>
+          <w:numId w:val="7"/>
+        </w:numPr>
+        <w:spacing w:after="80"/>
+      </w:pPr>
+      <w:r>
+        <w:t xml:space="preserve">En </w:t>
+      </w:r>
+      <w:r>
+        <w:rPr>
+          <w:b/>
+          <w:bCs/>
+        </w:rPr>
+        <w:t xml:space="preserve">📅 Calendario</w:t>
+      </w:r>
+      <w:r>
+        <w:t xml:space="preserve"> pulse </w:t>
+      </w:r>
+      <w:r>
+        <w:rPr>
+          <w:b/>
+          <w:bCs/>
+        </w:rPr>
+        <w:t xml:space="preserve">⛔ Bloquear horario</w:t>
+      </w:r>
+      <w:r>
+        <w:t xml:space="preserve">.</w:t>
+      </w:r>
+    </w:p>
+    <w:p>
+      <w:pPr>
+        <w:pStyle w:val="ListParagraph"/>
+        <w:numPr>
+          <w:ilvl w:val="0"/>
+          <w:numId w:val="7"/>
+        </w:numPr>
+        <w:spacing w:after="80"/>
+      </w:pPr>
+      <w:r>
+        <w:t xml:space="preserve">Elija el </w:t>
+      </w:r>
+      <w:r>
+        <w:rPr>
+          <w:b/>
+          <w:bCs/>
+        </w:rPr>
+        <w:t xml:space="preserve">profesional</w:t>
+      </w:r>
+      <w:r>
+        <w:t xml:space="preserve">. Si atiende varias especialidades, el bloqueo vale para todas.</w:t>
+      </w:r>
+    </w:p>
+    <w:p>
+      <w:pPr>
+        <w:pStyle w:val="ListParagraph"/>
+        <w:numPr>
+          <w:ilvl w:val="0"/>
+          <w:numId w:val="7"/>
+        </w:numPr>
+        <w:spacing w:after="80"/>
+      </w:pPr>
+      <w:r>
+        <w:t xml:space="preserve">Elija </w:t>
+      </w:r>
+      <w:r>
+        <w:rPr>
+          <w:b/>
+          <w:bCs/>
+        </w:rPr>
+        <w:t xml:space="preserve">Desde (fecha)</w:t>
+      </w:r>
+      <w:r>
+        <w:t xml:space="preserve"> y </w:t>
+      </w:r>
+      <w:r>
+        <w:rPr>
+          <w:b/>
+          <w:bCs/>
+        </w:rPr>
+        <w:t xml:space="preserve">Hasta (fecha)</w:t>
+      </w:r>
+      <w:r>
+        <w:t xml:space="preserve">.</w:t>
+      </w:r>
+    </w:p>
+    <w:p>
+      <w:pPr>
+        <w:pStyle w:val="ListParagraph"/>
+        <w:numPr>
+          <w:ilvl w:val="0"/>
+          <w:numId w:val="7"/>
+        </w:numPr>
+        <w:spacing w:after="80"/>
+      </w:pPr>
+      <w:r>
+        <w:t xml:space="preserve">Deje marcado </w:t>
+      </w:r>
+      <w:r>
+        <w:rPr>
+          <w:b/>
+          <w:bCs/>
+        </w:rPr>
+        <w:t xml:space="preserve">«Todo el día»</w:t>
+      </w:r>
+      <w:r>
+        <w:t xml:space="preserve">, o desmárquelo y escriba </w:t>
+      </w:r>
+      <w:r>
+        <w:rPr>
+          <w:b/>
+          <w:bCs/>
+        </w:rPr>
+        <w:t xml:space="preserve">Hora desde</w:t>
+      </w:r>
+      <w:r>
+        <w:t xml:space="preserve"> y </w:t>
+      </w:r>
+      <w:r>
+        <w:rPr>
+          <w:b/>
+          <w:bCs/>
+        </w:rPr>
+        <w:t xml:space="preserve">Hora hasta</w:t>
+      </w:r>
+      <w:r>
+        <w:t xml:space="preserve">.</w:t>
+      </w:r>
+    </w:p>
+    <w:p>
+      <w:pPr>
+        <w:pStyle w:val="ListParagraph"/>
+        <w:numPr>
+          <w:ilvl w:val="0"/>
+          <w:numId w:val="7"/>
+        </w:numPr>
+        <w:spacing w:after="80"/>
+      </w:pPr>
+      <w:r>
+        <w:t xml:space="preserve">Escriba un </w:t>
+      </w:r>
+      <w:r>
+        <w:rPr>
+          <w:b/>
+          <w:bCs/>
+        </w:rPr>
+        <w:t xml:space="preserve">motivo</w:t>
+      </w:r>
+      <w:r>
+        <w:t xml:space="preserve"> si desea (por ejemplo «Vacaciones»). Solo lo ve el personal, nunca el paciente.</w:t>
+      </w:r>
+    </w:p>
+    <w:p>
+      <w:pPr>
+        <w:pStyle w:val="ListParagraph"/>
+        <w:numPr>
+          <w:ilvl w:val="0"/>
+          <w:numId w:val="7"/>
+        </w:numPr>
+        <w:spacing w:after="80"/>
+      </w:pPr>
+      <w:r>
+        <w:t xml:space="preserve">Pulse </w:t>
+      </w:r>
+      <w:r>
+        <w:rPr>
+          <w:b/>
+          <w:bCs/>
+        </w:rPr>
+        <w:t xml:space="preserve">Bloquear</w:t>
+      </w:r>
+      <w:r>
+        <w:t xml:space="preserve">.</w:t>
       </w:r>
     </w:p>
     <w:p>
@@ -3199,9 +3728,9 @@
       <w:r>
         <w:drawing>
           <wp:inline distT="0" distB="0" distL="0" distR="0">
-            <wp:extent cx="3619500" cy="3429000"/>
+            <wp:extent cx="3619500" cy="2924175"/>
             <wp:effectExtent t="0" r="0" b="0" l="0"/>
-            <wp:docPr id="1" name="07b-bloquear-horas" descr="Bloquear solo unas horas (desmarcando «Todo el día»)." title="Bloquear solo unas horas (desmarcando «Todo el día»)."/>
+            <wp:docPr id="1" name="07-bloquear" descr="Bloquear todo el día." title="Bloquear todo el día."/>
             <wp:cNvGraphicFramePr>
               <a:graphicFrameLocks xmlns:a="http://schemas.openxmlformats.org/drawingml/2006/main" noChangeAspect="1"/>
             </wp:cNvGraphicFramePr>
@@ -3224,7 +3753,7 @@
                   <pic:spPr bwMode="auto">
                     <a:xfrm>
                       <a:off x="0" y="0"/>
-                      <a:ext cx="3619500" cy="3429000"/>
+                      <a:ext cx="3619500" cy="2924175"/>
                     </a:xfrm>
                     <a:prstGeom prst="rect">
                       <a:avLst/>
@@ -3250,136 +3779,7 @@
           <w:sz w:val="18"/>
           <w:szCs w:val="18"/>
         </w:rPr>
-        <w:t xml:space="preserve">Figura 9. Bloquear solo unas horas (desmarcando «Todo el día»).</w:t>
-      </w:r>
-    </w:p>
-    <w:tbl>
-      <w:tblPr>
-        <w:tblW w:type="dxa" w:w="9026"/>
-        <w:tblBorders>
-          <w:top w:val="single" w:color="auto" w:sz="4"/>
-          <w:left w:val="single" w:color="auto" w:sz="4"/>
-          <w:bottom w:val="single" w:color="auto" w:sz="4"/>
-          <w:right w:val="single" w:color="auto" w:sz="4"/>
-          <w:insideH w:val="single" w:color="auto" w:sz="4"/>
-          <w:insideV w:val="single" w:color="auto" w:sz="4"/>
-        </w:tblBorders>
-      </w:tblPr>
-      <w:tblGrid>
-        <w:gridCol w:w="9026"/>
-      </w:tblGrid>
-      <w:tr>
-        <w:tc>
-          <w:tcPr>
-            <w:tcW w:type="dxa" w:w="9026"/>
-            <w:tcBorders>
-              <w:top w:val="none" w:color="FFFFFF" w:sz="0"/>
-              <w:left w:val="single" w:color="0B5E7E" w:sz="24"/>
-              <w:bottom w:val="none" w:color="FFFFFF" w:sz="0"/>
-              <w:right w:val="none" w:color="FFFFFF" w:sz="0"/>
-            </w:tcBorders>
-            <w:shd w:fill="EEF6F9" w:color="auto" w:val="clear"/>
-            <w:tcMar>
-              <w:top w:type="dxa" w:w="120"/>
-              <w:left w:type="dxa" w:w="200"/>
-              <w:bottom w:type="dxa" w:w="120"/>
-              <w:right w:type="dxa" w:w="200"/>
-            </w:tcMar>
-          </w:tcPr>
-          <w:p>
-            <w:pPr>
-              <w:spacing w:after="80"/>
-            </w:pPr>
-            <w:r>
-              <w:rPr>
-                <w:b/>
-                <w:bCs/>
-                <w:color w:val="0B5E7E"/>
-              </w:rPr>
-              <w:t xml:space="preserve">Si ya había citas en ese horario</w:t>
-            </w:r>
-          </w:p>
-          <w:p>
-            <w:pPr>
-              <w:spacing w:after="60"/>
-            </w:pPr>
-            <w:r>
-              <w:t xml:space="preserve">El sistema </w:t>
-            </w:r>
-            <w:r>
-              <w:rPr>
-                <w:b/>
-                <w:bCs/>
-              </w:rPr>
-              <w:t xml:space="preserve">no las cancela solo</w:t>
-            </w:r>
-            <w:r>
-              <w:t xml:space="preserve">. Le mostrará la lista de citas afectadas para que usted </w:t>
-            </w:r>
-            <w:r>
-              <w:rPr>
-                <w:b/>
-                <w:bCs/>
-              </w:rPr>
-              <w:t xml:space="preserve">llame o escriba a cada paciente</w:t>
-            </w:r>
-            <w:r>
-              <w:t xml:space="preserve"> y las </w:t>
-            </w:r>
-            <w:r>
-              <w:rPr>
-                <w:b/>
-                <w:bCs/>
-              </w:rPr>
-              <w:t xml:space="preserve">reagende o cancele</w:t>
-            </w:r>
-            <w:r>
-              <w:t xml:space="preserve"> desde el calendario.</w:t>
-            </w:r>
-          </w:p>
-        </w:tc>
-      </w:tr>
-    </w:tbl>
-    <w:p>
-      <w:pPr>
-        <w:spacing w:after="120"/>
-      </w:pPr>
-    </w:p>
-    <w:p>
-      <w:pPr>
-        <w:pStyle w:val="Heading2"/>
-        <w:spacing w:after="120" w:before="240"/>
-      </w:pPr>
-      <w:r>
-        <w:t xml:space="preserve">Quitar un bloqueo</w:t>
-      </w:r>
-    </w:p>
-    <w:p>
-      <w:pPr>
-        <w:spacing w:after="120"/>
-      </w:pPr>
-      <w:r>
-        <w:t xml:space="preserve">Haga clic sobre el bloqueo (cuadro rayado </w:t>
-      </w:r>
-      <w:r>
-        <w:rPr>
-          <w:b/>
-          <w:bCs/>
-        </w:rPr>
-        <w:t xml:space="preserve">⛔</w:t>
-      </w:r>
-      <w:r>
-        <w:t xml:space="preserve">) en el calendario y pulse </w:t>
-      </w:r>
-      <w:r>
-        <w:rPr>
-          <w:b/>
-          <w:bCs/>
-        </w:rPr>
-        <w:t xml:space="preserve">«Quitar bloqueo»</w:t>
-      </w:r>
-      <w:r>
-        <w:t xml:space="preserve">. Las horas vuelven a estar disponibles de inmediato.</w:t>
+        <w:t xml:space="preserve">Figura 9. Bloquear todo el día.</w:t>
       </w:r>
     </w:p>
     <w:p>
@@ -3390,9 +3790,9 @@
       <w:r>
         <w:drawing>
           <wp:inline distT="0" distB="0" distL="0" distR="0">
-            <wp:extent cx="3619500" cy="1905000"/>
+            <wp:extent cx="3619500" cy="3429000"/>
             <wp:effectExtent t="0" r="0" b="0" l="0"/>
-            <wp:docPr id="1" name="08-bloqueo" descr="Detalle de un bloqueo con el botón «Quitar bloqueo»." title="Detalle de un bloqueo con el botón «Quitar bloqueo»."/>
+            <wp:docPr id="1" name="07b-bloquear-horas" descr="Bloquear solo unas horas (desmarcando «Todo el día»)." title="Bloquear solo unas horas (desmarcando «Todo el día»)."/>
             <wp:cNvGraphicFramePr>
               <a:graphicFrameLocks xmlns:a="http://schemas.openxmlformats.org/drawingml/2006/main" noChangeAspect="1"/>
             </wp:cNvGraphicFramePr>
@@ -3415,7 +3815,7 @@
                   <pic:spPr bwMode="auto">
                     <a:xfrm>
                       <a:off x="0" y="0"/>
-                      <a:ext cx="3619500" cy="1905000"/>
+                      <a:ext cx="3619500" cy="3429000"/>
                     </a:xfrm>
                     <a:prstGeom prst="rect">
                       <a:avLst/>
@@ -3441,123 +3841,136 @@
           <w:sz w:val="18"/>
           <w:szCs w:val="18"/>
         </w:rPr>
-        <w:t xml:space="preserve">Figura 10. Detalle de un bloqueo con el botón «Quitar bloqueo».</w:t>
-      </w:r>
-    </w:p>
+        <w:t xml:space="preserve">Figura 10. Bloquear solo unas horas (desmarcando «Todo el día»).</w:t>
+      </w:r>
+    </w:p>
+    <w:tbl>
+      <w:tblPr>
+        <w:tblW w:type="dxa" w:w="9026"/>
+        <w:tblBorders>
+          <w:top w:val="single" w:color="auto" w:sz="4"/>
+          <w:left w:val="single" w:color="auto" w:sz="4"/>
+          <w:bottom w:val="single" w:color="auto" w:sz="4"/>
+          <w:right w:val="single" w:color="auto" w:sz="4"/>
+          <w:insideH w:val="single" w:color="auto" w:sz="4"/>
+          <w:insideV w:val="single" w:color="auto" w:sz="4"/>
+        </w:tblBorders>
+      </w:tblPr>
+      <w:tblGrid>
+        <w:gridCol w:w="9026"/>
+      </w:tblGrid>
+      <w:tr>
+        <w:tc>
+          <w:tcPr>
+            <w:tcW w:type="dxa" w:w="9026"/>
+            <w:tcBorders>
+              <w:top w:val="none" w:color="FFFFFF" w:sz="0"/>
+              <w:left w:val="single" w:color="0B5E7E" w:sz="24"/>
+              <w:bottom w:val="none" w:color="FFFFFF" w:sz="0"/>
+              <w:right w:val="none" w:color="FFFFFF" w:sz="0"/>
+            </w:tcBorders>
+            <w:shd w:fill="EEF6F9" w:color="auto" w:val="clear"/>
+            <w:tcMar>
+              <w:top w:type="dxa" w:w="120"/>
+              <w:left w:type="dxa" w:w="200"/>
+              <w:bottom w:type="dxa" w:w="120"/>
+              <w:right w:type="dxa" w:w="200"/>
+            </w:tcMar>
+          </w:tcPr>
+          <w:p>
+            <w:pPr>
+              <w:spacing w:after="80"/>
+            </w:pPr>
+            <w:r>
+              <w:rPr>
+                <w:b/>
+                <w:bCs/>
+                <w:color w:val="0B5E7E"/>
+              </w:rPr>
+              <w:t xml:space="preserve">Si ya había citas en ese horario</w:t>
+            </w:r>
+          </w:p>
+          <w:p>
+            <w:pPr>
+              <w:spacing w:after="60"/>
+            </w:pPr>
+            <w:r>
+              <w:t xml:space="preserve">El sistema </w:t>
+            </w:r>
+            <w:r>
+              <w:rPr>
+                <w:b/>
+                <w:bCs/>
+              </w:rPr>
+              <w:t xml:space="preserve">no las cancela solo</w:t>
+            </w:r>
+            <w:r>
+              <w:t xml:space="preserve">. Le mostrará la lista de citas afectadas para que usted </w:t>
+            </w:r>
+            <w:r>
+              <w:rPr>
+                <w:b/>
+                <w:bCs/>
+              </w:rPr>
+              <w:t xml:space="preserve">llame o escriba a cada paciente</w:t>
+            </w:r>
+            <w:r>
+              <w:t xml:space="preserve"> y las </w:t>
+            </w:r>
+            <w:r>
+              <w:rPr>
+                <w:b/>
+                <w:bCs/>
+              </w:rPr>
+              <w:t xml:space="preserve">reagende o cancele</w:t>
+            </w:r>
+            <w:r>
+              <w:t xml:space="preserve"> desde el calendario.</w:t>
+            </w:r>
+          </w:p>
+        </w:tc>
+      </w:tr>
+    </w:tbl>
     <w:p>
       <w:pPr>
         <w:spacing w:after="120"/>
       </w:pPr>
-      <w:r>
-        <w:t xml:space="preserve">Ejemplo con horas en varios días: «Desde 20/10 08:00 hasta 22/10 12:00» bloquea desde el lunes a las 8:00 </w:t>
-      </w:r>
-      <w:r>
-        <w:rPr>
-          <w:b/>
-          <w:bCs/>
-        </w:rPr>
-        <w:t xml:space="preserve">hasta</w:t>
-      </w:r>
-      <w:r>
-        <w:t xml:space="preserve"> el miércoles a las 12:00, incluido todo el martes.</w:t>
-      </w:r>
-    </w:p>
-    <w:p>
-      <w:pPr>
-        <w:pStyle w:val="Heading1"/>
-        <w:spacing w:after="160" w:before="360"/>
-      </w:pPr>
-      <w:r>
-        <w:t xml:space="preserve">7. Pacientes</w:t>
-      </w:r>
-    </w:p>
-    <w:p>
-      <w:pPr>
-        <w:pStyle w:val="ListParagraph"/>
-        <w:numPr>
-          <w:ilvl w:val="0"/>
-          <w:numId w:val="2"/>
-        </w:numPr>
-        <w:spacing w:after="80"/>
-      </w:pPr>
-      <w:r>
-        <w:t xml:space="preserve">En </w:t>
-      </w:r>
-      <w:r>
-        <w:rPr>
-          <w:b/>
-          <w:bCs/>
-        </w:rPr>
-        <w:t xml:space="preserve">🧑 Pacientes</w:t>
-      </w:r>
-      <w:r>
-        <w:t xml:space="preserve"> busque por </w:t>
-      </w:r>
-      <w:r>
-        <w:rPr>
-          <w:b/>
-          <w:bCs/>
-        </w:rPr>
-        <w:t xml:space="preserve">nombre o número</w:t>
-      </w:r>
-      <w:r>
-        <w:t xml:space="preserve">.</w:t>
-      </w:r>
-    </w:p>
-    <w:p>
-      <w:pPr>
-        <w:pStyle w:val="ListParagraph"/>
-        <w:numPr>
-          <w:ilvl w:val="0"/>
-          <w:numId w:val="2"/>
-        </w:numPr>
-        <w:spacing w:after="80"/>
-      </w:pPr>
-      <w:r>
-        <w:t xml:space="preserve">Al abrir un paciente verá su número, sus </w:t>
-      </w:r>
-      <w:r>
-        <w:rPr>
-          <w:b/>
-          <w:bCs/>
-        </w:rPr>
-        <w:t xml:space="preserve">familiares</w:t>
-      </w:r>
-      <w:r>
-        <w:t xml:space="preserve"> registrados con el mismo WhatsApp y si </w:t>
-      </w:r>
-      <w:r>
-        <w:rPr>
-          <w:b/>
-          <w:bCs/>
-        </w:rPr>
-        <w:t xml:space="preserve">aceptó</w:t>
-      </w:r>
-      <w:r>
-        <w:t xml:space="preserve"> el tratamiento de datos.</w:t>
-      </w:r>
-    </w:p>
-    <w:p>
-      <w:pPr>
-        <w:pStyle w:val="ListParagraph"/>
-        <w:numPr>
-          <w:ilvl w:val="0"/>
-          <w:numId w:val="2"/>
-        </w:numPr>
-        <w:spacing w:after="80"/>
-      </w:pPr>
-      <w:r>
-        <w:t xml:space="preserve">El sistema solo guarda </w:t>
-      </w:r>
-      <w:r>
-        <w:rPr>
-          <w:b/>
-          <w:bCs/>
-        </w:rPr>
-        <w:t xml:space="preserve">nombre y número de WhatsApp</w:t>
-      </w:r>
-      <w:r>
-        <w:t xml:space="preserve">. No se registran diagnósticos ni datos clínicos.</w:t>
+    </w:p>
+    <w:p>
+      <w:pPr>
+        <w:pStyle w:val="Heading2"/>
+        <w:spacing w:after="120" w:before="240"/>
+      </w:pPr>
+      <w:r>
+        <w:t xml:space="preserve">Quitar un bloqueo</w:t>
+      </w:r>
+    </w:p>
+    <w:p>
+      <w:pPr>
+        <w:spacing w:after="120"/>
+      </w:pPr>
+      <w:r>
+        <w:t xml:space="preserve">Haga clic sobre el bloqueo (cuadro rayado </w:t>
+      </w:r>
+      <w:r>
+        <w:rPr>
+          <w:b/>
+          <w:bCs/>
+        </w:rPr>
+        <w:t xml:space="preserve">⛔</w:t>
+      </w:r>
+      <w:r>
+        <w:t xml:space="preserve">) en el calendario y pulse </w:t>
+      </w:r>
+      <w:r>
+        <w:rPr>
+          <w:b/>
+          <w:bCs/>
+        </w:rPr>
+        <w:t xml:space="preserve">«Quitar bloqueo»</w:t>
+      </w:r>
+      <w:r>
+        <w:t xml:space="preserve">. Las horas vuelven a estar disponibles de inmediato.</w:t>
       </w:r>
     </w:p>
     <w:p>
@@ -3568,9 +3981,9 @@
       <w:r>
         <w:drawing>
           <wp:inline distT="0" distB="0" distL="0" distR="0">
-            <wp:extent cx="5715000" cy="3571875"/>
+            <wp:extent cx="3619500" cy="1905000"/>
             <wp:effectExtent t="0" r="0" b="0" l="0"/>
-            <wp:docPr id="1" name="10-pacientes" descr="Lista de pacientes con su autorización de datos." title="Lista de pacientes con su autorización de datos."/>
+            <wp:docPr id="1" name="08-bloqueo" descr="Detalle de un bloqueo con el botón «Quitar bloqueo»." title="Detalle de un bloqueo con el botón «Quitar bloqueo»."/>
             <wp:cNvGraphicFramePr>
               <a:graphicFrameLocks xmlns:a="http://schemas.openxmlformats.org/drawingml/2006/main" noChangeAspect="1"/>
             </wp:cNvGraphicFramePr>
@@ -3593,7 +4006,7 @@
                   <pic:spPr bwMode="auto">
                     <a:xfrm>
                       <a:off x="0" y="0"/>
-                      <a:ext cx="5715000" cy="3571875"/>
+                      <a:ext cx="3619500" cy="1905000"/>
                     </a:xfrm>
                     <a:prstGeom prst="rect">
                       <a:avLst/>
@@ -3619,330 +4032,124 @@
           <w:sz w:val="18"/>
           <w:szCs w:val="18"/>
         </w:rPr>
-        <w:t xml:space="preserve">Figura 11. Lista de pacientes con su autorización de datos.</w:t>
-      </w:r>
-    </w:p>
-    <w:tbl>
-      <w:tblPr>
-        <w:tblW w:type="dxa" w:w="9026"/>
-        <w:tblBorders>
-          <w:top w:val="single" w:color="auto" w:sz="4"/>
-          <w:left w:val="single" w:color="auto" w:sz="4"/>
-          <w:bottom w:val="single" w:color="auto" w:sz="4"/>
-          <w:right w:val="single" w:color="auto" w:sz="4"/>
-          <w:insideH w:val="single" w:color="auto" w:sz="4"/>
-          <w:insideV w:val="single" w:color="auto" w:sz="4"/>
-        </w:tblBorders>
-      </w:tblPr>
-      <w:tblGrid>
-        <w:gridCol w:w="9026"/>
-      </w:tblGrid>
-      <w:tr>
-        <w:tc>
-          <w:tcPr>
-            <w:tcW w:type="dxa" w:w="9026"/>
-            <w:tcBorders>
-              <w:top w:val="none" w:color="FFFFFF" w:sz="0"/>
-              <w:left w:val="single" w:color="0B5E7E" w:sz="24"/>
-              <w:bottom w:val="none" w:color="FFFFFF" w:sz="0"/>
-              <w:right w:val="none" w:color="FFFFFF" w:sz="0"/>
-            </w:tcBorders>
-            <w:shd w:fill="EEF6F9" w:color="auto" w:val="clear"/>
-            <w:tcMar>
-              <w:top w:type="dxa" w:w="120"/>
-              <w:left w:type="dxa" w:w="200"/>
-              <w:bottom w:type="dxa" w:w="120"/>
-              <w:right w:type="dxa" w:w="200"/>
-            </w:tcMar>
-          </w:tcPr>
-          <w:p>
-            <w:pPr>
-              <w:spacing w:after="80"/>
-            </w:pPr>
-            <w:r>
-              <w:rPr>
-                <w:b/>
-                <w:bCs/>
-                <w:color w:val="0B5E7E"/>
-              </w:rPr>
-              <w:t xml:space="preserve">Solicitudes de eliminación de datos</w:t>
-            </w:r>
-          </w:p>
-          <w:p>
-            <w:pPr>
-              <w:spacing w:after="60"/>
-            </w:pPr>
-            <w:r>
-              <w:t xml:space="preserve">Si un paciente pide que </w:t>
-            </w:r>
-            <w:r>
-              <w:rPr>
-                <w:b/>
-                <w:bCs/>
-              </w:rPr>
-              <w:t xml:space="preserve">borren sus datos</w:t>
-            </w:r>
-            <w:r>
-              <w:t xml:space="preserve">, confirme que escribe desde el mismo número registrado y </w:t>
-            </w:r>
-            <w:r>
-              <w:rPr>
-                <w:b/>
-                <w:bCs/>
-              </w:rPr>
-              <w:t xml:space="preserve">avise a la administradora</w:t>
-            </w:r>
-            <w:r>
-              <w:t xml:space="preserve">, que es quien realiza la eliminación.</w:t>
-            </w:r>
-          </w:p>
-        </w:tc>
-      </w:tr>
-    </w:tbl>
+        <w:t xml:space="preserve">Figura 11. Detalle de un bloqueo con el botón «Quitar bloqueo».</w:t>
+      </w:r>
+    </w:p>
+    <w:p>
+      <w:pPr>
+        <w:spacing w:after="120"/>
+      </w:pPr>
+      <w:r>
+        <w:t xml:space="preserve">Ejemplo con horas en varios días: «Desde 20/10 08:00 hasta 22/10 12:00» bloquea desde el lunes a las 8:00 </w:t>
+      </w:r>
+      <w:r>
+        <w:rPr>
+          <w:b/>
+          <w:bCs/>
+        </w:rPr>
+        <w:t xml:space="preserve">hasta</w:t>
+      </w:r>
+      <w:r>
+        <w:t xml:space="preserve"> el miércoles a las 12:00, incluido todo el martes.</w:t>
+      </w:r>
+    </w:p>
     <w:p>
       <w:pPr>
         <w:pStyle w:val="Heading1"/>
         <w:spacing w:after="160" w:before="360"/>
       </w:pPr>
       <w:r>
-        <w:t xml:space="preserve">8. Alertas</w:t>
-      </w:r>
-    </w:p>
-    <w:tbl>
-      <w:tblPr>
-        <w:tblW w:type="dxa" w:w="9026"/>
-        <w:tblBorders>
-          <w:top w:val="single" w:color="auto" w:sz="4"/>
-          <w:left w:val="single" w:color="auto" w:sz="4"/>
-          <w:bottom w:val="single" w:color="auto" w:sz="4"/>
-          <w:right w:val="single" w:color="auto" w:sz="4"/>
-          <w:insideH w:val="single" w:color="auto" w:sz="4"/>
-          <w:insideV w:val="single" w:color="auto" w:sz="4"/>
-        </w:tblBorders>
-      </w:tblPr>
-      <w:tblGrid>
-        <w:gridCol w:w="3200"/>
-        <w:gridCol w:w="5826"/>
-      </w:tblGrid>
-      <w:tr>
-        <w:trPr>
-          <w:tblHeader/>
-        </w:trPr>
-        <w:tc>
-          <w:tcPr>
-            <w:tcW w:type="dxa" w:w="3200"/>
-            <w:shd w:fill="0B5E7E" w:color="auto" w:val="clear"/>
-            <w:tcMar>
-              <w:top w:type="dxa" w:w="80"/>
-              <w:left w:type="dxa" w:w="120"/>
-              <w:bottom w:type="dxa" w:w="80"/>
-              <w:right w:type="dxa" w:w="120"/>
-            </w:tcMar>
-          </w:tcPr>
-          <w:p>
-            <w:r>
-              <w:rPr>
-                <w:b/>
-                <w:bCs/>
-                <w:color w:val="FFFFFF"/>
-              </w:rPr>
-              <w:t xml:space="preserve">Tipo de alerta</w:t>
-            </w:r>
-          </w:p>
-        </w:tc>
-        <w:tc>
-          <w:tcPr>
-            <w:tcW w:type="dxa" w:w="5826"/>
-            <w:shd w:fill="0B5E7E" w:color="auto" w:val="clear"/>
-            <w:tcMar>
-              <w:top w:type="dxa" w:w="80"/>
-              <w:left w:type="dxa" w:w="120"/>
-              <w:bottom w:type="dxa" w:w="80"/>
-              <w:right w:type="dxa" w:w="120"/>
-            </w:tcMar>
-          </w:tcPr>
-          <w:p>
-            <w:r>
-              <w:rPr>
-                <w:b/>
-                <w:bCs/>
-                <w:color w:val="FFFFFF"/>
-              </w:rPr>
-              <w:t xml:space="preserve">Qué hacer</w:t>
-            </w:r>
-          </w:p>
-        </w:tc>
-      </w:tr>
-      <w:tr>
-        <w:tc>
-          <w:tcPr>
-            <w:tcW w:type="dxa" w:w="3200"/>
-            <w:tcMar>
-              <w:top w:type="dxa" w:w="80"/>
-              <w:left w:type="dxa" w:w="120"/>
-              <w:bottom w:type="dxa" w:w="80"/>
-              <w:right w:type="dxa" w:w="120"/>
-            </w:tcMar>
-          </w:tcPr>
-          <w:p>
-            <w:r>
-              <w:t xml:space="preserve">🚨 </w:t>
-            </w:r>
-            <w:r>
-              <w:rPr>
-                <w:b/>
-                <w:bCs/>
-              </w:rPr>
-              <w:t xml:space="preserve">Emergencia</w:t>
-            </w:r>
-          </w:p>
-        </w:tc>
-        <w:tc>
-          <w:tcPr>
-            <w:tcW w:type="dxa" w:w="5826"/>
-            <w:tcMar>
-              <w:top w:type="dxa" w:w="80"/>
-              <w:left w:type="dxa" w:w="120"/>
-              <w:bottom w:type="dxa" w:w="80"/>
-              <w:right w:type="dxa" w:w="120"/>
-            </w:tcMar>
-          </w:tcPr>
-          <w:p>
-            <w:r>
-              <w:t xml:space="preserve">Gia ya le indicó llamar al 911. Revise la conversación y, si corresponde, </w:t>
-            </w:r>
-            <w:r>
-              <w:rPr>
-                <w:b/>
-                <w:bCs/>
-              </w:rPr>
-              <w:t xml:space="preserve">llame al paciente</w:t>
-            </w:r>
-            <w:r>
-              <w:t xml:space="preserve">.</w:t>
-            </w:r>
-          </w:p>
-        </w:tc>
-      </w:tr>
-      <w:tr>
-        <w:tc>
-          <w:tcPr>
-            <w:tcW w:type="dxa" w:w="3200"/>
-            <w:tcMar>
-              <w:top w:type="dxa" w:w="80"/>
-              <w:left w:type="dxa" w:w="120"/>
-              <w:bottom w:type="dxa" w:w="80"/>
-              <w:right w:type="dxa" w:w="120"/>
-            </w:tcMar>
-          </w:tcPr>
-          <w:p>
-            <w:r>
-              <w:rPr>
-                <w:b/>
-                <w:bCs/>
-              </w:rPr>
-              <w:t xml:space="preserve">Paciente espera a un recepcionista</w:t>
-            </w:r>
-          </w:p>
-        </w:tc>
-        <w:tc>
-          <w:tcPr>
-            <w:tcW w:type="dxa" w:w="5826"/>
-            <w:tcMar>
-              <w:top w:type="dxa" w:w="80"/>
-              <w:left w:type="dxa" w:w="120"/>
-              <w:bottom w:type="dxa" w:w="80"/>
-              <w:right w:type="dxa" w:w="120"/>
-            </w:tcMar>
-          </w:tcPr>
-          <w:p>
-            <w:r>
-              <w:t xml:space="preserve">Abra la conversación y respóndale (sección 4).</w:t>
-            </w:r>
-          </w:p>
-        </w:tc>
-      </w:tr>
-      <w:tr>
-        <w:tc>
-          <w:tcPr>
-            <w:tcW w:type="dxa" w:w="3200"/>
-            <w:tcMar>
-              <w:top w:type="dxa" w:w="80"/>
-              <w:left w:type="dxa" w:w="120"/>
-              <w:bottom w:type="dxa" w:w="80"/>
-              <w:right w:type="dxa" w:w="120"/>
-            </w:tcMar>
-          </w:tcPr>
-          <w:p>
-            <w:r>
-              <w:rPr>
-                <w:b/>
-                <w:bCs/>
-              </w:rPr>
-              <w:t xml:space="preserve">Aviso a personal de guardia</w:t>
-            </w:r>
-          </w:p>
-        </w:tc>
-        <w:tc>
-          <w:tcPr>
-            <w:tcW w:type="dxa" w:w="5826"/>
-            <w:tcMar>
-              <w:top w:type="dxa" w:w="80"/>
-              <w:left w:type="dxa" w:w="120"/>
-              <w:bottom w:type="dxa" w:w="80"/>
-              <w:right w:type="dxa" w:w="120"/>
-            </w:tcMar>
-          </w:tcPr>
-          <w:p>
-            <w:r>
-              <w:t xml:space="preserve">Un paciente pidió ayuda fuera de horario y recibió el WhatsApp de guardia. Revise al día siguiente si quedó algo pendiente.</w:t>
-            </w:r>
-          </w:p>
-        </w:tc>
-      </w:tr>
-      <w:tr>
-        <w:tc>
-          <w:tcPr>
-            <w:tcW w:type="dxa" w:w="3200"/>
-            <w:tcMar>
-              <w:top w:type="dxa" w:w="80"/>
-              <w:left w:type="dxa" w:w="120"/>
-              <w:bottom w:type="dxa" w:w="80"/>
-              <w:right w:type="dxa" w:w="120"/>
-            </w:tcMar>
-          </w:tcPr>
-          <w:p>
-            <w:r>
-              <w:rPr>
-                <w:b/>
-                <w:bCs/>
-              </w:rPr>
-              <w:t xml:space="preserve">Cita cancelada por WhatsApp</w:t>
-            </w:r>
-          </w:p>
-        </w:tc>
-        <w:tc>
-          <w:tcPr>
-            <w:tcW w:type="dxa" w:w="5826"/>
-            <w:tcMar>
-              <w:top w:type="dxa" w:w="80"/>
-              <w:left w:type="dxa" w:w="120"/>
-              <w:bottom w:type="dxa" w:w="80"/>
-              <w:right w:type="dxa" w:w="120"/>
-            </w:tcMar>
-          </w:tcPr>
-          <w:p>
-            <w:r>
-              <w:t xml:space="preserve">Informativo: el horario quedó libre.</w:t>
-            </w:r>
-          </w:p>
-        </w:tc>
-      </w:tr>
-    </w:tbl>
-    <w:p>
-      <w:pPr>
-        <w:spacing w:after="120"/>
-      </w:pPr>
+        <w:t xml:space="preserve">7. Pacientes</w:t>
+      </w:r>
+    </w:p>
+    <w:p>
+      <w:pPr>
+        <w:pStyle w:val="ListParagraph"/>
+        <w:numPr>
+          <w:ilvl w:val="0"/>
+          <w:numId w:val="2"/>
+        </w:numPr>
+        <w:spacing w:after="80"/>
+      </w:pPr>
+      <w:r>
+        <w:t xml:space="preserve">En </w:t>
+      </w:r>
+      <w:r>
+        <w:rPr>
+          <w:b/>
+          <w:bCs/>
+        </w:rPr>
+        <w:t xml:space="preserve">🧑 Pacientes</w:t>
+      </w:r>
+      <w:r>
+        <w:t xml:space="preserve"> busque por </w:t>
+      </w:r>
+      <w:r>
+        <w:rPr>
+          <w:b/>
+          <w:bCs/>
+        </w:rPr>
+        <w:t xml:space="preserve">nombre o número</w:t>
+      </w:r>
+      <w:r>
+        <w:t xml:space="preserve">.</w:t>
+      </w:r>
+    </w:p>
+    <w:p>
+      <w:pPr>
+        <w:pStyle w:val="ListParagraph"/>
+        <w:numPr>
+          <w:ilvl w:val="0"/>
+          <w:numId w:val="2"/>
+        </w:numPr>
+        <w:spacing w:after="80"/>
+      </w:pPr>
+      <w:r>
+        <w:t xml:space="preserve">Al abrir un paciente verá su número, sus </w:t>
+      </w:r>
+      <w:r>
+        <w:rPr>
+          <w:b/>
+          <w:bCs/>
+        </w:rPr>
+        <w:t xml:space="preserve">familiares</w:t>
+      </w:r>
+      <w:r>
+        <w:t xml:space="preserve"> registrados con el mismo WhatsApp y si </w:t>
+      </w:r>
+      <w:r>
+        <w:rPr>
+          <w:b/>
+          <w:bCs/>
+        </w:rPr>
+        <w:t xml:space="preserve">aceptó</w:t>
+      </w:r>
+      <w:r>
+        <w:t xml:space="preserve"> el tratamiento de datos.</w:t>
+      </w:r>
+    </w:p>
+    <w:p>
+      <w:pPr>
+        <w:pStyle w:val="ListParagraph"/>
+        <w:numPr>
+          <w:ilvl w:val="0"/>
+          <w:numId w:val="2"/>
+        </w:numPr>
+        <w:spacing w:after="80"/>
+      </w:pPr>
+      <w:r>
+        <w:t xml:space="preserve">El sistema solo guarda </w:t>
+      </w:r>
+      <w:r>
+        <w:rPr>
+          <w:b/>
+          <w:bCs/>
+        </w:rPr>
+        <w:t xml:space="preserve">nombre y número de WhatsApp</w:t>
+      </w:r>
+      <w:r>
+        <w:t xml:space="preserve">. No se registran diagnósticos ni datos clínicos.</w:t>
+      </w:r>
     </w:p>
     <w:p>
       <w:pPr>
@@ -3954,7 +4161,7 @@
           <wp:inline distT="0" distB="0" distL="0" distR="0">
             <wp:extent cx="5715000" cy="3571875"/>
             <wp:effectExtent t="0" r="0" b="0" l="0"/>
-            <wp:docPr id="1" name="11-alertas" descr="Alertas: una emergencia (rojo) y un paciente que espera a recepción (azul)." title="Alertas: una emergencia (rojo) y un paciente que espera a recepción (azul)."/>
+            <wp:docPr id="1" name="10-pacientes" descr="Lista de pacientes con su autorización de datos." title="Lista de pacientes con su autorización de datos."/>
             <wp:cNvGraphicFramePr>
               <a:graphicFrameLocks xmlns:a="http://schemas.openxmlformats.org/drawingml/2006/main" noChangeAspect="1"/>
             </wp:cNvGraphicFramePr>
@@ -4003,7 +4210,391 @@
           <w:sz w:val="18"/>
           <w:szCs w:val="18"/>
         </w:rPr>
-        <w:t xml:space="preserve">Figura 12. Alertas: una emergencia (rojo) y un paciente que espera a recepción (azul).</w:t>
+        <w:t xml:space="preserve">Figura 12. Lista de pacientes con su autorización de datos.</w:t>
+      </w:r>
+    </w:p>
+    <w:tbl>
+      <w:tblPr>
+        <w:tblW w:type="dxa" w:w="9026"/>
+        <w:tblBorders>
+          <w:top w:val="single" w:color="auto" w:sz="4"/>
+          <w:left w:val="single" w:color="auto" w:sz="4"/>
+          <w:bottom w:val="single" w:color="auto" w:sz="4"/>
+          <w:right w:val="single" w:color="auto" w:sz="4"/>
+          <w:insideH w:val="single" w:color="auto" w:sz="4"/>
+          <w:insideV w:val="single" w:color="auto" w:sz="4"/>
+        </w:tblBorders>
+      </w:tblPr>
+      <w:tblGrid>
+        <w:gridCol w:w="9026"/>
+      </w:tblGrid>
+      <w:tr>
+        <w:tc>
+          <w:tcPr>
+            <w:tcW w:type="dxa" w:w="9026"/>
+            <w:tcBorders>
+              <w:top w:val="none" w:color="FFFFFF" w:sz="0"/>
+              <w:left w:val="single" w:color="0B5E7E" w:sz="24"/>
+              <w:bottom w:val="none" w:color="FFFFFF" w:sz="0"/>
+              <w:right w:val="none" w:color="FFFFFF" w:sz="0"/>
+            </w:tcBorders>
+            <w:shd w:fill="EEF6F9" w:color="auto" w:val="clear"/>
+            <w:tcMar>
+              <w:top w:type="dxa" w:w="120"/>
+              <w:left w:type="dxa" w:w="200"/>
+              <w:bottom w:type="dxa" w:w="120"/>
+              <w:right w:type="dxa" w:w="200"/>
+            </w:tcMar>
+          </w:tcPr>
+          <w:p>
+            <w:pPr>
+              <w:spacing w:after="80"/>
+            </w:pPr>
+            <w:r>
+              <w:rPr>
+                <w:b/>
+                <w:bCs/>
+                <w:color w:val="0B5E7E"/>
+              </w:rPr>
+              <w:t xml:space="preserve">Solicitudes de eliminación de datos</w:t>
+            </w:r>
+          </w:p>
+          <w:p>
+            <w:pPr>
+              <w:spacing w:after="60"/>
+            </w:pPr>
+            <w:r>
+              <w:t xml:space="preserve">Si un paciente pide que </w:t>
+            </w:r>
+            <w:r>
+              <w:rPr>
+                <w:b/>
+                <w:bCs/>
+              </w:rPr>
+              <w:t xml:space="preserve">borren sus datos</w:t>
+            </w:r>
+            <w:r>
+              <w:t xml:space="preserve">, confirme que escribe desde el mismo número registrado y </w:t>
+            </w:r>
+            <w:r>
+              <w:rPr>
+                <w:b/>
+                <w:bCs/>
+              </w:rPr>
+              <w:t xml:space="preserve">avise a la administradora</w:t>
+            </w:r>
+            <w:r>
+              <w:t xml:space="preserve">, que es quien realiza la eliminación.</w:t>
+            </w:r>
+          </w:p>
+        </w:tc>
+      </w:tr>
+    </w:tbl>
+    <w:p>
+      <w:pPr>
+        <w:pStyle w:val="Heading1"/>
+        <w:spacing w:after="160" w:before="360"/>
+      </w:pPr>
+      <w:r>
+        <w:t xml:space="preserve">8. Alertas</w:t>
+      </w:r>
+    </w:p>
+    <w:tbl>
+      <w:tblPr>
+        <w:tblW w:type="dxa" w:w="9026"/>
+        <w:tblBorders>
+          <w:top w:val="single" w:color="auto" w:sz="4"/>
+          <w:left w:val="single" w:color="auto" w:sz="4"/>
+          <w:bottom w:val="single" w:color="auto" w:sz="4"/>
+          <w:right w:val="single" w:color="auto" w:sz="4"/>
+          <w:insideH w:val="single" w:color="auto" w:sz="4"/>
+          <w:insideV w:val="single" w:color="auto" w:sz="4"/>
+        </w:tblBorders>
+      </w:tblPr>
+      <w:tblGrid>
+        <w:gridCol w:w="3200"/>
+        <w:gridCol w:w="5826"/>
+      </w:tblGrid>
+      <w:tr>
+        <w:trPr>
+          <w:tblHeader/>
+        </w:trPr>
+        <w:tc>
+          <w:tcPr>
+            <w:tcW w:type="dxa" w:w="3200"/>
+            <w:shd w:fill="0B5E7E" w:color="auto" w:val="clear"/>
+            <w:tcMar>
+              <w:top w:type="dxa" w:w="80"/>
+              <w:left w:type="dxa" w:w="120"/>
+              <w:bottom w:type="dxa" w:w="80"/>
+              <w:right w:type="dxa" w:w="120"/>
+            </w:tcMar>
+          </w:tcPr>
+          <w:p>
+            <w:r>
+              <w:rPr>
+                <w:b/>
+                <w:bCs/>
+                <w:color w:val="FFFFFF"/>
+              </w:rPr>
+              <w:t xml:space="preserve">Tipo de alerta</w:t>
+            </w:r>
+          </w:p>
+        </w:tc>
+        <w:tc>
+          <w:tcPr>
+            <w:tcW w:type="dxa" w:w="5826"/>
+            <w:shd w:fill="0B5E7E" w:color="auto" w:val="clear"/>
+            <w:tcMar>
+              <w:top w:type="dxa" w:w="80"/>
+              <w:left w:type="dxa" w:w="120"/>
+              <w:bottom w:type="dxa" w:w="80"/>
+              <w:right w:type="dxa" w:w="120"/>
+            </w:tcMar>
+          </w:tcPr>
+          <w:p>
+            <w:r>
+              <w:rPr>
+                <w:b/>
+                <w:bCs/>
+                <w:color w:val="FFFFFF"/>
+              </w:rPr>
+              <w:t xml:space="preserve">Qué hacer</w:t>
+            </w:r>
+          </w:p>
+        </w:tc>
+      </w:tr>
+      <w:tr>
+        <w:tc>
+          <w:tcPr>
+            <w:tcW w:type="dxa" w:w="3200"/>
+            <w:tcMar>
+              <w:top w:type="dxa" w:w="80"/>
+              <w:left w:type="dxa" w:w="120"/>
+              <w:bottom w:type="dxa" w:w="80"/>
+              <w:right w:type="dxa" w:w="120"/>
+            </w:tcMar>
+          </w:tcPr>
+          <w:p>
+            <w:r>
+              <w:t xml:space="preserve">🚨 </w:t>
+            </w:r>
+            <w:r>
+              <w:rPr>
+                <w:b/>
+                <w:bCs/>
+              </w:rPr>
+              <w:t xml:space="preserve">Emergencia</w:t>
+            </w:r>
+          </w:p>
+        </w:tc>
+        <w:tc>
+          <w:tcPr>
+            <w:tcW w:type="dxa" w:w="5826"/>
+            <w:tcMar>
+              <w:top w:type="dxa" w:w="80"/>
+              <w:left w:type="dxa" w:w="120"/>
+              <w:bottom w:type="dxa" w:w="80"/>
+              <w:right w:type="dxa" w:w="120"/>
+            </w:tcMar>
+          </w:tcPr>
+          <w:p>
+            <w:r>
+              <w:t xml:space="preserve">Gia ya le indicó llamar al 911. Revise la conversación y, si corresponde, </w:t>
+            </w:r>
+            <w:r>
+              <w:rPr>
+                <w:b/>
+                <w:bCs/>
+              </w:rPr>
+              <w:t xml:space="preserve">llame al paciente</w:t>
+            </w:r>
+            <w:r>
+              <w:t xml:space="preserve">.</w:t>
+            </w:r>
+          </w:p>
+        </w:tc>
+      </w:tr>
+      <w:tr>
+        <w:tc>
+          <w:tcPr>
+            <w:tcW w:type="dxa" w:w="3200"/>
+            <w:tcMar>
+              <w:top w:type="dxa" w:w="80"/>
+              <w:left w:type="dxa" w:w="120"/>
+              <w:bottom w:type="dxa" w:w="80"/>
+              <w:right w:type="dxa" w:w="120"/>
+            </w:tcMar>
+          </w:tcPr>
+          <w:p>
+            <w:r>
+              <w:rPr>
+                <w:b/>
+                <w:bCs/>
+              </w:rPr>
+              <w:t xml:space="preserve">Paciente espera a un recepcionista</w:t>
+            </w:r>
+          </w:p>
+        </w:tc>
+        <w:tc>
+          <w:tcPr>
+            <w:tcW w:type="dxa" w:w="5826"/>
+            <w:tcMar>
+              <w:top w:type="dxa" w:w="80"/>
+              <w:left w:type="dxa" w:w="120"/>
+              <w:bottom w:type="dxa" w:w="80"/>
+              <w:right w:type="dxa" w:w="120"/>
+            </w:tcMar>
+          </w:tcPr>
+          <w:p>
+            <w:r>
+              <w:t xml:space="preserve">Abra la conversación y respóndale (sección 4).</w:t>
+            </w:r>
+          </w:p>
+        </w:tc>
+      </w:tr>
+      <w:tr>
+        <w:tc>
+          <w:tcPr>
+            <w:tcW w:type="dxa" w:w="3200"/>
+            <w:tcMar>
+              <w:top w:type="dxa" w:w="80"/>
+              <w:left w:type="dxa" w:w="120"/>
+              <w:bottom w:type="dxa" w:w="80"/>
+              <w:right w:type="dxa" w:w="120"/>
+            </w:tcMar>
+          </w:tcPr>
+          <w:p>
+            <w:r>
+              <w:rPr>
+                <w:b/>
+                <w:bCs/>
+              </w:rPr>
+              <w:t xml:space="preserve">Aviso a personal de guardia</w:t>
+            </w:r>
+          </w:p>
+        </w:tc>
+        <w:tc>
+          <w:tcPr>
+            <w:tcW w:type="dxa" w:w="5826"/>
+            <w:tcMar>
+              <w:top w:type="dxa" w:w="80"/>
+              <w:left w:type="dxa" w:w="120"/>
+              <w:bottom w:type="dxa" w:w="80"/>
+              <w:right w:type="dxa" w:w="120"/>
+            </w:tcMar>
+          </w:tcPr>
+          <w:p>
+            <w:r>
+              <w:t xml:space="preserve">Un paciente pidió ayuda fuera de horario y recibió el WhatsApp de guardia. Revise al día siguiente si quedó algo pendiente.</w:t>
+            </w:r>
+          </w:p>
+        </w:tc>
+      </w:tr>
+      <w:tr>
+        <w:tc>
+          <w:tcPr>
+            <w:tcW w:type="dxa" w:w="3200"/>
+            <w:tcMar>
+              <w:top w:type="dxa" w:w="80"/>
+              <w:left w:type="dxa" w:w="120"/>
+              <w:bottom w:type="dxa" w:w="80"/>
+              <w:right w:type="dxa" w:w="120"/>
+            </w:tcMar>
+          </w:tcPr>
+          <w:p>
+            <w:r>
+              <w:rPr>
+                <w:b/>
+                <w:bCs/>
+              </w:rPr>
+              <w:t xml:space="preserve">Cita cancelada por WhatsApp</w:t>
+            </w:r>
+          </w:p>
+        </w:tc>
+        <w:tc>
+          <w:tcPr>
+            <w:tcW w:type="dxa" w:w="5826"/>
+            <w:tcMar>
+              <w:top w:type="dxa" w:w="80"/>
+              <w:left w:type="dxa" w:w="120"/>
+              <w:bottom w:type="dxa" w:w="80"/>
+              <w:right w:type="dxa" w:w="120"/>
+            </w:tcMar>
+          </w:tcPr>
+          <w:p>
+            <w:r>
+              <w:t xml:space="preserve">Informativo: el horario quedó libre.</w:t>
+            </w:r>
+          </w:p>
+        </w:tc>
+      </w:tr>
+    </w:tbl>
+    <w:p>
+      <w:pPr>
+        <w:spacing w:after="120"/>
+      </w:pPr>
+    </w:p>
+    <w:p>
+      <w:pPr>
+        <w:spacing w:after="60" w:before="120"/>
+        <w:jc w:val="center"/>
+      </w:pPr>
+      <w:r>
+        <w:drawing>
+          <wp:inline distT="0" distB="0" distL="0" distR="0">
+            <wp:extent cx="5715000" cy="3571875"/>
+            <wp:effectExtent t="0" r="0" b="0" l="0"/>
+            <wp:docPr id="1" name="11-alertas" descr="Alertas: una emergencia (rojo) y un paciente que espera a recepción (azul)." title="Alertas: una emergencia (rojo) y un paciente que espera a recepción (azul)."/>
+            <wp:cNvGraphicFramePr>
+              <a:graphicFrameLocks xmlns:a="http://schemas.openxmlformats.org/drawingml/2006/main" noChangeAspect="1"/>
+            </wp:cNvGraphicFramePr>
+            <a:graphic xmlns:a="http://schemas.openxmlformats.org/drawingml/2006/main">
+              <a:graphicData uri="http://schemas.openxmlformats.org/drawingml/2006/picture">
+                <pic:pic xmlns:pic="http://schemas.openxmlformats.org/drawingml/2006/picture">
+                  <pic:nvPicPr>
+                    <pic:cNvPr id="0" name="" descr=""/>
+                    <pic:cNvPicPr>
+                      <a:picLocks noChangeAspect="1" noChangeArrowheads="1"/>
+                    </pic:cNvPicPr>
+                  </pic:nvPicPr>
+                  <pic:blipFill>
+                    <a:blip r:embed="rId21" cstate="none"/>
+                    <a:srcRect/>
+                    <a:stretch>
+                      <a:fillRect/>
+                    </a:stretch>
+                  </pic:blipFill>
+                  <pic:spPr bwMode="auto">
+                    <a:xfrm>
+                      <a:off x="0" y="0"/>
+                      <a:ext cx="5715000" cy="3571875"/>
+                    </a:xfrm>
+                    <a:prstGeom prst="rect">
+                      <a:avLst/>
+                    </a:prstGeom>
+                  </pic:spPr>
+                </pic:pic>
+              </a:graphicData>
+            </a:graphic>
+          </wp:inline>
+        </w:drawing>
+      </w:r>
+    </w:p>
+    <w:p>
+      <w:pPr>
+        <w:spacing w:after="200"/>
+        <w:jc w:val="center"/>
+      </w:pPr>
+      <w:r>
+        <w:rPr>
+          <w:i/>
+          <w:iCs/>
+          <w:color w:val="666666"/>
+          <w:sz w:val="18"/>
+          <w:szCs w:val="18"/>
+        </w:rPr>
+        <w:t xml:space="preserve">Figura 13. Alertas: una emergencia (rojo) y un paciente que espera a recepción (azul).</w:t>
       </w:r>
     </w:p>
     <w:p>
@@ -4415,6 +5006,77 @@
           <w:p>
             <w:r>
               <w:t xml:space="preserve">Probablemente pasaron más de 24 horas desde su último mensaje. Pídale por otra vía que vuelva a escribir.</w:t>
+            </w:r>
+          </w:p>
+        </w:tc>
+      </w:tr>
+      <w:tr>
+        <w:tc>
+          <w:tcPr>
+            <w:tcW w:type="dxa" w:w="3400"/>
+            <w:tcMar>
+              <w:top w:type="dxa" w:w="80"/>
+              <w:left w:type="dxa" w:w="120"/>
+              <w:bottom w:type="dxa" w:w="80"/>
+              <w:right w:type="dxa" w:w="120"/>
+            </w:tcMar>
+          </w:tcPr>
+          <w:p>
+            <w:r>
+              <w:rPr>
+                <w:b/>
+                <w:bCs/>
+              </w:rPr>
+              <w:t xml:space="preserve">No suena</w:t>
+            </w:r>
+            <w:r>
+              <w:t xml:space="preserve"> o </w:t>
+            </w:r>
+            <w:r>
+              <w:rPr>
+                <w:b/>
+                <w:bCs/>
+              </w:rPr>
+              <w:t xml:space="preserve">no llegan las notificaciones</w:t>
+            </w:r>
+            <w:r>
+              <w:t xml:space="preserve">.</w:t>
+            </w:r>
+          </w:p>
+        </w:tc>
+        <w:tc>
+          <w:tcPr>
+            <w:tcW w:type="dxa" w:w="5626"/>
+            <w:tcMar>
+              <w:top w:type="dxa" w:w="80"/>
+              <w:left w:type="dxa" w:w="120"/>
+              <w:bottom w:type="dxa" w:w="80"/>
+              <w:right w:type="dxa" w:w="120"/>
+            </w:tcMar>
+          </w:tcPr>
+          <w:p>
+            <w:r>
+              <w:t xml:space="preserve">Pulse </w:t>
+            </w:r>
+            <w:r>
+              <w:rPr>
+                <w:b/>
+                <w:bCs/>
+              </w:rPr>
+              <w:t xml:space="preserve">«🔔 Avisos activados · probar»</w:t>
+            </w:r>
+            <w:r>
+              <w:t xml:space="preserve"> en el menú. Si no llega la prueba: revise que Chrome tenga permiso de notificaciones (candado junto a la dirección → Notificaciones → </w:t>
+            </w:r>
+            <w:r>
+              <w:rPr>
+                <w:b/>
+                <w:bCs/>
+              </w:rPr>
+              <w:t xml:space="preserve">Permitir</w:t>
+            </w:r>
+            <w:r>
+              <w:t xml:space="preserve">), que el celular no esté en «No molestar» y que no haya cerrado sesión. Con el panel abierto, toque la pantalla una vez para habilitar el sonido.</w:t>
             </w:r>
           </w:p>
         </w:tc>
@@ -4769,6 +5431,18 @@
       </w:pPr>
     </w:lvl>
   </w:abstractNum>
+  <w:abstractNum w:abstractNumId="7" w15:restartNumberingAfterBreak="0">
+    <w:multiLevelType w:val="hybridMultilevel"/>
+    <w:lvl w:ilvl="0" w15:tentative="1">
+      <w:start w:val="1"/>
+      <w:numFmt w:val="decimal"/>
+      <w:lvlText w:val="%1."/>
+      <w:lvlJc w:val="left"/>
+      <w:pPr>
+        <w:ind w:left="540" w:hanging="300"/>
+      </w:pPr>
+    </w:lvl>
+  </w:abstractNum>
   <w:num w:numId="1">
     <w:abstractNumId w:val="1"/>
     <w:lvlOverride w:ilvl="0">
@@ -4801,6 +5475,12 @@
   </w:num>
   <w:num w:numId="6">
     <w:abstractNumId w:val="6"/>
+    <w:lvlOverride w:ilvl="0">
+      <w:startOverride w:val="1"/>
+    </w:lvlOverride>
+  </w:num>
+  <w:num w:numId="7">
+    <w:abstractNumId w:val="7"/>
     <w:lvlOverride w:ilvl="0">
       <w:startOverride w:val="1"/>
     </w:lvlOverride>

</xml_diff>

<commit_message>
Manual de recepción: marcar citas atendidas, encuesta de satisfacción y recordatorios no enviados
Co-Authored-By: Claude Opus 5.5 <noreply@anthropic.com>
Claude-Session: https://claude.ai/code/session_01M9J19rHEn3Sf8xzUA5SjEa
</commit_message>
<xml_diff>
--- a/mediconnect/docs/Manual_Recepcion_MediConnect.docx
+++ b/mediconnect/docs/Manual_Recepcion_MediConnect.docx
@@ -3314,7 +3314,17 @@
           </w:tcPr>
           <w:p>
             <w:r>
-              <w:t xml:space="preserve">El paciente ya fue atendido.</w:t>
+              <w:t xml:space="preserve">El paciente ya fue atendido. </w:t>
+            </w:r>
+            <w:r>
+              <w:rPr>
+                <w:b/>
+                <w:bCs/>
+              </w:rPr>
+              <w:t xml:space="preserve">Márquelo siempre, el mismo día</w:t>
+            </w:r>
+            <w:r>
+              <w:t xml:space="preserve">: unas 2 horas después Gia le envía la encuesta de satisfacción.</w:t>
             </w:r>
           </w:p>
         </w:tc>
@@ -3498,40 +3508,8 @@
     </w:tbl>
     <w:p>
       <w:pPr>
-        <w:pStyle w:val="Heading1"/>
-        <w:spacing w:after="160" w:before="360"/>
-      </w:pPr>
-      <w:r>
-        <w:t xml:space="preserve">6. Bloquear horarios</w:t>
-      </w:r>
-    </w:p>
-    <w:p>
-      <w:pPr>
         <w:spacing w:after="120"/>
       </w:pPr>
-      <w:r>
-        <w:t xml:space="preserve">Use esta opción cuando un médico </w:t>
-      </w:r>
-      <w:r>
-        <w:rPr>
-          <w:b/>
-          <w:bCs/>
-        </w:rPr>
-        <w:t xml:space="preserve">no va a atender</w:t>
-      </w:r>
-      <w:r>
-        <w:t xml:space="preserve"> en ciertas horas o días: vacaciones, cirugías, reuniones, permisos. Mientras esté bloqueado, Gia </w:t>
-      </w:r>
-      <w:r>
-        <w:rPr>
-          <w:b/>
-          <w:bCs/>
-        </w:rPr>
-        <w:t xml:space="preserve">no ofrece</w:t>
-      </w:r>
-      <w:r>
-        <w:t xml:space="preserve"> esas horas por WhatsApp y tampoco aparecen al crear citas en el panel.</w:t>
-      </w:r>
     </w:p>
     <w:p>
       <w:pPr>
@@ -3539,7 +3517,35 @@
         <w:spacing w:after="120" w:before="240"/>
       </w:pPr>
       <w:r>
-        <w:t xml:space="preserve">Crear un bloqueo</w:t>
+        <w:t xml:space="preserve">Marcar las citas atendidas y la encuesta de satisfacción</w:t>
+      </w:r>
+    </w:p>
+    <w:p>
+      <w:pPr>
+        <w:spacing w:after="120"/>
+      </w:pPr>
+      <w:r>
+        <w:t xml:space="preserve">Cuando el paciente termina su consulta, abra su cita en el calendario y pulse </w:t>
+      </w:r>
+      <w:r>
+        <w:rPr>
+          <w:b/>
+          <w:bCs/>
+        </w:rPr>
+        <w:t xml:space="preserve">Atendida</w:t>
+      </w:r>
+      <w:r>
+        <w:t xml:space="preserve">. Esto es importante por dos razones: el calendario queda al día y Gia puede pedirle al paciente que </w:t>
+      </w:r>
+      <w:r>
+        <w:rPr>
+          <w:b/>
+          <w:bCs/>
+        </w:rPr>
+        <w:t xml:space="preserve">califique la atención</w:t>
+      </w:r>
+      <w:r>
+        <w:t xml:space="preserve">.</w:t>
       </w:r>
     </w:p>
     <w:p>
@@ -3552,27 +3558,37 @@
         <w:spacing w:after="80"/>
       </w:pPr>
       <w:r>
-        <w:t xml:space="preserve">En </w:t>
-      </w:r>
-      <w:r>
-        <w:rPr>
-          <w:b/>
-          <w:bCs/>
-        </w:rPr>
-        <w:t xml:space="preserve">📅 Calendario</w:t>
-      </w:r>
-      <w:r>
-        <w:t xml:space="preserve"> pulse </w:t>
-      </w:r>
-      <w:r>
-        <w:rPr>
-          <w:b/>
-          <w:bCs/>
-        </w:rPr>
-        <w:t xml:space="preserve">⛔ Bloquear horario</w:t>
-      </w:r>
-      <w:r>
-        <w:t xml:space="preserve">.</w:t>
+        <w:t xml:space="preserve">Unas </w:t>
+      </w:r>
+      <w:r>
+        <w:rPr>
+          <w:b/>
+          <w:bCs/>
+        </w:rPr>
+        <w:t xml:space="preserve">2 horas</w:t>
+      </w:r>
+      <w:r>
+        <w:t xml:space="preserve"> después de marcar la cita como atendida, Gia le escribe al paciente: «⭐ ¿Cómo fue su atención?» y le pide un número del </w:t>
+      </w:r>
+      <w:r>
+        <w:rPr>
+          <w:b/>
+          <w:bCs/>
+        </w:rPr>
+        <w:t xml:space="preserve">1</w:t>
+      </w:r>
+      <w:r>
+        <w:t xml:space="preserve"> (muy mala) al </w:t>
+      </w:r>
+      <w:r>
+        <w:rPr>
+          <w:b/>
+          <w:bCs/>
+        </w:rPr>
+        <w:t xml:space="preserve">5</w:t>
+      </w:r>
+      <w:r>
+        <w:t xml:space="preserve"> (excelente).</w:t>
       </w:r>
     </w:p>
     <w:p>
@@ -3585,17 +3601,17 @@
         <w:spacing w:after="80"/>
       </w:pPr>
       <w:r>
-        <w:t xml:space="preserve">Elija el </w:t>
-      </w:r>
-      <w:r>
-        <w:rPr>
-          <w:b/>
-          <w:bCs/>
-        </w:rPr>
-        <w:t xml:space="preserve">profesional</w:t>
-      </w:r>
-      <w:r>
-        <w:t xml:space="preserve">. Si atiende varias especialidades, el bloqueo vale para todas.</w:t>
+        <w:t xml:space="preserve">Si califica con </w:t>
+      </w:r>
+      <w:r>
+        <w:rPr>
+          <w:b/>
+          <w:bCs/>
+        </w:rPr>
+        <w:t xml:space="preserve">3, 4 o 5</w:t>
+      </w:r>
+      <w:r>
+        <w:t xml:space="preserve">, Gia le agradece.</w:t>
       </w:r>
     </w:p>
     <w:p>
@@ -3608,27 +3624,27 @@
         <w:spacing w:after="80"/>
       </w:pPr>
       <w:r>
-        <w:t xml:space="preserve">Elija </w:t>
-      </w:r>
-      <w:r>
-        <w:rPr>
-          <w:b/>
-          <w:bCs/>
-        </w:rPr>
-        <w:t xml:space="preserve">Desde (fecha)</w:t>
-      </w:r>
-      <w:r>
-        <w:t xml:space="preserve"> y </w:t>
-      </w:r>
-      <w:r>
-        <w:rPr>
-          <w:b/>
-          <w:bCs/>
-        </w:rPr>
-        <w:t xml:space="preserve">Hasta (fecha)</w:t>
-      </w:r>
-      <w:r>
-        <w:t xml:space="preserve">.</w:t>
+        <w:t xml:space="preserve">Si califica con </w:t>
+      </w:r>
+      <w:r>
+        <w:rPr>
+          <w:b/>
+          <w:bCs/>
+        </w:rPr>
+        <w:t xml:space="preserve">1 o 2</w:t>
+      </w:r>
+      <w:r>
+        <w:t xml:space="preserve">, Gia le pregunta </w:t>
+      </w:r>
+      <w:r>
+        <w:rPr>
+          <w:b/>
+          <w:bCs/>
+        </w:rPr>
+        <w:t xml:space="preserve">«¿Qué podemos mejorar?»</w:t>
+      </w:r>
+      <w:r>
+        <w:t xml:space="preserve"> y guarda su comentario.</w:t>
       </w:r>
     </w:p>
     <w:p>
@@ -3636,42 +3652,32 @@
         <w:pStyle w:val="ListParagraph"/>
         <w:numPr>
           <w:ilvl w:val="0"/>
-          <w:numId w:val="7"/>
+          <w:numId w:val="2"/>
         </w:numPr>
         <w:spacing w:after="80"/>
       </w:pPr>
       <w:r>
-        <w:t xml:space="preserve">Deje marcado </w:t>
-      </w:r>
-      <w:r>
-        <w:rPr>
-          <w:b/>
-          <w:bCs/>
-        </w:rPr>
-        <w:t xml:space="preserve">«Todo el día»</w:t>
-      </w:r>
-      <w:r>
-        <w:t xml:space="preserve">, o desmárquelo y escriba </w:t>
-      </w:r>
-      <w:r>
-        <w:rPr>
-          <w:b/>
-          <w:bCs/>
-        </w:rPr>
-        <w:t xml:space="preserve">Hora desde</w:t>
-      </w:r>
-      <w:r>
-        <w:t xml:space="preserve"> y </w:t>
-      </w:r>
-      <w:r>
-        <w:rPr>
-          <w:b/>
-          <w:bCs/>
-        </w:rPr>
-        <w:t xml:space="preserve">Hora hasta</w:t>
-      </w:r>
-      <w:r>
-        <w:t xml:space="preserve">.</w:t>
+        <w:t xml:space="preserve">La encuesta solo se envía entre las </w:t>
+      </w:r>
+      <w:r>
+        <w:rPr>
+          <w:b/>
+          <w:bCs/>
+        </w:rPr>
+        <w:t xml:space="preserve">09:00 y las 20:00</w:t>
+      </w:r>
+      <w:r>
+        <w:t xml:space="preserve">, como máximo </w:t>
+      </w:r>
+      <w:r>
+        <w:rPr>
+          <w:b/>
+          <w:bCs/>
+        </w:rPr>
+        <w:t xml:space="preserve">una vez por semana</w:t>
+      </w:r>
+      <w:r>
+        <w:t xml:space="preserve"> a cada número, y nunca mientras usted atiende ese chat.</w:t>
       </w:r>
     </w:p>
     <w:p>
@@ -3679,22 +3685,12 @@
         <w:pStyle w:val="ListParagraph"/>
         <w:numPr>
           <w:ilvl w:val="0"/>
-          <w:numId w:val="7"/>
+          <w:numId w:val="2"/>
         </w:numPr>
         <w:spacing w:after="80"/>
       </w:pPr>
       <w:r>
-        <w:t xml:space="preserve">Escriba un </w:t>
-      </w:r>
-      <w:r>
-        <w:rPr>
-          <w:b/>
-          <w:bCs/>
-        </w:rPr>
-        <w:t xml:space="preserve">motivo</w:t>
-      </w:r>
-      <w:r>
-        <w:t xml:space="preserve"> si desea (por ejemplo «Vacaciones»). Solo lo ve el personal, nunca el paciente.</w:t>
+        <w:t xml:space="preserve">Si el paciente no responde la encuesta y escribe otra cosa (por ejemplo, «quiero agendar»), Gia lo atiende normalmente.</w:t>
       </w:r>
     </w:p>
     <w:p>
@@ -3702,7 +3698,308 @@
         <w:pStyle w:val="ListParagraph"/>
         <w:numPr>
           <w:ilvl w:val="0"/>
-          <w:numId w:val="7"/>
+          <w:numId w:val="2"/>
+        </w:numPr>
+        <w:spacing w:after="80"/>
+      </w:pPr>
+      <w:r>
+        <w:t xml:space="preserve">Las calificaciones y comentarios los revisa la administradora en </w:t>
+      </w:r>
+      <w:r>
+        <w:rPr>
+          <w:b/>
+          <w:bCs/>
+        </w:rPr>
+        <w:t xml:space="preserve">Estadísticas</w:t>
+      </w:r>
+      <w:r>
+        <w:t xml:space="preserve">.</w:t>
+      </w:r>
+    </w:p>
+    <w:tbl>
+      <w:tblPr>
+        <w:tblW w:type="dxa" w:w="9026"/>
+        <w:tblBorders>
+          <w:top w:val="single" w:color="auto" w:sz="4"/>
+          <w:left w:val="single" w:color="auto" w:sz="4"/>
+          <w:bottom w:val="single" w:color="auto" w:sz="4"/>
+          <w:right w:val="single" w:color="auto" w:sz="4"/>
+          <w:insideH w:val="single" w:color="auto" w:sz="4"/>
+          <w:insideV w:val="single" w:color="auto" w:sz="4"/>
+        </w:tblBorders>
+      </w:tblPr>
+      <w:tblGrid>
+        <w:gridCol w:w="9026"/>
+      </w:tblGrid>
+      <w:tr>
+        <w:tc>
+          <w:tcPr>
+            <w:tcW w:type="dxa" w:w="9026"/>
+            <w:tcBorders>
+              <w:top w:val="none" w:color="FFFFFF" w:sz="0"/>
+              <w:left w:val="single" w:color="B26A00" w:sz="24"/>
+              <w:bottom w:val="none" w:color="FFFFFF" w:sz="0"/>
+              <w:right w:val="none" w:color="FFFFFF" w:sz="0"/>
+            </w:tcBorders>
+            <w:shd w:fill="FFF4E5" w:color="auto" w:val="clear"/>
+            <w:tcMar>
+              <w:top w:type="dxa" w:w="120"/>
+              <w:left w:type="dxa" w:w="200"/>
+              <w:bottom w:type="dxa" w:w="120"/>
+              <w:right w:type="dxa" w:w="200"/>
+            </w:tcMar>
+          </w:tcPr>
+          <w:p>
+            <w:pPr>
+              <w:spacing w:after="80"/>
+            </w:pPr>
+            <w:r>
+              <w:rPr>
+                <w:b/>
+                <w:bCs/>
+                <w:color w:val="B26A00"/>
+              </w:rPr>
+              <w:t xml:space="preserve">Si marca una cita por error</w:t>
+            </w:r>
+          </w:p>
+          <w:p>
+            <w:pPr>
+              <w:spacing w:after="60"/>
+            </w:pPr>
+            <w:r>
+              <w:t xml:space="preserve">Si marcó </w:t>
+            </w:r>
+            <w:r>
+              <w:rPr>
+                <w:b/>
+                <w:bCs/>
+              </w:rPr>
+              <w:t xml:space="preserve">Atendida</w:t>
+            </w:r>
+            <w:r>
+              <w:t xml:space="preserve"> a un paciente que no vino, cámbiela de inmediato a </w:t>
+            </w:r>
+            <w:r>
+              <w:rPr>
+                <w:b/>
+                <w:bCs/>
+              </w:rPr>
+              <w:t xml:space="preserve">No asistió</w:t>
+            </w:r>
+            <w:r>
+              <w:t xml:space="preserve">: así no se le envía la encuesta.</w:t>
+            </w:r>
+          </w:p>
+        </w:tc>
+      </w:tr>
+    </w:tbl>
+    <w:p>
+      <w:pPr>
+        <w:pStyle w:val="Heading1"/>
+        <w:spacing w:after="160" w:before="360"/>
+      </w:pPr>
+      <w:r>
+        <w:t xml:space="preserve">6. Bloquear horarios</w:t>
+      </w:r>
+    </w:p>
+    <w:p>
+      <w:pPr>
+        <w:spacing w:after="120"/>
+      </w:pPr>
+      <w:r>
+        <w:t xml:space="preserve">Use esta opción cuando un médico </w:t>
+      </w:r>
+      <w:r>
+        <w:rPr>
+          <w:b/>
+          <w:bCs/>
+        </w:rPr>
+        <w:t xml:space="preserve">no va a atender</w:t>
+      </w:r>
+      <w:r>
+        <w:t xml:space="preserve"> en ciertas horas o días: vacaciones, cirugías, reuniones, permisos. Mientras esté bloqueado, Gia </w:t>
+      </w:r>
+      <w:r>
+        <w:rPr>
+          <w:b/>
+          <w:bCs/>
+        </w:rPr>
+        <w:t xml:space="preserve">no ofrece</w:t>
+      </w:r>
+      <w:r>
+        <w:t xml:space="preserve"> esas horas por WhatsApp y tampoco aparecen al crear citas en el panel.</w:t>
+      </w:r>
+    </w:p>
+    <w:p>
+      <w:pPr>
+        <w:pStyle w:val="Heading2"/>
+        <w:spacing w:after="120" w:before="240"/>
+      </w:pPr>
+      <w:r>
+        <w:t xml:space="preserve">Crear un bloqueo</w:t>
+      </w:r>
+    </w:p>
+    <w:p>
+      <w:pPr>
+        <w:pStyle w:val="ListParagraph"/>
+        <w:numPr>
+          <w:ilvl w:val="0"/>
+          <w:numId w:val="8"/>
+        </w:numPr>
+        <w:spacing w:after="80"/>
+      </w:pPr>
+      <w:r>
+        <w:t xml:space="preserve">En </w:t>
+      </w:r>
+      <w:r>
+        <w:rPr>
+          <w:b/>
+          <w:bCs/>
+        </w:rPr>
+        <w:t xml:space="preserve">📅 Calendario</w:t>
+      </w:r>
+      <w:r>
+        <w:t xml:space="preserve"> pulse </w:t>
+      </w:r>
+      <w:r>
+        <w:rPr>
+          <w:b/>
+          <w:bCs/>
+        </w:rPr>
+        <w:t xml:space="preserve">⛔ Bloquear horario</w:t>
+      </w:r>
+      <w:r>
+        <w:t xml:space="preserve">.</w:t>
+      </w:r>
+    </w:p>
+    <w:p>
+      <w:pPr>
+        <w:pStyle w:val="ListParagraph"/>
+        <w:numPr>
+          <w:ilvl w:val="0"/>
+          <w:numId w:val="8"/>
+        </w:numPr>
+        <w:spacing w:after="80"/>
+      </w:pPr>
+      <w:r>
+        <w:t xml:space="preserve">Elija el </w:t>
+      </w:r>
+      <w:r>
+        <w:rPr>
+          <w:b/>
+          <w:bCs/>
+        </w:rPr>
+        <w:t xml:space="preserve">profesional</w:t>
+      </w:r>
+      <w:r>
+        <w:t xml:space="preserve">. Si atiende varias especialidades, el bloqueo vale para todas.</w:t>
+      </w:r>
+    </w:p>
+    <w:p>
+      <w:pPr>
+        <w:pStyle w:val="ListParagraph"/>
+        <w:numPr>
+          <w:ilvl w:val="0"/>
+          <w:numId w:val="8"/>
+        </w:numPr>
+        <w:spacing w:after="80"/>
+      </w:pPr>
+      <w:r>
+        <w:t xml:space="preserve">Elija </w:t>
+      </w:r>
+      <w:r>
+        <w:rPr>
+          <w:b/>
+          <w:bCs/>
+        </w:rPr>
+        <w:t xml:space="preserve">Desde (fecha)</w:t>
+      </w:r>
+      <w:r>
+        <w:t xml:space="preserve"> y </w:t>
+      </w:r>
+      <w:r>
+        <w:rPr>
+          <w:b/>
+          <w:bCs/>
+        </w:rPr>
+        <w:t xml:space="preserve">Hasta (fecha)</w:t>
+      </w:r>
+      <w:r>
+        <w:t xml:space="preserve">.</w:t>
+      </w:r>
+    </w:p>
+    <w:p>
+      <w:pPr>
+        <w:pStyle w:val="ListParagraph"/>
+        <w:numPr>
+          <w:ilvl w:val="0"/>
+          <w:numId w:val="8"/>
+        </w:numPr>
+        <w:spacing w:after="80"/>
+      </w:pPr>
+      <w:r>
+        <w:t xml:space="preserve">Deje marcado </w:t>
+      </w:r>
+      <w:r>
+        <w:rPr>
+          <w:b/>
+          <w:bCs/>
+        </w:rPr>
+        <w:t xml:space="preserve">«Todo el día»</w:t>
+      </w:r>
+      <w:r>
+        <w:t xml:space="preserve">, o desmárquelo y escriba </w:t>
+      </w:r>
+      <w:r>
+        <w:rPr>
+          <w:b/>
+          <w:bCs/>
+        </w:rPr>
+        <w:t xml:space="preserve">Hora desde</w:t>
+      </w:r>
+      <w:r>
+        <w:t xml:space="preserve"> y </w:t>
+      </w:r>
+      <w:r>
+        <w:rPr>
+          <w:b/>
+          <w:bCs/>
+        </w:rPr>
+        <w:t xml:space="preserve">Hora hasta</w:t>
+      </w:r>
+      <w:r>
+        <w:t xml:space="preserve">.</w:t>
+      </w:r>
+    </w:p>
+    <w:p>
+      <w:pPr>
+        <w:pStyle w:val="ListParagraph"/>
+        <w:numPr>
+          <w:ilvl w:val="0"/>
+          <w:numId w:val="8"/>
+        </w:numPr>
+        <w:spacing w:after="80"/>
+      </w:pPr>
+      <w:r>
+        <w:t xml:space="preserve">Escriba un </w:t>
+      </w:r>
+      <w:r>
+        <w:rPr>
+          <w:b/>
+          <w:bCs/>
+        </w:rPr>
+        <w:t xml:space="preserve">motivo</w:t>
+      </w:r>
+      <w:r>
+        <w:t xml:space="preserve"> si desea (por ejemplo «Vacaciones»). Solo lo ve el personal, nunca el paciente.</w:t>
+      </w:r>
+    </w:p>
+    <w:p>
+      <w:pPr>
+        <w:pStyle w:val="ListParagraph"/>
+        <w:numPr>
+          <w:ilvl w:val="0"/>
+          <w:numId w:val="8"/>
         </w:numPr>
         <w:spacing w:after="80"/>
       </w:pPr>
@@ -4529,6 +4826,54 @@
           </w:p>
         </w:tc>
       </w:tr>
+      <w:tr>
+        <w:tc>
+          <w:tcPr>
+            <w:tcW w:type="dxa" w:w="3200"/>
+            <w:tcMar>
+              <w:top w:type="dxa" w:w="80"/>
+              <w:left w:type="dxa" w:w="120"/>
+              <w:bottom w:type="dxa" w:w="80"/>
+              <w:right w:type="dxa" w:w="120"/>
+            </w:tcMar>
+          </w:tcPr>
+          <w:p>
+            <w:r>
+              <w:rPr>
+                <w:b/>
+                <w:bCs/>
+              </w:rPr>
+              <w:t xml:space="preserve">Recordatorio de cita no enviado por WhatsApp</w:t>
+            </w:r>
+          </w:p>
+        </w:tc>
+        <w:tc>
+          <w:tcPr>
+            <w:tcW w:type="dxa" w:w="5826"/>
+            <w:tcMar>
+              <w:top w:type="dxa" w:w="80"/>
+              <w:left w:type="dxa" w:w="120"/>
+              <w:bottom w:type="dxa" w:w="80"/>
+              <w:right w:type="dxa" w:w="120"/>
+            </w:tcMar>
+          </w:tcPr>
+          <w:p>
+            <w:r>
+              <w:t xml:space="preserve">WhatsApp no permitió enviar el recordatorio (el paciente no escribió en las últimas 24 horas). </w:t>
+            </w:r>
+            <w:r>
+              <w:rPr>
+                <w:b/>
+                <w:bCs/>
+              </w:rPr>
+              <w:t xml:space="preserve">Llame al paciente</w:t>
+            </w:r>
+            <w:r>
+              <w:t xml:space="preserve"> para recordarle su cita.</w:t>
+            </w:r>
+          </w:p>
+        </w:tc>
+      </w:tr>
     </w:tbl>
     <w:p>
       <w:pPr>
@@ -5094,6 +5439,104 @@
           </w:tcPr>
           <w:p>
             <w:r>
+              <w:t xml:space="preserve">Un paciente dice que </w:t>
+            </w:r>
+            <w:r>
+              <w:rPr>
+                <w:b/>
+                <w:bCs/>
+              </w:rPr>
+              <w:t xml:space="preserve">no le llegó el recordatorio</w:t>
+            </w:r>
+            <w:r>
+              <w:t xml:space="preserve">.</w:t>
+            </w:r>
+          </w:p>
+        </w:tc>
+        <w:tc>
+          <w:tcPr>
+            <w:tcW w:type="dxa" w:w="5626"/>
+            <w:tcMar>
+              <w:top w:type="dxa" w:w="80"/>
+              <w:left w:type="dxa" w:w="120"/>
+              <w:bottom w:type="dxa" w:w="80"/>
+              <w:right w:type="dxa" w:w="120"/>
+            </w:tcMar>
+          </w:tcPr>
+          <w:p>
+            <w:r>
+              <w:t xml:space="preserve">Revise </w:t>
+            </w:r>
+            <w:r>
+              <w:rPr>
+                <w:b/>
+                <w:bCs/>
+              </w:rPr>
+              <w:t xml:space="preserve">🔔 Alertas</w:t>
+            </w:r>
+            <w:r>
+              <w:t xml:space="preserve">: si aparece «Recordatorio de cita no enviado», WhatsApp no lo permitió. Confírmele la cita por teléfono o por el chat.</w:t>
+            </w:r>
+          </w:p>
+        </w:tc>
+      </w:tr>
+      <w:tr>
+        <w:tc>
+          <w:tcPr>
+            <w:tcW w:type="dxa" w:w="3400"/>
+            <w:tcMar>
+              <w:top w:type="dxa" w:w="80"/>
+              <w:left w:type="dxa" w:w="120"/>
+              <w:bottom w:type="dxa" w:w="80"/>
+              <w:right w:type="dxa" w:w="120"/>
+            </w:tcMar>
+          </w:tcPr>
+          <w:p>
+            <w:r>
+              <w:t xml:space="preserve">Un paciente respondió la </w:t>
+            </w:r>
+            <w:r>
+              <w:rPr>
+                <w:b/>
+                <w:bCs/>
+              </w:rPr>
+              <w:t xml:space="preserve">encuesta con una queja</w:t>
+            </w:r>
+            <w:r>
+              <w:t xml:space="preserve">.</w:t>
+            </w:r>
+          </w:p>
+        </w:tc>
+        <w:tc>
+          <w:tcPr>
+            <w:tcW w:type="dxa" w:w="5626"/>
+            <w:tcMar>
+              <w:top w:type="dxa" w:w="80"/>
+              <w:left w:type="dxa" w:w="120"/>
+              <w:bottom w:type="dxa" w:w="80"/>
+              <w:right w:type="dxa" w:w="120"/>
+            </w:tcMar>
+          </w:tcPr>
+          <w:p>
+            <w:r>
+              <w:t xml:space="preserve">Gia ya guardó su comentario para la administradora. Si el paciente pide hablar con alguien, atiéndalo como cualquier conversación.</w:t>
+            </w:r>
+          </w:p>
+        </w:tc>
+      </w:tr>
+      <w:tr>
+        <w:tc>
+          <w:tcPr>
+            <w:tcW w:type="dxa" w:w="3400"/>
+            <w:tcMar>
+              <w:top w:type="dxa" w:w="80"/>
+              <w:left w:type="dxa" w:w="120"/>
+              <w:bottom w:type="dxa" w:w="80"/>
+              <w:right w:type="dxa" w:w="120"/>
+            </w:tcMar>
+          </w:tcPr>
+          <w:p>
+            <w:r>
               <w:rPr>
                 <w:b/>
                 <w:bCs/>
@@ -5432,6 +5875,18 @@
     </w:lvl>
   </w:abstractNum>
   <w:abstractNum w:abstractNumId="7" w15:restartNumberingAfterBreak="0">
+    <w:multiLevelType w:val="hybridMultilevel"/>
+    <w:lvl w:ilvl="0" w15:tentative="1">
+      <w:start w:val="1"/>
+      <w:numFmt w:val="decimal"/>
+      <w:lvlText w:val="%1."/>
+      <w:lvlJc w:val="left"/>
+      <w:pPr>
+        <w:ind w:left="540" w:hanging="300"/>
+      </w:pPr>
+    </w:lvl>
+  </w:abstractNum>
+  <w:abstractNum w:abstractNumId="8" w15:restartNumberingAfterBreak="0">
     <w:multiLevelType w:val="hybridMultilevel"/>
     <w:lvl w:ilvl="0" w15:tentative="1">
       <w:start w:val="1"/>
@@ -5481,6 +5936,12 @@
   </w:num>
   <w:num w:numId="7">
     <w:abstractNumId w:val="7"/>
+    <w:lvlOverride w:ilvl="0">
+      <w:startOverride w:val="1"/>
+    </w:lvlOverride>
+  </w:num>
+  <w:num w:numId="8">
+    <w:abstractNumId w:val="8"/>
     <w:lvlOverride w:ilvl="0">
       <w:startOverride w:val="1"/>
     </w:lvlOverride>

</xml_diff>

<commit_message>
Web pública de ProSalud en la raíz; el panel pasa a /panel/
- site/: web generada con web-preview/generar.cjs --sitio (sin promociones por
  ahora; la lista PROMOS vacía oculta la sección). Pie con «Acceso del personal».
- Servidor: la raíz sirve la web (CSP con Google Fonts) y /panel/ el panel. Los
  archivos del panel siguen respondiendo en la raíz (sw.js, manifest, íconos) y
  los accesos antiguos /#/… redirigen a /panel/, para no romper avisos ni apps
  instaladas. Los avisos abren /panel/#/conversaciones.
- Manual de recepción: dirección del panel actualizada.

Co-Authored-By: Claude Opus 5.5 <noreply@anthropic.com>
Claude-Session: https://claude.ai/code/session_01M9J19rHEn3Sf8xzUA5SjEa
</commit_message>
<xml_diff>
--- a/mediconnect/docs/Manual_Recepcion_MediConnect.docx
+++ b/mediconnect/docs/Manual_Recepcion_MediConnect.docx
@@ -214,7 +214,7 @@
                 <w:b/>
                 <w:bCs/>
               </w:rPr>
-              <w:t xml:space="preserve">https://prosalud.mediconnectec.com</w:t>
+              <w:t xml:space="preserve">https://prosalud.mediconnectec.com/panel</w:t>
             </w:r>
             <w:r>
               <w:t xml:space="preserve"> (funciona en computadora y en celular).</w:t>
@@ -604,7 +604,7 @@
           <w:b/>
           <w:bCs/>
         </w:rPr>
-        <w:t xml:space="preserve">https://prosalud.mediconnectec.com</w:t>
+        <w:t xml:space="preserve">https://prosalud.mediconnectec.com/panel</w:t>
       </w:r>
       <w:r>
         <w:t xml:space="preserve"> en el navegador (Chrome recomendado).</w:t>

</xml_diff>